<commit_message>
Align security questionnaire with the manuscript
Add Tables 4 and 5 rows for the security questionnaire (and Hydra in
Table 4) to the manuscript revisions, name IP filtering and the
firewall in Form B item 3 to match Objective 3.6, and add one
researcher-made personal data item to each form for ISO/IEC 27001
A.5.34 and the Data Privacy Act. Items are renumbered (Form A 19,
Form B 20) across the guide, revisions and defense script.

Co-Authored-By: Claude Opus 5.5 <noreply@anthropic.com>
Claude-Session: https://claude.ai/code/session_01NeqS41gKi8124JjYBQKeXi
</commit_message>
<xml_diff>
--- a/docs/manuscript/LSIAMS_Form_A_Teachers_and_School_Administrator.docx
+++ b/docs/manuscript/LSIAMS_Form_A_Teachers_and_School_Administrator.docx
@@ -3556,333 +3556,6 @@
           </w:p>
         </w:tc>
       </w:tr>
-    </w:tbl>
-    <w:p>
-      <w:pPr>
-        <w:spacing w:after="120" w:before="0" w:line="276"/>
-      </w:pPr>
-      <w:r>
-        <w:rPr>
-          <w:rFonts w:ascii="Times New Roman" w:cs="Times New Roman" w:eastAsia="Times New Roman" w:hAnsi="Times New Roman"/>
-          <w:sz w:val="21"/>
-          <w:szCs w:val="21"/>
-        </w:rPr>
-        <w:t xml:space="preserve"/>
-      </w:r>
-    </w:p>
-    <w:tbl>
-      <w:tblPr>
-        <w:tblW w:type="dxa" w:w="10080"/>
-        <w:tblBorders>
-          <w:top w:val="single" w:color="auto" w:sz="4"/>
-          <w:left w:val="single" w:color="auto" w:sz="4"/>
-          <w:bottom w:val="single" w:color="auto" w:sz="4"/>
-          <w:right w:val="single" w:color="auto" w:sz="4"/>
-          <w:insideH w:val="single" w:color="auto" w:sz="4"/>
-          <w:insideV w:val="single" w:color="auto" w:sz="4"/>
-        </w:tblBorders>
-      </w:tblPr>
-      <w:tblGrid>
-        <w:gridCol w:w="600"/>
-        <w:gridCol w:w="6980"/>
-        <w:gridCol w:w="500"/>
-        <w:gridCol w:w="500"/>
-        <w:gridCol w:w="500"/>
-        <w:gridCol w:w="500"/>
-        <w:gridCol w:w="500"/>
-      </w:tblGrid>
-      <w:tr>
-        <w:trPr>
-          <w:cantSplit/>
-          <w:tblHeader/>
-        </w:trPr>
-        <w:tc>
-          <w:tcPr>
-            <w:tcW w:type="dxa" w:w="10080"/>
-            <w:gridSpan w:val="7"/>
-            <w:tcBorders>
-              <w:top w:val="single" w:color="595959" w:sz="6"/>
-              <w:left w:val="single" w:color="595959" w:sz="6"/>
-              <w:bottom w:val="single" w:color="595959" w:sz="6"/>
-              <w:right w:val="single" w:color="595959" w:sz="6"/>
-            </w:tcBorders>
-            <w:shd w:fill="D9D9D9" w:color="auto" w:val="clear"/>
-            <w:tcMar>
-              <w:top w:type="dxa" w:w="50"/>
-              <w:left w:type="dxa" w:w="90"/>
-              <w:bottom w:type="dxa" w:w="50"/>
-              <w:right w:type="dxa" w:w="90"/>
-            </w:tcMar>
-            <w:vAlign w:val="center"/>
-          </w:tcPr>
-          <w:p>
-            <w:pPr>
-              <w:spacing w:after="0" w:before="0" w:line="252"/>
-            </w:pPr>
-            <w:r>
-              <w:rPr>
-                <w:rFonts w:ascii="Times New Roman" w:cs="Times New Roman" w:eastAsia="Times New Roman" w:hAnsi="Times New Roman"/>
-                <w:b/>
-                <w:bCs/>
-                <w:sz w:val="20"/>
-                <w:szCs w:val="20"/>
-              </w:rPr>
-              <w:t xml:space="preserve">C. Integrity (keeping information correct)</w:t>
-            </w:r>
-          </w:p>
-        </w:tc>
-      </w:tr>
-      <w:tr>
-        <w:trPr>
-          <w:cantSplit/>
-          <w:tblHeader/>
-        </w:trPr>
-        <w:tc>
-          <w:tcPr>
-            <w:tcW w:type="dxa" w:w="600"/>
-            <w:tcBorders>
-              <w:top w:val="single" w:color="595959" w:sz="6"/>
-              <w:left w:val="single" w:color="595959" w:sz="6"/>
-              <w:bottom w:val="single" w:color="595959" w:sz="6"/>
-              <w:right w:val="single" w:color="595959" w:sz="6"/>
-            </w:tcBorders>
-            <w:shd w:fill="F2F2F2" w:color="auto" w:val="clear"/>
-            <w:tcMar>
-              <w:top w:type="dxa" w:w="50"/>
-              <w:left w:type="dxa" w:w="90"/>
-              <w:bottom w:type="dxa" w:w="50"/>
-              <w:right w:type="dxa" w:w="90"/>
-            </w:tcMar>
-            <w:vAlign w:val="center"/>
-          </w:tcPr>
-          <w:p>
-            <w:pPr>
-              <w:spacing w:after="0" w:before="0" w:line="252"/>
-              <w:jc w:val="center"/>
-            </w:pPr>
-            <w:r>
-              <w:rPr>
-                <w:rFonts w:ascii="Times New Roman" w:cs="Times New Roman" w:eastAsia="Times New Roman" w:hAnsi="Times New Roman"/>
-                <w:b/>
-                <w:bCs/>
-                <w:sz w:val="20"/>
-                <w:szCs w:val="20"/>
-              </w:rPr>
-              <w:t xml:space="preserve">No.</w:t>
-            </w:r>
-          </w:p>
-        </w:tc>
-        <w:tc>
-          <w:tcPr>
-            <w:tcW w:type="dxa" w:w="6980"/>
-            <w:tcBorders>
-              <w:top w:val="single" w:color="595959" w:sz="6"/>
-              <w:left w:val="single" w:color="595959" w:sz="6"/>
-              <w:bottom w:val="single" w:color="595959" w:sz="6"/>
-              <w:right w:val="single" w:color="595959" w:sz="6"/>
-            </w:tcBorders>
-            <w:shd w:fill="F2F2F2" w:color="auto" w:val="clear"/>
-            <w:tcMar>
-              <w:top w:type="dxa" w:w="50"/>
-              <w:left w:type="dxa" w:w="90"/>
-              <w:bottom w:type="dxa" w:w="50"/>
-              <w:right w:type="dxa" w:w="90"/>
-            </w:tcMar>
-            <w:vAlign w:val="center"/>
-          </w:tcPr>
-          <w:p>
-            <w:pPr>
-              <w:spacing w:after="0" w:before="0" w:line="252"/>
-              <w:jc w:val="left"/>
-            </w:pPr>
-            <w:r>
-              <w:rPr>
-                <w:rFonts w:ascii="Times New Roman" w:cs="Times New Roman" w:eastAsia="Times New Roman" w:hAnsi="Times New Roman"/>
-                <w:b/>
-                <w:bCs/>
-                <w:sz w:val="20"/>
-                <w:szCs w:val="20"/>
-              </w:rPr>
-              <w:t xml:space="preserve">Indicator</w:t>
-            </w:r>
-          </w:p>
-        </w:tc>
-        <w:tc>
-          <w:tcPr>
-            <w:tcW w:type="dxa" w:w="500"/>
-            <w:tcBorders>
-              <w:top w:val="single" w:color="595959" w:sz="6"/>
-              <w:left w:val="single" w:color="595959" w:sz="6"/>
-              <w:bottom w:val="single" w:color="595959" w:sz="6"/>
-              <w:right w:val="single" w:color="595959" w:sz="6"/>
-            </w:tcBorders>
-            <w:shd w:fill="F2F2F2" w:color="auto" w:val="clear"/>
-            <w:tcMar>
-              <w:top w:type="dxa" w:w="50"/>
-              <w:left w:type="dxa" w:w="90"/>
-              <w:bottom w:type="dxa" w:w="50"/>
-              <w:right w:type="dxa" w:w="90"/>
-            </w:tcMar>
-            <w:vAlign w:val="center"/>
-          </w:tcPr>
-          <w:p>
-            <w:pPr>
-              <w:spacing w:after="0" w:before="0" w:line="252"/>
-              <w:jc w:val="center"/>
-            </w:pPr>
-            <w:r>
-              <w:rPr>
-                <w:rFonts w:ascii="Times New Roman" w:cs="Times New Roman" w:eastAsia="Times New Roman" w:hAnsi="Times New Roman"/>
-                <w:b/>
-                <w:bCs/>
-                <w:sz w:val="20"/>
-                <w:szCs w:val="20"/>
-              </w:rPr>
-              <w:t xml:space="preserve">5</w:t>
-            </w:r>
-          </w:p>
-        </w:tc>
-        <w:tc>
-          <w:tcPr>
-            <w:tcW w:type="dxa" w:w="500"/>
-            <w:tcBorders>
-              <w:top w:val="single" w:color="595959" w:sz="6"/>
-              <w:left w:val="single" w:color="595959" w:sz="6"/>
-              <w:bottom w:val="single" w:color="595959" w:sz="6"/>
-              <w:right w:val="single" w:color="595959" w:sz="6"/>
-            </w:tcBorders>
-            <w:shd w:fill="F2F2F2" w:color="auto" w:val="clear"/>
-            <w:tcMar>
-              <w:top w:type="dxa" w:w="50"/>
-              <w:left w:type="dxa" w:w="90"/>
-              <w:bottom w:type="dxa" w:w="50"/>
-              <w:right w:type="dxa" w:w="90"/>
-            </w:tcMar>
-            <w:vAlign w:val="center"/>
-          </w:tcPr>
-          <w:p>
-            <w:pPr>
-              <w:spacing w:after="0" w:before="0" w:line="252"/>
-              <w:jc w:val="center"/>
-            </w:pPr>
-            <w:r>
-              <w:rPr>
-                <w:rFonts w:ascii="Times New Roman" w:cs="Times New Roman" w:eastAsia="Times New Roman" w:hAnsi="Times New Roman"/>
-                <w:b/>
-                <w:bCs/>
-                <w:sz w:val="20"/>
-                <w:szCs w:val="20"/>
-              </w:rPr>
-              <w:t xml:space="preserve">4</w:t>
-            </w:r>
-          </w:p>
-        </w:tc>
-        <w:tc>
-          <w:tcPr>
-            <w:tcW w:type="dxa" w:w="500"/>
-            <w:tcBorders>
-              <w:top w:val="single" w:color="595959" w:sz="6"/>
-              <w:left w:val="single" w:color="595959" w:sz="6"/>
-              <w:bottom w:val="single" w:color="595959" w:sz="6"/>
-              <w:right w:val="single" w:color="595959" w:sz="6"/>
-            </w:tcBorders>
-            <w:shd w:fill="F2F2F2" w:color="auto" w:val="clear"/>
-            <w:tcMar>
-              <w:top w:type="dxa" w:w="50"/>
-              <w:left w:type="dxa" w:w="90"/>
-              <w:bottom w:type="dxa" w:w="50"/>
-              <w:right w:type="dxa" w:w="90"/>
-            </w:tcMar>
-            <w:vAlign w:val="center"/>
-          </w:tcPr>
-          <w:p>
-            <w:pPr>
-              <w:spacing w:after="0" w:before="0" w:line="252"/>
-              <w:jc w:val="center"/>
-            </w:pPr>
-            <w:r>
-              <w:rPr>
-                <w:rFonts w:ascii="Times New Roman" w:cs="Times New Roman" w:eastAsia="Times New Roman" w:hAnsi="Times New Roman"/>
-                <w:b/>
-                <w:bCs/>
-                <w:sz w:val="20"/>
-                <w:szCs w:val="20"/>
-              </w:rPr>
-              <w:t xml:space="preserve">3</w:t>
-            </w:r>
-          </w:p>
-        </w:tc>
-        <w:tc>
-          <w:tcPr>
-            <w:tcW w:type="dxa" w:w="500"/>
-            <w:tcBorders>
-              <w:top w:val="single" w:color="595959" w:sz="6"/>
-              <w:left w:val="single" w:color="595959" w:sz="6"/>
-              <w:bottom w:val="single" w:color="595959" w:sz="6"/>
-              <w:right w:val="single" w:color="595959" w:sz="6"/>
-            </w:tcBorders>
-            <w:shd w:fill="F2F2F2" w:color="auto" w:val="clear"/>
-            <w:tcMar>
-              <w:top w:type="dxa" w:w="50"/>
-              <w:left w:type="dxa" w:w="90"/>
-              <w:bottom w:type="dxa" w:w="50"/>
-              <w:right w:type="dxa" w:w="90"/>
-            </w:tcMar>
-            <w:vAlign w:val="center"/>
-          </w:tcPr>
-          <w:p>
-            <w:pPr>
-              <w:spacing w:after="0" w:before="0" w:line="252"/>
-              <w:jc w:val="center"/>
-            </w:pPr>
-            <w:r>
-              <w:rPr>
-                <w:rFonts w:ascii="Times New Roman" w:cs="Times New Roman" w:eastAsia="Times New Roman" w:hAnsi="Times New Roman"/>
-                <w:b/>
-                <w:bCs/>
-                <w:sz w:val="20"/>
-                <w:szCs w:val="20"/>
-              </w:rPr>
-              <w:t xml:space="preserve">2</w:t>
-            </w:r>
-          </w:p>
-        </w:tc>
-        <w:tc>
-          <w:tcPr>
-            <w:tcW w:type="dxa" w:w="500"/>
-            <w:tcBorders>
-              <w:top w:val="single" w:color="595959" w:sz="6"/>
-              <w:left w:val="single" w:color="595959" w:sz="6"/>
-              <w:bottom w:val="single" w:color="595959" w:sz="6"/>
-              <w:right w:val="single" w:color="595959" w:sz="6"/>
-            </w:tcBorders>
-            <w:shd w:fill="F2F2F2" w:color="auto" w:val="clear"/>
-            <w:tcMar>
-              <w:top w:type="dxa" w:w="50"/>
-              <w:left w:type="dxa" w:w="90"/>
-              <w:bottom w:type="dxa" w:w="50"/>
-              <w:right w:type="dxa" w:w="90"/>
-            </w:tcMar>
-            <w:vAlign w:val="center"/>
-          </w:tcPr>
-          <w:p>
-            <w:pPr>
-              <w:spacing w:after="0" w:before="0" w:line="252"/>
-              <w:jc w:val="center"/>
-            </w:pPr>
-            <w:r>
-              <w:rPr>
-                <w:rFonts w:ascii="Times New Roman" w:cs="Times New Roman" w:eastAsia="Times New Roman" w:hAnsi="Times New Roman"/>
-                <w:b/>
-                <w:bCs/>
-                <w:sz w:val="20"/>
-                <w:szCs w:val="20"/>
-              </w:rPr>
-              <w:t xml:space="preserve">1</w:t>
-            </w:r>
-          </w:p>
-        </w:tc>
-      </w:tr>
       <w:tr>
         <w:trPr>
           <w:cantSplit/>
@@ -3947,903 +3620,7 @@
                 <w:sz w:val="20"/>
                 <w:szCs w:val="20"/>
               </w:rPr>
-              <w:t xml:space="preserve">The attendance reports from the system are correct.</w:t>
-            </w:r>
-          </w:p>
-        </w:tc>
-        <w:tc>
-          <w:tcPr>
-            <w:tcW w:type="dxa" w:w="500"/>
-            <w:tcBorders>
-              <w:top w:val="single" w:color="595959" w:sz="6"/>
-              <w:left w:val="single" w:color="595959" w:sz="6"/>
-              <w:bottom w:val="single" w:color="595959" w:sz="6"/>
-              <w:right w:val="single" w:color="595959" w:sz="6"/>
-            </w:tcBorders>
-            <w:tcMar>
-              <w:top w:type="dxa" w:w="50"/>
-              <w:left w:type="dxa" w:w="90"/>
-              <w:bottom w:type="dxa" w:w="50"/>
-              <w:right w:type="dxa" w:w="90"/>
-            </w:tcMar>
-            <w:vAlign w:val="center"/>
-          </w:tcPr>
-          <w:p>
-            <w:pPr>
-              <w:spacing w:after="0" w:before="0" w:line="252"/>
-            </w:pPr>
-            <w:r>
-              <w:rPr>
-                <w:rFonts w:ascii="Times New Roman" w:cs="Times New Roman" w:eastAsia="Times New Roman" w:hAnsi="Times New Roman"/>
-                <w:sz w:val="20"/>
-                <w:szCs w:val="20"/>
-              </w:rPr>
-              <w:t xml:space="preserve"/>
-            </w:r>
-          </w:p>
-        </w:tc>
-        <w:tc>
-          <w:tcPr>
-            <w:tcW w:type="dxa" w:w="500"/>
-            <w:tcBorders>
-              <w:top w:val="single" w:color="595959" w:sz="6"/>
-              <w:left w:val="single" w:color="595959" w:sz="6"/>
-              <w:bottom w:val="single" w:color="595959" w:sz="6"/>
-              <w:right w:val="single" w:color="595959" w:sz="6"/>
-            </w:tcBorders>
-            <w:tcMar>
-              <w:top w:type="dxa" w:w="50"/>
-              <w:left w:type="dxa" w:w="90"/>
-              <w:bottom w:type="dxa" w:w="50"/>
-              <w:right w:type="dxa" w:w="90"/>
-            </w:tcMar>
-            <w:vAlign w:val="center"/>
-          </w:tcPr>
-          <w:p>
-            <w:pPr>
-              <w:spacing w:after="0" w:before="0" w:line="252"/>
-            </w:pPr>
-            <w:r>
-              <w:rPr>
-                <w:rFonts w:ascii="Times New Roman" w:cs="Times New Roman" w:eastAsia="Times New Roman" w:hAnsi="Times New Roman"/>
-                <w:sz w:val="20"/>
-                <w:szCs w:val="20"/>
-              </w:rPr>
-              <w:t xml:space="preserve"/>
-            </w:r>
-          </w:p>
-        </w:tc>
-        <w:tc>
-          <w:tcPr>
-            <w:tcW w:type="dxa" w:w="500"/>
-            <w:tcBorders>
-              <w:top w:val="single" w:color="595959" w:sz="6"/>
-              <w:left w:val="single" w:color="595959" w:sz="6"/>
-              <w:bottom w:val="single" w:color="595959" w:sz="6"/>
-              <w:right w:val="single" w:color="595959" w:sz="6"/>
-            </w:tcBorders>
-            <w:tcMar>
-              <w:top w:type="dxa" w:w="50"/>
-              <w:left w:type="dxa" w:w="90"/>
-              <w:bottom w:type="dxa" w:w="50"/>
-              <w:right w:type="dxa" w:w="90"/>
-            </w:tcMar>
-            <w:vAlign w:val="center"/>
-          </w:tcPr>
-          <w:p>
-            <w:pPr>
-              <w:spacing w:after="0" w:before="0" w:line="252"/>
-            </w:pPr>
-            <w:r>
-              <w:rPr>
-                <w:rFonts w:ascii="Times New Roman" w:cs="Times New Roman" w:eastAsia="Times New Roman" w:hAnsi="Times New Roman"/>
-                <w:sz w:val="20"/>
-                <w:szCs w:val="20"/>
-              </w:rPr>
-              <w:t xml:space="preserve"/>
-            </w:r>
-          </w:p>
-        </w:tc>
-        <w:tc>
-          <w:tcPr>
-            <w:tcW w:type="dxa" w:w="500"/>
-            <w:tcBorders>
-              <w:top w:val="single" w:color="595959" w:sz="6"/>
-              <w:left w:val="single" w:color="595959" w:sz="6"/>
-              <w:bottom w:val="single" w:color="595959" w:sz="6"/>
-              <w:right w:val="single" w:color="595959" w:sz="6"/>
-            </w:tcBorders>
-            <w:tcMar>
-              <w:top w:type="dxa" w:w="50"/>
-              <w:left w:type="dxa" w:w="90"/>
-              <w:bottom w:type="dxa" w:w="50"/>
-              <w:right w:type="dxa" w:w="90"/>
-            </w:tcMar>
-            <w:vAlign w:val="center"/>
-          </w:tcPr>
-          <w:p>
-            <w:pPr>
-              <w:spacing w:after="0" w:before="0" w:line="252"/>
-            </w:pPr>
-            <w:r>
-              <w:rPr>
-                <w:rFonts w:ascii="Times New Roman" w:cs="Times New Roman" w:eastAsia="Times New Roman" w:hAnsi="Times New Roman"/>
-                <w:sz w:val="20"/>
-                <w:szCs w:val="20"/>
-              </w:rPr>
-              <w:t xml:space="preserve"/>
-            </w:r>
-          </w:p>
-        </w:tc>
-        <w:tc>
-          <w:tcPr>
-            <w:tcW w:type="dxa" w:w="500"/>
-            <w:tcBorders>
-              <w:top w:val="single" w:color="595959" w:sz="6"/>
-              <w:left w:val="single" w:color="595959" w:sz="6"/>
-              <w:bottom w:val="single" w:color="595959" w:sz="6"/>
-              <w:right w:val="single" w:color="595959" w:sz="6"/>
-            </w:tcBorders>
-            <w:tcMar>
-              <w:top w:type="dxa" w:w="50"/>
-              <w:left w:type="dxa" w:w="90"/>
-              <w:bottom w:type="dxa" w:w="50"/>
-              <w:right w:type="dxa" w:w="90"/>
-            </w:tcMar>
-            <w:vAlign w:val="center"/>
-          </w:tcPr>
-          <w:p>
-            <w:pPr>
-              <w:spacing w:after="0" w:before="0" w:line="252"/>
-            </w:pPr>
-            <w:r>
-              <w:rPr>
-                <w:rFonts w:ascii="Times New Roman" w:cs="Times New Roman" w:eastAsia="Times New Roman" w:hAnsi="Times New Roman"/>
-                <w:sz w:val="20"/>
-                <w:szCs w:val="20"/>
-              </w:rPr>
-              <w:t xml:space="preserve"/>
-            </w:r>
-          </w:p>
-        </w:tc>
-      </w:tr>
-      <w:tr>
-        <w:trPr>
-          <w:cantSplit/>
-          <w:trHeight w:val="420" w:hRule="atLeast"/>
-        </w:trPr>
-        <w:tc>
-          <w:tcPr>
-            <w:tcW w:type="dxa" w:w="600"/>
-            <w:tcBorders>
-              <w:top w:val="single" w:color="595959" w:sz="6"/>
-              <w:left w:val="single" w:color="595959" w:sz="6"/>
-              <w:bottom w:val="single" w:color="595959" w:sz="6"/>
-              <w:right w:val="single" w:color="595959" w:sz="6"/>
-            </w:tcBorders>
-            <w:tcMar>
-              <w:top w:type="dxa" w:w="50"/>
-              <w:left w:type="dxa" w:w="90"/>
-              <w:bottom w:type="dxa" w:w="50"/>
-              <w:right w:type="dxa" w:w="90"/>
-            </w:tcMar>
-            <w:vAlign w:val="center"/>
-          </w:tcPr>
-          <w:p>
-            <w:pPr>
-              <w:spacing w:after="0" w:before="0" w:line="252"/>
-              <w:jc w:val="center"/>
-            </w:pPr>
-            <w:r>
-              <w:rPr>
-                <w:rFonts w:ascii="Times New Roman" w:cs="Times New Roman" w:eastAsia="Times New Roman" w:hAnsi="Times New Roman"/>
-                <w:sz w:val="20"/>
-                <w:szCs w:val="20"/>
-              </w:rPr>
-              <w:t xml:space="preserve">12</w:t>
-            </w:r>
-          </w:p>
-        </w:tc>
-        <w:tc>
-          <w:tcPr>
-            <w:tcW w:type="dxa" w:w="6980"/>
-            <w:tcBorders>
-              <w:top w:val="single" w:color="595959" w:sz="6"/>
-              <w:left w:val="single" w:color="595959" w:sz="6"/>
-              <w:bottom w:val="single" w:color="595959" w:sz="6"/>
-              <w:right w:val="single" w:color="595959" w:sz="6"/>
-            </w:tcBorders>
-            <w:tcMar>
-              <w:top w:type="dxa" w:w="50"/>
-              <w:left w:type="dxa" w:w="90"/>
-              <w:bottom w:type="dxa" w:w="50"/>
-              <w:right w:type="dxa" w:w="90"/>
-            </w:tcMar>
-            <w:vAlign w:val="center"/>
-          </w:tcPr>
-          <w:p>
-            <w:pPr>
-              <w:spacing w:after="0" w:before="0" w:line="252"/>
-            </w:pPr>
-            <w:r>
-              <w:rPr>
-                <w:rFonts w:ascii="Times New Roman" w:cs="Times New Roman" w:eastAsia="Times New Roman" w:hAnsi="Times New Roman"/>
-                <w:sz w:val="20"/>
-                <w:szCs w:val="20"/>
-              </w:rPr>
-              <w:t xml:space="preserve">The system accepts attendance only from registered classroom terminals.</w:t>
-            </w:r>
-          </w:p>
-        </w:tc>
-        <w:tc>
-          <w:tcPr>
-            <w:tcW w:type="dxa" w:w="500"/>
-            <w:tcBorders>
-              <w:top w:val="single" w:color="595959" w:sz="6"/>
-              <w:left w:val="single" w:color="595959" w:sz="6"/>
-              <w:bottom w:val="single" w:color="595959" w:sz="6"/>
-              <w:right w:val="single" w:color="595959" w:sz="6"/>
-            </w:tcBorders>
-            <w:tcMar>
-              <w:top w:type="dxa" w:w="50"/>
-              <w:left w:type="dxa" w:w="90"/>
-              <w:bottom w:type="dxa" w:w="50"/>
-              <w:right w:type="dxa" w:w="90"/>
-            </w:tcMar>
-            <w:vAlign w:val="center"/>
-          </w:tcPr>
-          <w:p>
-            <w:pPr>
-              <w:spacing w:after="0" w:before="0" w:line="252"/>
-            </w:pPr>
-            <w:r>
-              <w:rPr>
-                <w:rFonts w:ascii="Times New Roman" w:cs="Times New Roman" w:eastAsia="Times New Roman" w:hAnsi="Times New Roman"/>
-                <w:sz w:val="20"/>
-                <w:szCs w:val="20"/>
-              </w:rPr>
-              <w:t xml:space="preserve"/>
-            </w:r>
-          </w:p>
-        </w:tc>
-        <w:tc>
-          <w:tcPr>
-            <w:tcW w:type="dxa" w:w="500"/>
-            <w:tcBorders>
-              <w:top w:val="single" w:color="595959" w:sz="6"/>
-              <w:left w:val="single" w:color="595959" w:sz="6"/>
-              <w:bottom w:val="single" w:color="595959" w:sz="6"/>
-              <w:right w:val="single" w:color="595959" w:sz="6"/>
-            </w:tcBorders>
-            <w:tcMar>
-              <w:top w:type="dxa" w:w="50"/>
-              <w:left w:type="dxa" w:w="90"/>
-              <w:bottom w:type="dxa" w:w="50"/>
-              <w:right w:type="dxa" w:w="90"/>
-            </w:tcMar>
-            <w:vAlign w:val="center"/>
-          </w:tcPr>
-          <w:p>
-            <w:pPr>
-              <w:spacing w:after="0" w:before="0" w:line="252"/>
-            </w:pPr>
-            <w:r>
-              <w:rPr>
-                <w:rFonts w:ascii="Times New Roman" w:cs="Times New Roman" w:eastAsia="Times New Roman" w:hAnsi="Times New Roman"/>
-                <w:sz w:val="20"/>
-                <w:szCs w:val="20"/>
-              </w:rPr>
-              <w:t xml:space="preserve"/>
-            </w:r>
-          </w:p>
-        </w:tc>
-        <w:tc>
-          <w:tcPr>
-            <w:tcW w:type="dxa" w:w="500"/>
-            <w:tcBorders>
-              <w:top w:val="single" w:color="595959" w:sz="6"/>
-              <w:left w:val="single" w:color="595959" w:sz="6"/>
-              <w:bottom w:val="single" w:color="595959" w:sz="6"/>
-              <w:right w:val="single" w:color="595959" w:sz="6"/>
-            </w:tcBorders>
-            <w:tcMar>
-              <w:top w:type="dxa" w:w="50"/>
-              <w:left w:type="dxa" w:w="90"/>
-              <w:bottom w:type="dxa" w:w="50"/>
-              <w:right w:type="dxa" w:w="90"/>
-            </w:tcMar>
-            <w:vAlign w:val="center"/>
-          </w:tcPr>
-          <w:p>
-            <w:pPr>
-              <w:spacing w:after="0" w:before="0" w:line="252"/>
-            </w:pPr>
-            <w:r>
-              <w:rPr>
-                <w:rFonts w:ascii="Times New Roman" w:cs="Times New Roman" w:eastAsia="Times New Roman" w:hAnsi="Times New Roman"/>
-                <w:sz w:val="20"/>
-                <w:szCs w:val="20"/>
-              </w:rPr>
-              <w:t xml:space="preserve"/>
-            </w:r>
-          </w:p>
-        </w:tc>
-        <w:tc>
-          <w:tcPr>
-            <w:tcW w:type="dxa" w:w="500"/>
-            <w:tcBorders>
-              <w:top w:val="single" w:color="595959" w:sz="6"/>
-              <w:left w:val="single" w:color="595959" w:sz="6"/>
-              <w:bottom w:val="single" w:color="595959" w:sz="6"/>
-              <w:right w:val="single" w:color="595959" w:sz="6"/>
-            </w:tcBorders>
-            <w:tcMar>
-              <w:top w:type="dxa" w:w="50"/>
-              <w:left w:type="dxa" w:w="90"/>
-              <w:bottom w:type="dxa" w:w="50"/>
-              <w:right w:type="dxa" w:w="90"/>
-            </w:tcMar>
-            <w:vAlign w:val="center"/>
-          </w:tcPr>
-          <w:p>
-            <w:pPr>
-              <w:spacing w:after="0" w:before="0" w:line="252"/>
-            </w:pPr>
-            <w:r>
-              <w:rPr>
-                <w:rFonts w:ascii="Times New Roman" w:cs="Times New Roman" w:eastAsia="Times New Roman" w:hAnsi="Times New Roman"/>
-                <w:sz w:val="20"/>
-                <w:szCs w:val="20"/>
-              </w:rPr>
-              <w:t xml:space="preserve"/>
-            </w:r>
-          </w:p>
-        </w:tc>
-        <w:tc>
-          <w:tcPr>
-            <w:tcW w:type="dxa" w:w="500"/>
-            <w:tcBorders>
-              <w:top w:val="single" w:color="595959" w:sz="6"/>
-              <w:left w:val="single" w:color="595959" w:sz="6"/>
-              <w:bottom w:val="single" w:color="595959" w:sz="6"/>
-              <w:right w:val="single" w:color="595959" w:sz="6"/>
-            </w:tcBorders>
-            <w:tcMar>
-              <w:top w:type="dxa" w:w="50"/>
-              <w:left w:type="dxa" w:w="90"/>
-              <w:bottom w:type="dxa" w:w="50"/>
-              <w:right w:type="dxa" w:w="90"/>
-            </w:tcMar>
-            <w:vAlign w:val="center"/>
-          </w:tcPr>
-          <w:p>
-            <w:pPr>
-              <w:spacing w:after="0" w:before="0" w:line="252"/>
-            </w:pPr>
-            <w:r>
-              <w:rPr>
-                <w:rFonts w:ascii="Times New Roman" w:cs="Times New Roman" w:eastAsia="Times New Roman" w:hAnsi="Times New Roman"/>
-                <w:sz w:val="20"/>
-                <w:szCs w:val="20"/>
-              </w:rPr>
-              <w:t xml:space="preserve"/>
-            </w:r>
-          </w:p>
-        </w:tc>
-      </w:tr>
-      <w:tr>
-        <w:trPr>
-          <w:cantSplit/>
-          <w:trHeight w:val="420" w:hRule="atLeast"/>
-        </w:trPr>
-        <w:tc>
-          <w:tcPr>
-            <w:tcW w:type="dxa" w:w="600"/>
-            <w:tcBorders>
-              <w:top w:val="single" w:color="595959" w:sz="6"/>
-              <w:left w:val="single" w:color="595959" w:sz="6"/>
-              <w:bottom w:val="single" w:color="595959" w:sz="6"/>
-              <w:right w:val="single" w:color="595959" w:sz="6"/>
-            </w:tcBorders>
-            <w:tcMar>
-              <w:top w:type="dxa" w:w="50"/>
-              <w:left w:type="dxa" w:w="90"/>
-              <w:bottom w:type="dxa" w:w="50"/>
-              <w:right w:type="dxa" w:w="90"/>
-            </w:tcMar>
-            <w:vAlign w:val="center"/>
-          </w:tcPr>
-          <w:p>
-            <w:pPr>
-              <w:spacing w:after="0" w:before="0" w:line="252"/>
-              <w:jc w:val="center"/>
-            </w:pPr>
-            <w:r>
-              <w:rPr>
-                <w:rFonts w:ascii="Times New Roman" w:cs="Times New Roman" w:eastAsia="Times New Roman" w:hAnsi="Times New Roman"/>
-                <w:sz w:val="20"/>
-                <w:szCs w:val="20"/>
-              </w:rPr>
-              <w:t xml:space="preserve">13</w:t>
-            </w:r>
-          </w:p>
-        </w:tc>
-        <w:tc>
-          <w:tcPr>
-            <w:tcW w:type="dxa" w:w="6980"/>
-            <w:tcBorders>
-              <w:top w:val="single" w:color="595959" w:sz="6"/>
-              <w:left w:val="single" w:color="595959" w:sz="6"/>
-              <w:bottom w:val="single" w:color="595959" w:sz="6"/>
-              <w:right w:val="single" w:color="595959" w:sz="6"/>
-            </w:tcBorders>
-            <w:tcMar>
-              <w:top w:type="dxa" w:w="50"/>
-              <w:left w:type="dxa" w:w="90"/>
-              <w:bottom w:type="dxa" w:w="50"/>
-              <w:right w:type="dxa" w:w="90"/>
-            </w:tcMar>
-            <w:vAlign w:val="center"/>
-          </w:tcPr>
-          <w:p>
-            <w:pPr>
-              <w:spacing w:after="0" w:before="0" w:line="252"/>
-            </w:pPr>
-            <w:r>
-              <w:rPr>
-                <w:rFonts w:ascii="Times New Roman" w:cs="Times New Roman" w:eastAsia="Times New Roman" w:hAnsi="Times New Roman"/>
-                <w:sz w:val="20"/>
-                <w:szCs w:val="20"/>
-              </w:rPr>
-              <w:t xml:space="preserve">Only authorized administrators can change the system settings.</w:t>
-            </w:r>
-          </w:p>
-        </w:tc>
-        <w:tc>
-          <w:tcPr>
-            <w:tcW w:type="dxa" w:w="500"/>
-            <w:tcBorders>
-              <w:top w:val="single" w:color="595959" w:sz="6"/>
-              <w:left w:val="single" w:color="595959" w:sz="6"/>
-              <w:bottom w:val="single" w:color="595959" w:sz="6"/>
-              <w:right w:val="single" w:color="595959" w:sz="6"/>
-            </w:tcBorders>
-            <w:tcMar>
-              <w:top w:type="dxa" w:w="50"/>
-              <w:left w:type="dxa" w:w="90"/>
-              <w:bottom w:type="dxa" w:w="50"/>
-              <w:right w:type="dxa" w:w="90"/>
-            </w:tcMar>
-            <w:vAlign w:val="center"/>
-          </w:tcPr>
-          <w:p>
-            <w:pPr>
-              <w:spacing w:after="0" w:before="0" w:line="252"/>
-            </w:pPr>
-            <w:r>
-              <w:rPr>
-                <w:rFonts w:ascii="Times New Roman" w:cs="Times New Roman" w:eastAsia="Times New Roman" w:hAnsi="Times New Roman"/>
-                <w:sz w:val="20"/>
-                <w:szCs w:val="20"/>
-              </w:rPr>
-              <w:t xml:space="preserve"/>
-            </w:r>
-          </w:p>
-        </w:tc>
-        <w:tc>
-          <w:tcPr>
-            <w:tcW w:type="dxa" w:w="500"/>
-            <w:tcBorders>
-              <w:top w:val="single" w:color="595959" w:sz="6"/>
-              <w:left w:val="single" w:color="595959" w:sz="6"/>
-              <w:bottom w:val="single" w:color="595959" w:sz="6"/>
-              <w:right w:val="single" w:color="595959" w:sz="6"/>
-            </w:tcBorders>
-            <w:tcMar>
-              <w:top w:type="dxa" w:w="50"/>
-              <w:left w:type="dxa" w:w="90"/>
-              <w:bottom w:type="dxa" w:w="50"/>
-              <w:right w:type="dxa" w:w="90"/>
-            </w:tcMar>
-            <w:vAlign w:val="center"/>
-          </w:tcPr>
-          <w:p>
-            <w:pPr>
-              <w:spacing w:after="0" w:before="0" w:line="252"/>
-            </w:pPr>
-            <w:r>
-              <w:rPr>
-                <w:rFonts w:ascii="Times New Roman" w:cs="Times New Roman" w:eastAsia="Times New Roman" w:hAnsi="Times New Roman"/>
-                <w:sz w:val="20"/>
-                <w:szCs w:val="20"/>
-              </w:rPr>
-              <w:t xml:space="preserve"/>
-            </w:r>
-          </w:p>
-        </w:tc>
-        <w:tc>
-          <w:tcPr>
-            <w:tcW w:type="dxa" w:w="500"/>
-            <w:tcBorders>
-              <w:top w:val="single" w:color="595959" w:sz="6"/>
-              <w:left w:val="single" w:color="595959" w:sz="6"/>
-              <w:bottom w:val="single" w:color="595959" w:sz="6"/>
-              <w:right w:val="single" w:color="595959" w:sz="6"/>
-            </w:tcBorders>
-            <w:tcMar>
-              <w:top w:type="dxa" w:w="50"/>
-              <w:left w:type="dxa" w:w="90"/>
-              <w:bottom w:type="dxa" w:w="50"/>
-              <w:right w:type="dxa" w:w="90"/>
-            </w:tcMar>
-            <w:vAlign w:val="center"/>
-          </w:tcPr>
-          <w:p>
-            <w:pPr>
-              <w:spacing w:after="0" w:before="0" w:line="252"/>
-            </w:pPr>
-            <w:r>
-              <w:rPr>
-                <w:rFonts w:ascii="Times New Roman" w:cs="Times New Roman" w:eastAsia="Times New Roman" w:hAnsi="Times New Roman"/>
-                <w:sz w:val="20"/>
-                <w:szCs w:val="20"/>
-              </w:rPr>
-              <w:t xml:space="preserve"/>
-            </w:r>
-          </w:p>
-        </w:tc>
-        <w:tc>
-          <w:tcPr>
-            <w:tcW w:type="dxa" w:w="500"/>
-            <w:tcBorders>
-              <w:top w:val="single" w:color="595959" w:sz="6"/>
-              <w:left w:val="single" w:color="595959" w:sz="6"/>
-              <w:bottom w:val="single" w:color="595959" w:sz="6"/>
-              <w:right w:val="single" w:color="595959" w:sz="6"/>
-            </w:tcBorders>
-            <w:tcMar>
-              <w:top w:type="dxa" w:w="50"/>
-              <w:left w:type="dxa" w:w="90"/>
-              <w:bottom w:type="dxa" w:w="50"/>
-              <w:right w:type="dxa" w:w="90"/>
-            </w:tcMar>
-            <w:vAlign w:val="center"/>
-          </w:tcPr>
-          <w:p>
-            <w:pPr>
-              <w:spacing w:after="0" w:before="0" w:line="252"/>
-            </w:pPr>
-            <w:r>
-              <w:rPr>
-                <w:rFonts w:ascii="Times New Roman" w:cs="Times New Roman" w:eastAsia="Times New Roman" w:hAnsi="Times New Roman"/>
-                <w:sz w:val="20"/>
-                <w:szCs w:val="20"/>
-              </w:rPr>
-              <w:t xml:space="preserve"/>
-            </w:r>
-          </w:p>
-        </w:tc>
-        <w:tc>
-          <w:tcPr>
-            <w:tcW w:type="dxa" w:w="500"/>
-            <w:tcBorders>
-              <w:top w:val="single" w:color="595959" w:sz="6"/>
-              <w:left w:val="single" w:color="595959" w:sz="6"/>
-              <w:bottom w:val="single" w:color="595959" w:sz="6"/>
-              <w:right w:val="single" w:color="595959" w:sz="6"/>
-            </w:tcBorders>
-            <w:tcMar>
-              <w:top w:type="dxa" w:w="50"/>
-              <w:left w:type="dxa" w:w="90"/>
-              <w:bottom w:type="dxa" w:w="50"/>
-              <w:right w:type="dxa" w:w="90"/>
-            </w:tcMar>
-            <w:vAlign w:val="center"/>
-          </w:tcPr>
-          <w:p>
-            <w:pPr>
-              <w:spacing w:after="0" w:before="0" w:line="252"/>
-            </w:pPr>
-            <w:r>
-              <w:rPr>
-                <w:rFonts w:ascii="Times New Roman" w:cs="Times New Roman" w:eastAsia="Times New Roman" w:hAnsi="Times New Roman"/>
-                <w:sz w:val="20"/>
-                <w:szCs w:val="20"/>
-              </w:rPr>
-              <w:t xml:space="preserve"/>
-            </w:r>
-          </w:p>
-        </w:tc>
-      </w:tr>
-      <w:tr>
-        <w:trPr>
-          <w:cantSplit/>
-          <w:trHeight w:val="420" w:hRule="atLeast"/>
-        </w:trPr>
-        <w:tc>
-          <w:tcPr>
-            <w:tcW w:type="dxa" w:w="600"/>
-            <w:tcBorders>
-              <w:top w:val="single" w:color="595959" w:sz="6"/>
-              <w:left w:val="single" w:color="595959" w:sz="6"/>
-              <w:bottom w:val="single" w:color="595959" w:sz="6"/>
-              <w:right w:val="single" w:color="595959" w:sz="6"/>
-            </w:tcBorders>
-            <w:tcMar>
-              <w:top w:type="dxa" w:w="50"/>
-              <w:left w:type="dxa" w:w="90"/>
-              <w:bottom w:type="dxa" w:w="50"/>
-              <w:right w:type="dxa" w:w="90"/>
-            </w:tcMar>
-            <w:vAlign w:val="center"/>
-          </w:tcPr>
-          <w:p>
-            <w:pPr>
-              <w:spacing w:after="0" w:before="0" w:line="252"/>
-              <w:jc w:val="center"/>
-            </w:pPr>
-            <w:r>
-              <w:rPr>
-                <w:rFonts w:ascii="Times New Roman" w:cs="Times New Roman" w:eastAsia="Times New Roman" w:hAnsi="Times New Roman"/>
-                <w:sz w:val="20"/>
-                <w:szCs w:val="20"/>
-              </w:rPr>
-              <w:t xml:space="preserve">14</w:t>
-            </w:r>
-          </w:p>
-        </w:tc>
-        <w:tc>
-          <w:tcPr>
-            <w:tcW w:type="dxa" w:w="6980"/>
-            <w:tcBorders>
-              <w:top w:val="single" w:color="595959" w:sz="6"/>
-              <w:left w:val="single" w:color="595959" w:sz="6"/>
-              <w:bottom w:val="single" w:color="595959" w:sz="6"/>
-              <w:right w:val="single" w:color="595959" w:sz="6"/>
-            </w:tcBorders>
-            <w:tcMar>
-              <w:top w:type="dxa" w:w="50"/>
-              <w:left w:type="dxa" w:w="90"/>
-              <w:bottom w:type="dxa" w:w="50"/>
-              <w:right w:type="dxa" w:w="90"/>
-            </w:tcMar>
-            <w:vAlign w:val="center"/>
-          </w:tcPr>
-          <w:p>
-            <w:pPr>
-              <w:spacing w:after="0" w:before="0" w:line="252"/>
-            </w:pPr>
-            <w:r>
-              <w:rPr>
-                <w:rFonts w:ascii="Times New Roman" w:cs="Times New Roman" w:eastAsia="Times New Roman" w:hAnsi="Times New Roman"/>
-                <w:sz w:val="20"/>
-                <w:szCs w:val="20"/>
-              </w:rPr>
-              <w:t xml:space="preserve">Attendance records cannot be changed or deleted without permission.</w:t>
-            </w:r>
-          </w:p>
-        </w:tc>
-        <w:tc>
-          <w:tcPr>
-            <w:tcW w:type="dxa" w:w="500"/>
-            <w:tcBorders>
-              <w:top w:val="single" w:color="595959" w:sz="6"/>
-              <w:left w:val="single" w:color="595959" w:sz="6"/>
-              <w:bottom w:val="single" w:color="595959" w:sz="6"/>
-              <w:right w:val="single" w:color="595959" w:sz="6"/>
-            </w:tcBorders>
-            <w:tcMar>
-              <w:top w:type="dxa" w:w="50"/>
-              <w:left w:type="dxa" w:w="90"/>
-              <w:bottom w:type="dxa" w:w="50"/>
-              <w:right w:type="dxa" w:w="90"/>
-            </w:tcMar>
-            <w:vAlign w:val="center"/>
-          </w:tcPr>
-          <w:p>
-            <w:pPr>
-              <w:spacing w:after="0" w:before="0" w:line="252"/>
-            </w:pPr>
-            <w:r>
-              <w:rPr>
-                <w:rFonts w:ascii="Times New Roman" w:cs="Times New Roman" w:eastAsia="Times New Roman" w:hAnsi="Times New Roman"/>
-                <w:sz w:val="20"/>
-                <w:szCs w:val="20"/>
-              </w:rPr>
-              <w:t xml:space="preserve"/>
-            </w:r>
-          </w:p>
-        </w:tc>
-        <w:tc>
-          <w:tcPr>
-            <w:tcW w:type="dxa" w:w="500"/>
-            <w:tcBorders>
-              <w:top w:val="single" w:color="595959" w:sz="6"/>
-              <w:left w:val="single" w:color="595959" w:sz="6"/>
-              <w:bottom w:val="single" w:color="595959" w:sz="6"/>
-              <w:right w:val="single" w:color="595959" w:sz="6"/>
-            </w:tcBorders>
-            <w:tcMar>
-              <w:top w:type="dxa" w:w="50"/>
-              <w:left w:type="dxa" w:w="90"/>
-              <w:bottom w:type="dxa" w:w="50"/>
-              <w:right w:type="dxa" w:w="90"/>
-            </w:tcMar>
-            <w:vAlign w:val="center"/>
-          </w:tcPr>
-          <w:p>
-            <w:pPr>
-              <w:spacing w:after="0" w:before="0" w:line="252"/>
-            </w:pPr>
-            <w:r>
-              <w:rPr>
-                <w:rFonts w:ascii="Times New Roman" w:cs="Times New Roman" w:eastAsia="Times New Roman" w:hAnsi="Times New Roman"/>
-                <w:sz w:val="20"/>
-                <w:szCs w:val="20"/>
-              </w:rPr>
-              <w:t xml:space="preserve"/>
-            </w:r>
-          </w:p>
-        </w:tc>
-        <w:tc>
-          <w:tcPr>
-            <w:tcW w:type="dxa" w:w="500"/>
-            <w:tcBorders>
-              <w:top w:val="single" w:color="595959" w:sz="6"/>
-              <w:left w:val="single" w:color="595959" w:sz="6"/>
-              <w:bottom w:val="single" w:color="595959" w:sz="6"/>
-              <w:right w:val="single" w:color="595959" w:sz="6"/>
-            </w:tcBorders>
-            <w:tcMar>
-              <w:top w:type="dxa" w:w="50"/>
-              <w:left w:type="dxa" w:w="90"/>
-              <w:bottom w:type="dxa" w:w="50"/>
-              <w:right w:type="dxa" w:w="90"/>
-            </w:tcMar>
-            <w:vAlign w:val="center"/>
-          </w:tcPr>
-          <w:p>
-            <w:pPr>
-              <w:spacing w:after="0" w:before="0" w:line="252"/>
-            </w:pPr>
-            <w:r>
-              <w:rPr>
-                <w:rFonts w:ascii="Times New Roman" w:cs="Times New Roman" w:eastAsia="Times New Roman" w:hAnsi="Times New Roman"/>
-                <w:sz w:val="20"/>
-                <w:szCs w:val="20"/>
-              </w:rPr>
-              <w:t xml:space="preserve"/>
-            </w:r>
-          </w:p>
-        </w:tc>
-        <w:tc>
-          <w:tcPr>
-            <w:tcW w:type="dxa" w:w="500"/>
-            <w:tcBorders>
-              <w:top w:val="single" w:color="595959" w:sz="6"/>
-              <w:left w:val="single" w:color="595959" w:sz="6"/>
-              <w:bottom w:val="single" w:color="595959" w:sz="6"/>
-              <w:right w:val="single" w:color="595959" w:sz="6"/>
-            </w:tcBorders>
-            <w:tcMar>
-              <w:top w:type="dxa" w:w="50"/>
-              <w:left w:type="dxa" w:w="90"/>
-              <w:bottom w:type="dxa" w:w="50"/>
-              <w:right w:type="dxa" w:w="90"/>
-            </w:tcMar>
-            <w:vAlign w:val="center"/>
-          </w:tcPr>
-          <w:p>
-            <w:pPr>
-              <w:spacing w:after="0" w:before="0" w:line="252"/>
-            </w:pPr>
-            <w:r>
-              <w:rPr>
-                <w:rFonts w:ascii="Times New Roman" w:cs="Times New Roman" w:eastAsia="Times New Roman" w:hAnsi="Times New Roman"/>
-                <w:sz w:val="20"/>
-                <w:szCs w:val="20"/>
-              </w:rPr>
-              <w:t xml:space="preserve"/>
-            </w:r>
-          </w:p>
-        </w:tc>
-        <w:tc>
-          <w:tcPr>
-            <w:tcW w:type="dxa" w:w="500"/>
-            <w:tcBorders>
-              <w:top w:val="single" w:color="595959" w:sz="6"/>
-              <w:left w:val="single" w:color="595959" w:sz="6"/>
-              <w:bottom w:val="single" w:color="595959" w:sz="6"/>
-              <w:right w:val="single" w:color="595959" w:sz="6"/>
-            </w:tcBorders>
-            <w:tcMar>
-              <w:top w:type="dxa" w:w="50"/>
-              <w:left w:type="dxa" w:w="90"/>
-              <w:bottom w:type="dxa" w:w="50"/>
-              <w:right w:type="dxa" w:w="90"/>
-            </w:tcMar>
-            <w:vAlign w:val="center"/>
-          </w:tcPr>
-          <w:p>
-            <w:pPr>
-              <w:spacing w:after="0" w:before="0" w:line="252"/>
-            </w:pPr>
-            <w:r>
-              <w:rPr>
-                <w:rFonts w:ascii="Times New Roman" w:cs="Times New Roman" w:eastAsia="Times New Roman" w:hAnsi="Times New Roman"/>
-                <w:sz w:val="20"/>
-                <w:szCs w:val="20"/>
-              </w:rPr>
-              <w:t xml:space="preserve"/>
-            </w:r>
-          </w:p>
-        </w:tc>
-      </w:tr>
-      <w:tr>
-        <w:trPr>
-          <w:cantSplit/>
-          <w:trHeight w:val="420" w:hRule="atLeast"/>
-        </w:trPr>
-        <w:tc>
-          <w:tcPr>
-            <w:tcW w:type="dxa" w:w="600"/>
-            <w:tcBorders>
-              <w:top w:val="single" w:color="595959" w:sz="6"/>
-              <w:left w:val="single" w:color="595959" w:sz="6"/>
-              <w:bottom w:val="single" w:color="595959" w:sz="6"/>
-              <w:right w:val="single" w:color="595959" w:sz="6"/>
-            </w:tcBorders>
-            <w:tcMar>
-              <w:top w:type="dxa" w:w="50"/>
-              <w:left w:type="dxa" w:w="90"/>
-              <w:bottom w:type="dxa" w:w="50"/>
-              <w:right w:type="dxa" w:w="90"/>
-            </w:tcMar>
-            <w:vAlign w:val="center"/>
-          </w:tcPr>
-          <w:p>
-            <w:pPr>
-              <w:spacing w:after="0" w:before="0" w:line="252"/>
-              <w:jc w:val="center"/>
-            </w:pPr>
-            <w:r>
-              <w:rPr>
-                <w:rFonts w:ascii="Times New Roman" w:cs="Times New Roman" w:eastAsia="Times New Roman" w:hAnsi="Times New Roman"/>
-                <w:sz w:val="20"/>
-                <w:szCs w:val="20"/>
-              </w:rPr>
-              <w:t xml:space="preserve">15</w:t>
-            </w:r>
-          </w:p>
-        </w:tc>
-        <w:tc>
-          <w:tcPr>
-            <w:tcW w:type="dxa" w:w="6980"/>
-            <w:tcBorders>
-              <w:top w:val="single" w:color="595959" w:sz="6"/>
-              <w:left w:val="single" w:color="595959" w:sz="6"/>
-              <w:bottom w:val="single" w:color="595959" w:sz="6"/>
-              <w:right w:val="single" w:color="595959" w:sz="6"/>
-            </w:tcBorders>
-            <w:tcMar>
-              <w:top w:type="dxa" w:w="50"/>
-              <w:left w:type="dxa" w:w="90"/>
-              <w:bottom w:type="dxa" w:w="50"/>
-              <w:right w:type="dxa" w:w="90"/>
-            </w:tcMar>
-            <w:vAlign w:val="center"/>
-          </w:tcPr>
-          <w:p>
-            <w:pPr>
-              <w:spacing w:after="0" w:before="0" w:line="252"/>
-            </w:pPr>
-            <w:r>
-              <w:rPr>
-                <w:rFonts w:ascii="Times New Roman" w:cs="Times New Roman" w:eastAsia="Times New Roman" w:hAnsi="Times New Roman"/>
-                <w:sz w:val="20"/>
-                <w:szCs w:val="20"/>
-              </w:rPr>
-              <w:t xml:space="preserve">The system keeps a record of every change made to attendance records.</w:t>
+              <w:t xml:space="preserve">Personal information of students and teachers, including fingerprint data, is protected and shown only to authorized users.</w:t>
             </w:r>
           </w:p>
         </w:tc>
@@ -5074,7 +3851,7 @@
                 <w:sz w:val="20"/>
                 <w:szCs w:val="20"/>
               </w:rPr>
-              <w:t xml:space="preserve">D. Availability (keeping the system usable)</w:t>
+              <w:t xml:space="preserve">C. Integrity (keeping information correct)</w:t>
             </w:r>
           </w:p>
         </w:tc>
@@ -5363,7 +4140,7 @@
                 <w:sz w:val="20"/>
                 <w:szCs w:val="20"/>
               </w:rPr>
-              <w:t xml:space="preserve">16</w:t>
+              <w:t xml:space="preserve">12</w:t>
             </w:r>
           </w:p>
         </w:tc>
@@ -5394,7 +4171,7 @@
                 <w:sz w:val="20"/>
                 <w:szCs w:val="20"/>
               </w:rPr>
-              <w:t xml:space="preserve">Attendance recorded while the network is down is saved once the connection returns.</w:t>
+              <w:t xml:space="preserve">The attendance reports from the system are correct.</w:t>
             </w:r>
           </w:p>
         </w:tc>
@@ -5587,7 +4364,7 @@
                 <w:sz w:val="20"/>
                 <w:szCs w:val="20"/>
               </w:rPr>
-              <w:t xml:space="preserve">17</w:t>
+              <w:t xml:space="preserve">13</w:t>
             </w:r>
           </w:p>
         </w:tc>
@@ -5618,7 +4395,7 @@
                 <w:sz w:val="20"/>
                 <w:szCs w:val="20"/>
               </w:rPr>
-              <w:t xml:space="preserve">I can use the system whenever I need it.</w:t>
+              <w:t xml:space="preserve">The system accepts attendance only from registered classroom terminals.</w:t>
             </w:r>
           </w:p>
         </w:tc>
@@ -5811,7 +4588,1454 @@
                 <w:sz w:val="20"/>
                 <w:szCs w:val="20"/>
               </w:rPr>
+              <w:t xml:space="preserve">14</w:t>
+            </w:r>
+          </w:p>
+        </w:tc>
+        <w:tc>
+          <w:tcPr>
+            <w:tcW w:type="dxa" w:w="6980"/>
+            <w:tcBorders>
+              <w:top w:val="single" w:color="595959" w:sz="6"/>
+              <w:left w:val="single" w:color="595959" w:sz="6"/>
+              <w:bottom w:val="single" w:color="595959" w:sz="6"/>
+              <w:right w:val="single" w:color="595959" w:sz="6"/>
+            </w:tcBorders>
+            <w:tcMar>
+              <w:top w:type="dxa" w:w="50"/>
+              <w:left w:type="dxa" w:w="90"/>
+              <w:bottom w:type="dxa" w:w="50"/>
+              <w:right w:type="dxa" w:w="90"/>
+            </w:tcMar>
+            <w:vAlign w:val="center"/>
+          </w:tcPr>
+          <w:p>
+            <w:pPr>
+              <w:spacing w:after="0" w:before="0" w:line="252"/>
+            </w:pPr>
+            <w:r>
+              <w:rPr>
+                <w:rFonts w:ascii="Times New Roman" w:cs="Times New Roman" w:eastAsia="Times New Roman" w:hAnsi="Times New Roman"/>
+                <w:sz w:val="20"/>
+                <w:szCs w:val="20"/>
+              </w:rPr>
+              <w:t xml:space="preserve">Only authorized administrators can change the system settings.</w:t>
+            </w:r>
+          </w:p>
+        </w:tc>
+        <w:tc>
+          <w:tcPr>
+            <w:tcW w:type="dxa" w:w="500"/>
+            <w:tcBorders>
+              <w:top w:val="single" w:color="595959" w:sz="6"/>
+              <w:left w:val="single" w:color="595959" w:sz="6"/>
+              <w:bottom w:val="single" w:color="595959" w:sz="6"/>
+              <w:right w:val="single" w:color="595959" w:sz="6"/>
+            </w:tcBorders>
+            <w:tcMar>
+              <w:top w:type="dxa" w:w="50"/>
+              <w:left w:type="dxa" w:w="90"/>
+              <w:bottom w:type="dxa" w:w="50"/>
+              <w:right w:type="dxa" w:w="90"/>
+            </w:tcMar>
+            <w:vAlign w:val="center"/>
+          </w:tcPr>
+          <w:p>
+            <w:pPr>
+              <w:spacing w:after="0" w:before="0" w:line="252"/>
+            </w:pPr>
+            <w:r>
+              <w:rPr>
+                <w:rFonts w:ascii="Times New Roman" w:cs="Times New Roman" w:eastAsia="Times New Roman" w:hAnsi="Times New Roman"/>
+                <w:sz w:val="20"/>
+                <w:szCs w:val="20"/>
+              </w:rPr>
+              <w:t xml:space="preserve"/>
+            </w:r>
+          </w:p>
+        </w:tc>
+        <w:tc>
+          <w:tcPr>
+            <w:tcW w:type="dxa" w:w="500"/>
+            <w:tcBorders>
+              <w:top w:val="single" w:color="595959" w:sz="6"/>
+              <w:left w:val="single" w:color="595959" w:sz="6"/>
+              <w:bottom w:val="single" w:color="595959" w:sz="6"/>
+              <w:right w:val="single" w:color="595959" w:sz="6"/>
+            </w:tcBorders>
+            <w:tcMar>
+              <w:top w:type="dxa" w:w="50"/>
+              <w:left w:type="dxa" w:w="90"/>
+              <w:bottom w:type="dxa" w:w="50"/>
+              <w:right w:type="dxa" w:w="90"/>
+            </w:tcMar>
+            <w:vAlign w:val="center"/>
+          </w:tcPr>
+          <w:p>
+            <w:pPr>
+              <w:spacing w:after="0" w:before="0" w:line="252"/>
+            </w:pPr>
+            <w:r>
+              <w:rPr>
+                <w:rFonts w:ascii="Times New Roman" w:cs="Times New Roman" w:eastAsia="Times New Roman" w:hAnsi="Times New Roman"/>
+                <w:sz w:val="20"/>
+                <w:szCs w:val="20"/>
+              </w:rPr>
+              <w:t xml:space="preserve"/>
+            </w:r>
+          </w:p>
+        </w:tc>
+        <w:tc>
+          <w:tcPr>
+            <w:tcW w:type="dxa" w:w="500"/>
+            <w:tcBorders>
+              <w:top w:val="single" w:color="595959" w:sz="6"/>
+              <w:left w:val="single" w:color="595959" w:sz="6"/>
+              <w:bottom w:val="single" w:color="595959" w:sz="6"/>
+              <w:right w:val="single" w:color="595959" w:sz="6"/>
+            </w:tcBorders>
+            <w:tcMar>
+              <w:top w:type="dxa" w:w="50"/>
+              <w:left w:type="dxa" w:w="90"/>
+              <w:bottom w:type="dxa" w:w="50"/>
+              <w:right w:type="dxa" w:w="90"/>
+            </w:tcMar>
+            <w:vAlign w:val="center"/>
+          </w:tcPr>
+          <w:p>
+            <w:pPr>
+              <w:spacing w:after="0" w:before="0" w:line="252"/>
+            </w:pPr>
+            <w:r>
+              <w:rPr>
+                <w:rFonts w:ascii="Times New Roman" w:cs="Times New Roman" w:eastAsia="Times New Roman" w:hAnsi="Times New Roman"/>
+                <w:sz w:val="20"/>
+                <w:szCs w:val="20"/>
+              </w:rPr>
+              <w:t xml:space="preserve"/>
+            </w:r>
+          </w:p>
+        </w:tc>
+        <w:tc>
+          <w:tcPr>
+            <w:tcW w:type="dxa" w:w="500"/>
+            <w:tcBorders>
+              <w:top w:val="single" w:color="595959" w:sz="6"/>
+              <w:left w:val="single" w:color="595959" w:sz="6"/>
+              <w:bottom w:val="single" w:color="595959" w:sz="6"/>
+              <w:right w:val="single" w:color="595959" w:sz="6"/>
+            </w:tcBorders>
+            <w:tcMar>
+              <w:top w:type="dxa" w:w="50"/>
+              <w:left w:type="dxa" w:w="90"/>
+              <w:bottom w:type="dxa" w:w="50"/>
+              <w:right w:type="dxa" w:w="90"/>
+            </w:tcMar>
+            <w:vAlign w:val="center"/>
+          </w:tcPr>
+          <w:p>
+            <w:pPr>
+              <w:spacing w:after="0" w:before="0" w:line="252"/>
+            </w:pPr>
+            <w:r>
+              <w:rPr>
+                <w:rFonts w:ascii="Times New Roman" w:cs="Times New Roman" w:eastAsia="Times New Roman" w:hAnsi="Times New Roman"/>
+                <w:sz w:val="20"/>
+                <w:szCs w:val="20"/>
+              </w:rPr>
+              <w:t xml:space="preserve"/>
+            </w:r>
+          </w:p>
+        </w:tc>
+        <w:tc>
+          <w:tcPr>
+            <w:tcW w:type="dxa" w:w="500"/>
+            <w:tcBorders>
+              <w:top w:val="single" w:color="595959" w:sz="6"/>
+              <w:left w:val="single" w:color="595959" w:sz="6"/>
+              <w:bottom w:val="single" w:color="595959" w:sz="6"/>
+              <w:right w:val="single" w:color="595959" w:sz="6"/>
+            </w:tcBorders>
+            <w:tcMar>
+              <w:top w:type="dxa" w:w="50"/>
+              <w:left w:type="dxa" w:w="90"/>
+              <w:bottom w:type="dxa" w:w="50"/>
+              <w:right w:type="dxa" w:w="90"/>
+            </w:tcMar>
+            <w:vAlign w:val="center"/>
+          </w:tcPr>
+          <w:p>
+            <w:pPr>
+              <w:spacing w:after="0" w:before="0" w:line="252"/>
+            </w:pPr>
+            <w:r>
+              <w:rPr>
+                <w:rFonts w:ascii="Times New Roman" w:cs="Times New Roman" w:eastAsia="Times New Roman" w:hAnsi="Times New Roman"/>
+                <w:sz w:val="20"/>
+                <w:szCs w:val="20"/>
+              </w:rPr>
+              <w:t xml:space="preserve"/>
+            </w:r>
+          </w:p>
+        </w:tc>
+      </w:tr>
+      <w:tr>
+        <w:trPr>
+          <w:cantSplit/>
+          <w:trHeight w:val="420" w:hRule="atLeast"/>
+        </w:trPr>
+        <w:tc>
+          <w:tcPr>
+            <w:tcW w:type="dxa" w:w="600"/>
+            <w:tcBorders>
+              <w:top w:val="single" w:color="595959" w:sz="6"/>
+              <w:left w:val="single" w:color="595959" w:sz="6"/>
+              <w:bottom w:val="single" w:color="595959" w:sz="6"/>
+              <w:right w:val="single" w:color="595959" w:sz="6"/>
+            </w:tcBorders>
+            <w:tcMar>
+              <w:top w:type="dxa" w:w="50"/>
+              <w:left w:type="dxa" w:w="90"/>
+              <w:bottom w:type="dxa" w:w="50"/>
+              <w:right w:type="dxa" w:w="90"/>
+            </w:tcMar>
+            <w:vAlign w:val="center"/>
+          </w:tcPr>
+          <w:p>
+            <w:pPr>
+              <w:spacing w:after="0" w:before="0" w:line="252"/>
+              <w:jc w:val="center"/>
+            </w:pPr>
+            <w:r>
+              <w:rPr>
+                <w:rFonts w:ascii="Times New Roman" w:cs="Times New Roman" w:eastAsia="Times New Roman" w:hAnsi="Times New Roman"/>
+                <w:sz w:val="20"/>
+                <w:szCs w:val="20"/>
+              </w:rPr>
+              <w:t xml:space="preserve">15</w:t>
+            </w:r>
+          </w:p>
+        </w:tc>
+        <w:tc>
+          <w:tcPr>
+            <w:tcW w:type="dxa" w:w="6980"/>
+            <w:tcBorders>
+              <w:top w:val="single" w:color="595959" w:sz="6"/>
+              <w:left w:val="single" w:color="595959" w:sz="6"/>
+              <w:bottom w:val="single" w:color="595959" w:sz="6"/>
+              <w:right w:val="single" w:color="595959" w:sz="6"/>
+            </w:tcBorders>
+            <w:tcMar>
+              <w:top w:type="dxa" w:w="50"/>
+              <w:left w:type="dxa" w:w="90"/>
+              <w:bottom w:type="dxa" w:w="50"/>
+              <w:right w:type="dxa" w:w="90"/>
+            </w:tcMar>
+            <w:vAlign w:val="center"/>
+          </w:tcPr>
+          <w:p>
+            <w:pPr>
+              <w:spacing w:after="0" w:before="0" w:line="252"/>
+            </w:pPr>
+            <w:r>
+              <w:rPr>
+                <w:rFonts w:ascii="Times New Roman" w:cs="Times New Roman" w:eastAsia="Times New Roman" w:hAnsi="Times New Roman"/>
+                <w:sz w:val="20"/>
+                <w:szCs w:val="20"/>
+              </w:rPr>
+              <w:t xml:space="preserve">Attendance records cannot be changed or deleted without permission.</w:t>
+            </w:r>
+          </w:p>
+        </w:tc>
+        <w:tc>
+          <w:tcPr>
+            <w:tcW w:type="dxa" w:w="500"/>
+            <w:tcBorders>
+              <w:top w:val="single" w:color="595959" w:sz="6"/>
+              <w:left w:val="single" w:color="595959" w:sz="6"/>
+              <w:bottom w:val="single" w:color="595959" w:sz="6"/>
+              <w:right w:val="single" w:color="595959" w:sz="6"/>
+            </w:tcBorders>
+            <w:tcMar>
+              <w:top w:type="dxa" w:w="50"/>
+              <w:left w:type="dxa" w:w="90"/>
+              <w:bottom w:type="dxa" w:w="50"/>
+              <w:right w:type="dxa" w:w="90"/>
+            </w:tcMar>
+            <w:vAlign w:val="center"/>
+          </w:tcPr>
+          <w:p>
+            <w:pPr>
+              <w:spacing w:after="0" w:before="0" w:line="252"/>
+            </w:pPr>
+            <w:r>
+              <w:rPr>
+                <w:rFonts w:ascii="Times New Roman" w:cs="Times New Roman" w:eastAsia="Times New Roman" w:hAnsi="Times New Roman"/>
+                <w:sz w:val="20"/>
+                <w:szCs w:val="20"/>
+              </w:rPr>
+              <w:t xml:space="preserve"/>
+            </w:r>
+          </w:p>
+        </w:tc>
+        <w:tc>
+          <w:tcPr>
+            <w:tcW w:type="dxa" w:w="500"/>
+            <w:tcBorders>
+              <w:top w:val="single" w:color="595959" w:sz="6"/>
+              <w:left w:val="single" w:color="595959" w:sz="6"/>
+              <w:bottom w:val="single" w:color="595959" w:sz="6"/>
+              <w:right w:val="single" w:color="595959" w:sz="6"/>
+            </w:tcBorders>
+            <w:tcMar>
+              <w:top w:type="dxa" w:w="50"/>
+              <w:left w:type="dxa" w:w="90"/>
+              <w:bottom w:type="dxa" w:w="50"/>
+              <w:right w:type="dxa" w:w="90"/>
+            </w:tcMar>
+            <w:vAlign w:val="center"/>
+          </w:tcPr>
+          <w:p>
+            <w:pPr>
+              <w:spacing w:after="0" w:before="0" w:line="252"/>
+            </w:pPr>
+            <w:r>
+              <w:rPr>
+                <w:rFonts w:ascii="Times New Roman" w:cs="Times New Roman" w:eastAsia="Times New Roman" w:hAnsi="Times New Roman"/>
+                <w:sz w:val="20"/>
+                <w:szCs w:val="20"/>
+              </w:rPr>
+              <w:t xml:space="preserve"/>
+            </w:r>
+          </w:p>
+        </w:tc>
+        <w:tc>
+          <w:tcPr>
+            <w:tcW w:type="dxa" w:w="500"/>
+            <w:tcBorders>
+              <w:top w:val="single" w:color="595959" w:sz="6"/>
+              <w:left w:val="single" w:color="595959" w:sz="6"/>
+              <w:bottom w:val="single" w:color="595959" w:sz="6"/>
+              <w:right w:val="single" w:color="595959" w:sz="6"/>
+            </w:tcBorders>
+            <w:tcMar>
+              <w:top w:type="dxa" w:w="50"/>
+              <w:left w:type="dxa" w:w="90"/>
+              <w:bottom w:type="dxa" w:w="50"/>
+              <w:right w:type="dxa" w:w="90"/>
+            </w:tcMar>
+            <w:vAlign w:val="center"/>
+          </w:tcPr>
+          <w:p>
+            <w:pPr>
+              <w:spacing w:after="0" w:before="0" w:line="252"/>
+            </w:pPr>
+            <w:r>
+              <w:rPr>
+                <w:rFonts w:ascii="Times New Roman" w:cs="Times New Roman" w:eastAsia="Times New Roman" w:hAnsi="Times New Roman"/>
+                <w:sz w:val="20"/>
+                <w:szCs w:val="20"/>
+              </w:rPr>
+              <w:t xml:space="preserve"/>
+            </w:r>
+          </w:p>
+        </w:tc>
+        <w:tc>
+          <w:tcPr>
+            <w:tcW w:type="dxa" w:w="500"/>
+            <w:tcBorders>
+              <w:top w:val="single" w:color="595959" w:sz="6"/>
+              <w:left w:val="single" w:color="595959" w:sz="6"/>
+              <w:bottom w:val="single" w:color="595959" w:sz="6"/>
+              <w:right w:val="single" w:color="595959" w:sz="6"/>
+            </w:tcBorders>
+            <w:tcMar>
+              <w:top w:type="dxa" w:w="50"/>
+              <w:left w:type="dxa" w:w="90"/>
+              <w:bottom w:type="dxa" w:w="50"/>
+              <w:right w:type="dxa" w:w="90"/>
+            </w:tcMar>
+            <w:vAlign w:val="center"/>
+          </w:tcPr>
+          <w:p>
+            <w:pPr>
+              <w:spacing w:after="0" w:before="0" w:line="252"/>
+            </w:pPr>
+            <w:r>
+              <w:rPr>
+                <w:rFonts w:ascii="Times New Roman" w:cs="Times New Roman" w:eastAsia="Times New Roman" w:hAnsi="Times New Roman"/>
+                <w:sz w:val="20"/>
+                <w:szCs w:val="20"/>
+              </w:rPr>
+              <w:t xml:space="preserve"/>
+            </w:r>
+          </w:p>
+        </w:tc>
+        <w:tc>
+          <w:tcPr>
+            <w:tcW w:type="dxa" w:w="500"/>
+            <w:tcBorders>
+              <w:top w:val="single" w:color="595959" w:sz="6"/>
+              <w:left w:val="single" w:color="595959" w:sz="6"/>
+              <w:bottom w:val="single" w:color="595959" w:sz="6"/>
+              <w:right w:val="single" w:color="595959" w:sz="6"/>
+            </w:tcBorders>
+            <w:tcMar>
+              <w:top w:type="dxa" w:w="50"/>
+              <w:left w:type="dxa" w:w="90"/>
+              <w:bottom w:type="dxa" w:w="50"/>
+              <w:right w:type="dxa" w:w="90"/>
+            </w:tcMar>
+            <w:vAlign w:val="center"/>
+          </w:tcPr>
+          <w:p>
+            <w:pPr>
+              <w:spacing w:after="0" w:before="0" w:line="252"/>
+            </w:pPr>
+            <w:r>
+              <w:rPr>
+                <w:rFonts w:ascii="Times New Roman" w:cs="Times New Roman" w:eastAsia="Times New Roman" w:hAnsi="Times New Roman"/>
+                <w:sz w:val="20"/>
+                <w:szCs w:val="20"/>
+              </w:rPr>
+              <w:t xml:space="preserve"/>
+            </w:r>
+          </w:p>
+        </w:tc>
+      </w:tr>
+      <w:tr>
+        <w:trPr>
+          <w:cantSplit/>
+          <w:trHeight w:val="420" w:hRule="atLeast"/>
+        </w:trPr>
+        <w:tc>
+          <w:tcPr>
+            <w:tcW w:type="dxa" w:w="600"/>
+            <w:tcBorders>
+              <w:top w:val="single" w:color="595959" w:sz="6"/>
+              <w:left w:val="single" w:color="595959" w:sz="6"/>
+              <w:bottom w:val="single" w:color="595959" w:sz="6"/>
+              <w:right w:val="single" w:color="595959" w:sz="6"/>
+            </w:tcBorders>
+            <w:tcMar>
+              <w:top w:type="dxa" w:w="50"/>
+              <w:left w:type="dxa" w:w="90"/>
+              <w:bottom w:type="dxa" w:w="50"/>
+              <w:right w:type="dxa" w:w="90"/>
+            </w:tcMar>
+            <w:vAlign w:val="center"/>
+          </w:tcPr>
+          <w:p>
+            <w:pPr>
+              <w:spacing w:after="0" w:before="0" w:line="252"/>
+              <w:jc w:val="center"/>
+            </w:pPr>
+            <w:r>
+              <w:rPr>
+                <w:rFonts w:ascii="Times New Roman" w:cs="Times New Roman" w:eastAsia="Times New Roman" w:hAnsi="Times New Roman"/>
+                <w:sz w:val="20"/>
+                <w:szCs w:val="20"/>
+              </w:rPr>
+              <w:t xml:space="preserve">16</w:t>
+            </w:r>
+          </w:p>
+        </w:tc>
+        <w:tc>
+          <w:tcPr>
+            <w:tcW w:type="dxa" w:w="6980"/>
+            <w:tcBorders>
+              <w:top w:val="single" w:color="595959" w:sz="6"/>
+              <w:left w:val="single" w:color="595959" w:sz="6"/>
+              <w:bottom w:val="single" w:color="595959" w:sz="6"/>
+              <w:right w:val="single" w:color="595959" w:sz="6"/>
+            </w:tcBorders>
+            <w:tcMar>
+              <w:top w:type="dxa" w:w="50"/>
+              <w:left w:type="dxa" w:w="90"/>
+              <w:bottom w:type="dxa" w:w="50"/>
+              <w:right w:type="dxa" w:w="90"/>
+            </w:tcMar>
+            <w:vAlign w:val="center"/>
+          </w:tcPr>
+          <w:p>
+            <w:pPr>
+              <w:spacing w:after="0" w:before="0" w:line="252"/>
+            </w:pPr>
+            <w:r>
+              <w:rPr>
+                <w:rFonts w:ascii="Times New Roman" w:cs="Times New Roman" w:eastAsia="Times New Roman" w:hAnsi="Times New Roman"/>
+                <w:sz w:val="20"/>
+                <w:szCs w:val="20"/>
+              </w:rPr>
+              <w:t xml:space="preserve">The system keeps a record of every change made to attendance records.</w:t>
+            </w:r>
+          </w:p>
+        </w:tc>
+        <w:tc>
+          <w:tcPr>
+            <w:tcW w:type="dxa" w:w="500"/>
+            <w:tcBorders>
+              <w:top w:val="single" w:color="595959" w:sz="6"/>
+              <w:left w:val="single" w:color="595959" w:sz="6"/>
+              <w:bottom w:val="single" w:color="595959" w:sz="6"/>
+              <w:right w:val="single" w:color="595959" w:sz="6"/>
+            </w:tcBorders>
+            <w:tcMar>
+              <w:top w:type="dxa" w:w="50"/>
+              <w:left w:type="dxa" w:w="90"/>
+              <w:bottom w:type="dxa" w:w="50"/>
+              <w:right w:type="dxa" w:w="90"/>
+            </w:tcMar>
+            <w:vAlign w:val="center"/>
+          </w:tcPr>
+          <w:p>
+            <w:pPr>
+              <w:spacing w:after="0" w:before="0" w:line="252"/>
+            </w:pPr>
+            <w:r>
+              <w:rPr>
+                <w:rFonts w:ascii="Times New Roman" w:cs="Times New Roman" w:eastAsia="Times New Roman" w:hAnsi="Times New Roman"/>
+                <w:sz w:val="20"/>
+                <w:szCs w:val="20"/>
+              </w:rPr>
+              <w:t xml:space="preserve"/>
+            </w:r>
+          </w:p>
+        </w:tc>
+        <w:tc>
+          <w:tcPr>
+            <w:tcW w:type="dxa" w:w="500"/>
+            <w:tcBorders>
+              <w:top w:val="single" w:color="595959" w:sz="6"/>
+              <w:left w:val="single" w:color="595959" w:sz="6"/>
+              <w:bottom w:val="single" w:color="595959" w:sz="6"/>
+              <w:right w:val="single" w:color="595959" w:sz="6"/>
+            </w:tcBorders>
+            <w:tcMar>
+              <w:top w:type="dxa" w:w="50"/>
+              <w:left w:type="dxa" w:w="90"/>
+              <w:bottom w:type="dxa" w:w="50"/>
+              <w:right w:type="dxa" w:w="90"/>
+            </w:tcMar>
+            <w:vAlign w:val="center"/>
+          </w:tcPr>
+          <w:p>
+            <w:pPr>
+              <w:spacing w:after="0" w:before="0" w:line="252"/>
+            </w:pPr>
+            <w:r>
+              <w:rPr>
+                <w:rFonts w:ascii="Times New Roman" w:cs="Times New Roman" w:eastAsia="Times New Roman" w:hAnsi="Times New Roman"/>
+                <w:sz w:val="20"/>
+                <w:szCs w:val="20"/>
+              </w:rPr>
+              <w:t xml:space="preserve"/>
+            </w:r>
+          </w:p>
+        </w:tc>
+        <w:tc>
+          <w:tcPr>
+            <w:tcW w:type="dxa" w:w="500"/>
+            <w:tcBorders>
+              <w:top w:val="single" w:color="595959" w:sz="6"/>
+              <w:left w:val="single" w:color="595959" w:sz="6"/>
+              <w:bottom w:val="single" w:color="595959" w:sz="6"/>
+              <w:right w:val="single" w:color="595959" w:sz="6"/>
+            </w:tcBorders>
+            <w:tcMar>
+              <w:top w:type="dxa" w:w="50"/>
+              <w:left w:type="dxa" w:w="90"/>
+              <w:bottom w:type="dxa" w:w="50"/>
+              <w:right w:type="dxa" w:w="90"/>
+            </w:tcMar>
+            <w:vAlign w:val="center"/>
+          </w:tcPr>
+          <w:p>
+            <w:pPr>
+              <w:spacing w:after="0" w:before="0" w:line="252"/>
+            </w:pPr>
+            <w:r>
+              <w:rPr>
+                <w:rFonts w:ascii="Times New Roman" w:cs="Times New Roman" w:eastAsia="Times New Roman" w:hAnsi="Times New Roman"/>
+                <w:sz w:val="20"/>
+                <w:szCs w:val="20"/>
+              </w:rPr>
+              <w:t xml:space="preserve"/>
+            </w:r>
+          </w:p>
+        </w:tc>
+        <w:tc>
+          <w:tcPr>
+            <w:tcW w:type="dxa" w:w="500"/>
+            <w:tcBorders>
+              <w:top w:val="single" w:color="595959" w:sz="6"/>
+              <w:left w:val="single" w:color="595959" w:sz="6"/>
+              <w:bottom w:val="single" w:color="595959" w:sz="6"/>
+              <w:right w:val="single" w:color="595959" w:sz="6"/>
+            </w:tcBorders>
+            <w:tcMar>
+              <w:top w:type="dxa" w:w="50"/>
+              <w:left w:type="dxa" w:w="90"/>
+              <w:bottom w:type="dxa" w:w="50"/>
+              <w:right w:type="dxa" w:w="90"/>
+            </w:tcMar>
+            <w:vAlign w:val="center"/>
+          </w:tcPr>
+          <w:p>
+            <w:pPr>
+              <w:spacing w:after="0" w:before="0" w:line="252"/>
+            </w:pPr>
+            <w:r>
+              <w:rPr>
+                <w:rFonts w:ascii="Times New Roman" w:cs="Times New Roman" w:eastAsia="Times New Roman" w:hAnsi="Times New Roman"/>
+                <w:sz w:val="20"/>
+                <w:szCs w:val="20"/>
+              </w:rPr>
+              <w:t xml:space="preserve"/>
+            </w:r>
+          </w:p>
+        </w:tc>
+        <w:tc>
+          <w:tcPr>
+            <w:tcW w:type="dxa" w:w="500"/>
+            <w:tcBorders>
+              <w:top w:val="single" w:color="595959" w:sz="6"/>
+              <w:left w:val="single" w:color="595959" w:sz="6"/>
+              <w:bottom w:val="single" w:color="595959" w:sz="6"/>
+              <w:right w:val="single" w:color="595959" w:sz="6"/>
+            </w:tcBorders>
+            <w:tcMar>
+              <w:top w:type="dxa" w:w="50"/>
+              <w:left w:type="dxa" w:w="90"/>
+              <w:bottom w:type="dxa" w:w="50"/>
+              <w:right w:type="dxa" w:w="90"/>
+            </w:tcMar>
+            <w:vAlign w:val="center"/>
+          </w:tcPr>
+          <w:p>
+            <w:pPr>
+              <w:spacing w:after="0" w:before="0" w:line="252"/>
+            </w:pPr>
+            <w:r>
+              <w:rPr>
+                <w:rFonts w:ascii="Times New Roman" w:cs="Times New Roman" w:eastAsia="Times New Roman" w:hAnsi="Times New Roman"/>
+                <w:sz w:val="20"/>
+                <w:szCs w:val="20"/>
+              </w:rPr>
+              <w:t xml:space="preserve"/>
+            </w:r>
+          </w:p>
+        </w:tc>
+      </w:tr>
+    </w:tbl>
+    <w:p>
+      <w:pPr>
+        <w:spacing w:after="120" w:before="0" w:line="276"/>
+      </w:pPr>
+      <w:r>
+        <w:rPr>
+          <w:rFonts w:ascii="Times New Roman" w:cs="Times New Roman" w:eastAsia="Times New Roman" w:hAnsi="Times New Roman"/>
+          <w:sz w:val="21"/>
+          <w:szCs w:val="21"/>
+        </w:rPr>
+        <w:t xml:space="preserve"/>
+      </w:r>
+    </w:p>
+    <w:tbl>
+      <w:tblPr>
+        <w:tblW w:type="dxa" w:w="10080"/>
+        <w:tblBorders>
+          <w:top w:val="single" w:color="auto" w:sz="4"/>
+          <w:left w:val="single" w:color="auto" w:sz="4"/>
+          <w:bottom w:val="single" w:color="auto" w:sz="4"/>
+          <w:right w:val="single" w:color="auto" w:sz="4"/>
+          <w:insideH w:val="single" w:color="auto" w:sz="4"/>
+          <w:insideV w:val="single" w:color="auto" w:sz="4"/>
+        </w:tblBorders>
+      </w:tblPr>
+      <w:tblGrid>
+        <w:gridCol w:w="600"/>
+        <w:gridCol w:w="6980"/>
+        <w:gridCol w:w="500"/>
+        <w:gridCol w:w="500"/>
+        <w:gridCol w:w="500"/>
+        <w:gridCol w:w="500"/>
+        <w:gridCol w:w="500"/>
+      </w:tblGrid>
+      <w:tr>
+        <w:trPr>
+          <w:cantSplit/>
+          <w:tblHeader/>
+        </w:trPr>
+        <w:tc>
+          <w:tcPr>
+            <w:tcW w:type="dxa" w:w="10080"/>
+            <w:gridSpan w:val="7"/>
+            <w:tcBorders>
+              <w:top w:val="single" w:color="595959" w:sz="6"/>
+              <w:left w:val="single" w:color="595959" w:sz="6"/>
+              <w:bottom w:val="single" w:color="595959" w:sz="6"/>
+              <w:right w:val="single" w:color="595959" w:sz="6"/>
+            </w:tcBorders>
+            <w:shd w:fill="D9D9D9" w:color="auto" w:val="clear"/>
+            <w:tcMar>
+              <w:top w:type="dxa" w:w="50"/>
+              <w:left w:type="dxa" w:w="90"/>
+              <w:bottom w:type="dxa" w:w="50"/>
+              <w:right w:type="dxa" w:w="90"/>
+            </w:tcMar>
+            <w:vAlign w:val="center"/>
+          </w:tcPr>
+          <w:p>
+            <w:pPr>
+              <w:spacing w:after="0" w:before="0" w:line="252"/>
+            </w:pPr>
+            <w:r>
+              <w:rPr>
+                <w:rFonts w:ascii="Times New Roman" w:cs="Times New Roman" w:eastAsia="Times New Roman" w:hAnsi="Times New Roman"/>
+                <w:b/>
+                <w:bCs/>
+                <w:sz w:val="20"/>
+                <w:szCs w:val="20"/>
+              </w:rPr>
+              <w:t xml:space="preserve">D. Availability (keeping the system usable)</w:t>
+            </w:r>
+          </w:p>
+        </w:tc>
+      </w:tr>
+      <w:tr>
+        <w:trPr>
+          <w:cantSplit/>
+          <w:tblHeader/>
+        </w:trPr>
+        <w:tc>
+          <w:tcPr>
+            <w:tcW w:type="dxa" w:w="600"/>
+            <w:tcBorders>
+              <w:top w:val="single" w:color="595959" w:sz="6"/>
+              <w:left w:val="single" w:color="595959" w:sz="6"/>
+              <w:bottom w:val="single" w:color="595959" w:sz="6"/>
+              <w:right w:val="single" w:color="595959" w:sz="6"/>
+            </w:tcBorders>
+            <w:shd w:fill="F2F2F2" w:color="auto" w:val="clear"/>
+            <w:tcMar>
+              <w:top w:type="dxa" w:w="50"/>
+              <w:left w:type="dxa" w:w="90"/>
+              <w:bottom w:type="dxa" w:w="50"/>
+              <w:right w:type="dxa" w:w="90"/>
+            </w:tcMar>
+            <w:vAlign w:val="center"/>
+          </w:tcPr>
+          <w:p>
+            <w:pPr>
+              <w:spacing w:after="0" w:before="0" w:line="252"/>
+              <w:jc w:val="center"/>
+            </w:pPr>
+            <w:r>
+              <w:rPr>
+                <w:rFonts w:ascii="Times New Roman" w:cs="Times New Roman" w:eastAsia="Times New Roman" w:hAnsi="Times New Roman"/>
+                <w:b/>
+                <w:bCs/>
+                <w:sz w:val="20"/>
+                <w:szCs w:val="20"/>
+              </w:rPr>
+              <w:t xml:space="preserve">No.</w:t>
+            </w:r>
+          </w:p>
+        </w:tc>
+        <w:tc>
+          <w:tcPr>
+            <w:tcW w:type="dxa" w:w="6980"/>
+            <w:tcBorders>
+              <w:top w:val="single" w:color="595959" w:sz="6"/>
+              <w:left w:val="single" w:color="595959" w:sz="6"/>
+              <w:bottom w:val="single" w:color="595959" w:sz="6"/>
+              <w:right w:val="single" w:color="595959" w:sz="6"/>
+            </w:tcBorders>
+            <w:shd w:fill="F2F2F2" w:color="auto" w:val="clear"/>
+            <w:tcMar>
+              <w:top w:type="dxa" w:w="50"/>
+              <w:left w:type="dxa" w:w="90"/>
+              <w:bottom w:type="dxa" w:w="50"/>
+              <w:right w:type="dxa" w:w="90"/>
+            </w:tcMar>
+            <w:vAlign w:val="center"/>
+          </w:tcPr>
+          <w:p>
+            <w:pPr>
+              <w:spacing w:after="0" w:before="0" w:line="252"/>
+              <w:jc w:val="left"/>
+            </w:pPr>
+            <w:r>
+              <w:rPr>
+                <w:rFonts w:ascii="Times New Roman" w:cs="Times New Roman" w:eastAsia="Times New Roman" w:hAnsi="Times New Roman"/>
+                <w:b/>
+                <w:bCs/>
+                <w:sz w:val="20"/>
+                <w:szCs w:val="20"/>
+              </w:rPr>
+              <w:t xml:space="preserve">Indicator</w:t>
+            </w:r>
+          </w:p>
+        </w:tc>
+        <w:tc>
+          <w:tcPr>
+            <w:tcW w:type="dxa" w:w="500"/>
+            <w:tcBorders>
+              <w:top w:val="single" w:color="595959" w:sz="6"/>
+              <w:left w:val="single" w:color="595959" w:sz="6"/>
+              <w:bottom w:val="single" w:color="595959" w:sz="6"/>
+              <w:right w:val="single" w:color="595959" w:sz="6"/>
+            </w:tcBorders>
+            <w:shd w:fill="F2F2F2" w:color="auto" w:val="clear"/>
+            <w:tcMar>
+              <w:top w:type="dxa" w:w="50"/>
+              <w:left w:type="dxa" w:w="90"/>
+              <w:bottom w:type="dxa" w:w="50"/>
+              <w:right w:type="dxa" w:w="90"/>
+            </w:tcMar>
+            <w:vAlign w:val="center"/>
+          </w:tcPr>
+          <w:p>
+            <w:pPr>
+              <w:spacing w:after="0" w:before="0" w:line="252"/>
+              <w:jc w:val="center"/>
+            </w:pPr>
+            <w:r>
+              <w:rPr>
+                <w:rFonts w:ascii="Times New Roman" w:cs="Times New Roman" w:eastAsia="Times New Roman" w:hAnsi="Times New Roman"/>
+                <w:b/>
+                <w:bCs/>
+                <w:sz w:val="20"/>
+                <w:szCs w:val="20"/>
+              </w:rPr>
+              <w:t xml:space="preserve">5</w:t>
+            </w:r>
+          </w:p>
+        </w:tc>
+        <w:tc>
+          <w:tcPr>
+            <w:tcW w:type="dxa" w:w="500"/>
+            <w:tcBorders>
+              <w:top w:val="single" w:color="595959" w:sz="6"/>
+              <w:left w:val="single" w:color="595959" w:sz="6"/>
+              <w:bottom w:val="single" w:color="595959" w:sz="6"/>
+              <w:right w:val="single" w:color="595959" w:sz="6"/>
+            </w:tcBorders>
+            <w:shd w:fill="F2F2F2" w:color="auto" w:val="clear"/>
+            <w:tcMar>
+              <w:top w:type="dxa" w:w="50"/>
+              <w:left w:type="dxa" w:w="90"/>
+              <w:bottom w:type="dxa" w:w="50"/>
+              <w:right w:type="dxa" w:w="90"/>
+            </w:tcMar>
+            <w:vAlign w:val="center"/>
+          </w:tcPr>
+          <w:p>
+            <w:pPr>
+              <w:spacing w:after="0" w:before="0" w:line="252"/>
+              <w:jc w:val="center"/>
+            </w:pPr>
+            <w:r>
+              <w:rPr>
+                <w:rFonts w:ascii="Times New Roman" w:cs="Times New Roman" w:eastAsia="Times New Roman" w:hAnsi="Times New Roman"/>
+                <w:b/>
+                <w:bCs/>
+                <w:sz w:val="20"/>
+                <w:szCs w:val="20"/>
+              </w:rPr>
+              <w:t xml:space="preserve">4</w:t>
+            </w:r>
+          </w:p>
+        </w:tc>
+        <w:tc>
+          <w:tcPr>
+            <w:tcW w:type="dxa" w:w="500"/>
+            <w:tcBorders>
+              <w:top w:val="single" w:color="595959" w:sz="6"/>
+              <w:left w:val="single" w:color="595959" w:sz="6"/>
+              <w:bottom w:val="single" w:color="595959" w:sz="6"/>
+              <w:right w:val="single" w:color="595959" w:sz="6"/>
+            </w:tcBorders>
+            <w:shd w:fill="F2F2F2" w:color="auto" w:val="clear"/>
+            <w:tcMar>
+              <w:top w:type="dxa" w:w="50"/>
+              <w:left w:type="dxa" w:w="90"/>
+              <w:bottom w:type="dxa" w:w="50"/>
+              <w:right w:type="dxa" w:w="90"/>
+            </w:tcMar>
+            <w:vAlign w:val="center"/>
+          </w:tcPr>
+          <w:p>
+            <w:pPr>
+              <w:spacing w:after="0" w:before="0" w:line="252"/>
+              <w:jc w:val="center"/>
+            </w:pPr>
+            <w:r>
+              <w:rPr>
+                <w:rFonts w:ascii="Times New Roman" w:cs="Times New Roman" w:eastAsia="Times New Roman" w:hAnsi="Times New Roman"/>
+                <w:b/>
+                <w:bCs/>
+                <w:sz w:val="20"/>
+                <w:szCs w:val="20"/>
+              </w:rPr>
+              <w:t xml:space="preserve">3</w:t>
+            </w:r>
+          </w:p>
+        </w:tc>
+        <w:tc>
+          <w:tcPr>
+            <w:tcW w:type="dxa" w:w="500"/>
+            <w:tcBorders>
+              <w:top w:val="single" w:color="595959" w:sz="6"/>
+              <w:left w:val="single" w:color="595959" w:sz="6"/>
+              <w:bottom w:val="single" w:color="595959" w:sz="6"/>
+              <w:right w:val="single" w:color="595959" w:sz="6"/>
+            </w:tcBorders>
+            <w:shd w:fill="F2F2F2" w:color="auto" w:val="clear"/>
+            <w:tcMar>
+              <w:top w:type="dxa" w:w="50"/>
+              <w:left w:type="dxa" w:w="90"/>
+              <w:bottom w:type="dxa" w:w="50"/>
+              <w:right w:type="dxa" w:w="90"/>
+            </w:tcMar>
+            <w:vAlign w:val="center"/>
+          </w:tcPr>
+          <w:p>
+            <w:pPr>
+              <w:spacing w:after="0" w:before="0" w:line="252"/>
+              <w:jc w:val="center"/>
+            </w:pPr>
+            <w:r>
+              <w:rPr>
+                <w:rFonts w:ascii="Times New Roman" w:cs="Times New Roman" w:eastAsia="Times New Roman" w:hAnsi="Times New Roman"/>
+                <w:b/>
+                <w:bCs/>
+                <w:sz w:val="20"/>
+                <w:szCs w:val="20"/>
+              </w:rPr>
+              <w:t xml:space="preserve">2</w:t>
+            </w:r>
+          </w:p>
+        </w:tc>
+        <w:tc>
+          <w:tcPr>
+            <w:tcW w:type="dxa" w:w="500"/>
+            <w:tcBorders>
+              <w:top w:val="single" w:color="595959" w:sz="6"/>
+              <w:left w:val="single" w:color="595959" w:sz="6"/>
+              <w:bottom w:val="single" w:color="595959" w:sz="6"/>
+              <w:right w:val="single" w:color="595959" w:sz="6"/>
+            </w:tcBorders>
+            <w:shd w:fill="F2F2F2" w:color="auto" w:val="clear"/>
+            <w:tcMar>
+              <w:top w:type="dxa" w:w="50"/>
+              <w:left w:type="dxa" w:w="90"/>
+              <w:bottom w:type="dxa" w:w="50"/>
+              <w:right w:type="dxa" w:w="90"/>
+            </w:tcMar>
+            <w:vAlign w:val="center"/>
+          </w:tcPr>
+          <w:p>
+            <w:pPr>
+              <w:spacing w:after="0" w:before="0" w:line="252"/>
+              <w:jc w:val="center"/>
+            </w:pPr>
+            <w:r>
+              <w:rPr>
+                <w:rFonts w:ascii="Times New Roman" w:cs="Times New Roman" w:eastAsia="Times New Roman" w:hAnsi="Times New Roman"/>
+                <w:b/>
+                <w:bCs/>
+                <w:sz w:val="20"/>
+                <w:szCs w:val="20"/>
+              </w:rPr>
+              <w:t xml:space="preserve">1</w:t>
+            </w:r>
+          </w:p>
+        </w:tc>
+      </w:tr>
+      <w:tr>
+        <w:trPr>
+          <w:cantSplit/>
+          <w:trHeight w:val="420" w:hRule="atLeast"/>
+        </w:trPr>
+        <w:tc>
+          <w:tcPr>
+            <w:tcW w:type="dxa" w:w="600"/>
+            <w:tcBorders>
+              <w:top w:val="single" w:color="595959" w:sz="6"/>
+              <w:left w:val="single" w:color="595959" w:sz="6"/>
+              <w:bottom w:val="single" w:color="595959" w:sz="6"/>
+              <w:right w:val="single" w:color="595959" w:sz="6"/>
+            </w:tcBorders>
+            <w:tcMar>
+              <w:top w:type="dxa" w:w="50"/>
+              <w:left w:type="dxa" w:w="90"/>
+              <w:bottom w:type="dxa" w:w="50"/>
+              <w:right w:type="dxa" w:w="90"/>
+            </w:tcMar>
+            <w:vAlign w:val="center"/>
+          </w:tcPr>
+          <w:p>
+            <w:pPr>
+              <w:spacing w:after="0" w:before="0" w:line="252"/>
+              <w:jc w:val="center"/>
+            </w:pPr>
+            <w:r>
+              <w:rPr>
+                <w:rFonts w:ascii="Times New Roman" w:cs="Times New Roman" w:eastAsia="Times New Roman" w:hAnsi="Times New Roman"/>
+                <w:sz w:val="20"/>
+                <w:szCs w:val="20"/>
+              </w:rPr>
+              <w:t xml:space="preserve">17</w:t>
+            </w:r>
+          </w:p>
+        </w:tc>
+        <w:tc>
+          <w:tcPr>
+            <w:tcW w:type="dxa" w:w="6980"/>
+            <w:tcBorders>
+              <w:top w:val="single" w:color="595959" w:sz="6"/>
+              <w:left w:val="single" w:color="595959" w:sz="6"/>
+              <w:bottom w:val="single" w:color="595959" w:sz="6"/>
+              <w:right w:val="single" w:color="595959" w:sz="6"/>
+            </w:tcBorders>
+            <w:tcMar>
+              <w:top w:type="dxa" w:w="50"/>
+              <w:left w:type="dxa" w:w="90"/>
+              <w:bottom w:type="dxa" w:w="50"/>
+              <w:right w:type="dxa" w:w="90"/>
+            </w:tcMar>
+            <w:vAlign w:val="center"/>
+          </w:tcPr>
+          <w:p>
+            <w:pPr>
+              <w:spacing w:after="0" w:before="0" w:line="252"/>
+            </w:pPr>
+            <w:r>
+              <w:rPr>
+                <w:rFonts w:ascii="Times New Roman" w:cs="Times New Roman" w:eastAsia="Times New Roman" w:hAnsi="Times New Roman"/>
+                <w:sz w:val="20"/>
+                <w:szCs w:val="20"/>
+              </w:rPr>
+              <w:t xml:space="preserve">Attendance recorded while the network is down is saved once the connection returns.</w:t>
+            </w:r>
+          </w:p>
+        </w:tc>
+        <w:tc>
+          <w:tcPr>
+            <w:tcW w:type="dxa" w:w="500"/>
+            <w:tcBorders>
+              <w:top w:val="single" w:color="595959" w:sz="6"/>
+              <w:left w:val="single" w:color="595959" w:sz="6"/>
+              <w:bottom w:val="single" w:color="595959" w:sz="6"/>
+              <w:right w:val="single" w:color="595959" w:sz="6"/>
+            </w:tcBorders>
+            <w:tcMar>
+              <w:top w:type="dxa" w:w="50"/>
+              <w:left w:type="dxa" w:w="90"/>
+              <w:bottom w:type="dxa" w:w="50"/>
+              <w:right w:type="dxa" w:w="90"/>
+            </w:tcMar>
+            <w:vAlign w:val="center"/>
+          </w:tcPr>
+          <w:p>
+            <w:pPr>
+              <w:spacing w:after="0" w:before="0" w:line="252"/>
+            </w:pPr>
+            <w:r>
+              <w:rPr>
+                <w:rFonts w:ascii="Times New Roman" w:cs="Times New Roman" w:eastAsia="Times New Roman" w:hAnsi="Times New Roman"/>
+                <w:sz w:val="20"/>
+                <w:szCs w:val="20"/>
+              </w:rPr>
+              <w:t xml:space="preserve"/>
+            </w:r>
+          </w:p>
+        </w:tc>
+        <w:tc>
+          <w:tcPr>
+            <w:tcW w:type="dxa" w:w="500"/>
+            <w:tcBorders>
+              <w:top w:val="single" w:color="595959" w:sz="6"/>
+              <w:left w:val="single" w:color="595959" w:sz="6"/>
+              <w:bottom w:val="single" w:color="595959" w:sz="6"/>
+              <w:right w:val="single" w:color="595959" w:sz="6"/>
+            </w:tcBorders>
+            <w:tcMar>
+              <w:top w:type="dxa" w:w="50"/>
+              <w:left w:type="dxa" w:w="90"/>
+              <w:bottom w:type="dxa" w:w="50"/>
+              <w:right w:type="dxa" w:w="90"/>
+            </w:tcMar>
+            <w:vAlign w:val="center"/>
+          </w:tcPr>
+          <w:p>
+            <w:pPr>
+              <w:spacing w:after="0" w:before="0" w:line="252"/>
+            </w:pPr>
+            <w:r>
+              <w:rPr>
+                <w:rFonts w:ascii="Times New Roman" w:cs="Times New Roman" w:eastAsia="Times New Roman" w:hAnsi="Times New Roman"/>
+                <w:sz w:val="20"/>
+                <w:szCs w:val="20"/>
+              </w:rPr>
+              <w:t xml:space="preserve"/>
+            </w:r>
+          </w:p>
+        </w:tc>
+        <w:tc>
+          <w:tcPr>
+            <w:tcW w:type="dxa" w:w="500"/>
+            <w:tcBorders>
+              <w:top w:val="single" w:color="595959" w:sz="6"/>
+              <w:left w:val="single" w:color="595959" w:sz="6"/>
+              <w:bottom w:val="single" w:color="595959" w:sz="6"/>
+              <w:right w:val="single" w:color="595959" w:sz="6"/>
+            </w:tcBorders>
+            <w:tcMar>
+              <w:top w:type="dxa" w:w="50"/>
+              <w:left w:type="dxa" w:w="90"/>
+              <w:bottom w:type="dxa" w:w="50"/>
+              <w:right w:type="dxa" w:w="90"/>
+            </w:tcMar>
+            <w:vAlign w:val="center"/>
+          </w:tcPr>
+          <w:p>
+            <w:pPr>
+              <w:spacing w:after="0" w:before="0" w:line="252"/>
+            </w:pPr>
+            <w:r>
+              <w:rPr>
+                <w:rFonts w:ascii="Times New Roman" w:cs="Times New Roman" w:eastAsia="Times New Roman" w:hAnsi="Times New Roman"/>
+                <w:sz w:val="20"/>
+                <w:szCs w:val="20"/>
+              </w:rPr>
+              <w:t xml:space="preserve"/>
+            </w:r>
+          </w:p>
+        </w:tc>
+        <w:tc>
+          <w:tcPr>
+            <w:tcW w:type="dxa" w:w="500"/>
+            <w:tcBorders>
+              <w:top w:val="single" w:color="595959" w:sz="6"/>
+              <w:left w:val="single" w:color="595959" w:sz="6"/>
+              <w:bottom w:val="single" w:color="595959" w:sz="6"/>
+              <w:right w:val="single" w:color="595959" w:sz="6"/>
+            </w:tcBorders>
+            <w:tcMar>
+              <w:top w:type="dxa" w:w="50"/>
+              <w:left w:type="dxa" w:w="90"/>
+              <w:bottom w:type="dxa" w:w="50"/>
+              <w:right w:type="dxa" w:w="90"/>
+            </w:tcMar>
+            <w:vAlign w:val="center"/>
+          </w:tcPr>
+          <w:p>
+            <w:pPr>
+              <w:spacing w:after="0" w:before="0" w:line="252"/>
+            </w:pPr>
+            <w:r>
+              <w:rPr>
+                <w:rFonts w:ascii="Times New Roman" w:cs="Times New Roman" w:eastAsia="Times New Roman" w:hAnsi="Times New Roman"/>
+                <w:sz w:val="20"/>
+                <w:szCs w:val="20"/>
+              </w:rPr>
+              <w:t xml:space="preserve"/>
+            </w:r>
+          </w:p>
+        </w:tc>
+        <w:tc>
+          <w:tcPr>
+            <w:tcW w:type="dxa" w:w="500"/>
+            <w:tcBorders>
+              <w:top w:val="single" w:color="595959" w:sz="6"/>
+              <w:left w:val="single" w:color="595959" w:sz="6"/>
+              <w:bottom w:val="single" w:color="595959" w:sz="6"/>
+              <w:right w:val="single" w:color="595959" w:sz="6"/>
+            </w:tcBorders>
+            <w:tcMar>
+              <w:top w:type="dxa" w:w="50"/>
+              <w:left w:type="dxa" w:w="90"/>
+              <w:bottom w:type="dxa" w:w="50"/>
+              <w:right w:type="dxa" w:w="90"/>
+            </w:tcMar>
+            <w:vAlign w:val="center"/>
+          </w:tcPr>
+          <w:p>
+            <w:pPr>
+              <w:spacing w:after="0" w:before="0" w:line="252"/>
+            </w:pPr>
+            <w:r>
+              <w:rPr>
+                <w:rFonts w:ascii="Times New Roman" w:cs="Times New Roman" w:eastAsia="Times New Roman" w:hAnsi="Times New Roman"/>
+                <w:sz w:val="20"/>
+                <w:szCs w:val="20"/>
+              </w:rPr>
+              <w:t xml:space="preserve"/>
+            </w:r>
+          </w:p>
+        </w:tc>
+      </w:tr>
+      <w:tr>
+        <w:trPr>
+          <w:cantSplit/>
+          <w:trHeight w:val="420" w:hRule="atLeast"/>
+        </w:trPr>
+        <w:tc>
+          <w:tcPr>
+            <w:tcW w:type="dxa" w:w="600"/>
+            <w:tcBorders>
+              <w:top w:val="single" w:color="595959" w:sz="6"/>
+              <w:left w:val="single" w:color="595959" w:sz="6"/>
+              <w:bottom w:val="single" w:color="595959" w:sz="6"/>
+              <w:right w:val="single" w:color="595959" w:sz="6"/>
+            </w:tcBorders>
+            <w:tcMar>
+              <w:top w:type="dxa" w:w="50"/>
+              <w:left w:type="dxa" w:w="90"/>
+              <w:bottom w:type="dxa" w:w="50"/>
+              <w:right w:type="dxa" w:w="90"/>
+            </w:tcMar>
+            <w:vAlign w:val="center"/>
+          </w:tcPr>
+          <w:p>
+            <w:pPr>
+              <w:spacing w:after="0" w:before="0" w:line="252"/>
+              <w:jc w:val="center"/>
+            </w:pPr>
+            <w:r>
+              <w:rPr>
+                <w:rFonts w:ascii="Times New Roman" w:cs="Times New Roman" w:eastAsia="Times New Roman" w:hAnsi="Times New Roman"/>
+                <w:sz w:val="20"/>
+                <w:szCs w:val="20"/>
+              </w:rPr>
               <w:t xml:space="preserve">18</w:t>
+            </w:r>
+          </w:p>
+        </w:tc>
+        <w:tc>
+          <w:tcPr>
+            <w:tcW w:type="dxa" w:w="6980"/>
+            <w:tcBorders>
+              <w:top w:val="single" w:color="595959" w:sz="6"/>
+              <w:left w:val="single" w:color="595959" w:sz="6"/>
+              <w:bottom w:val="single" w:color="595959" w:sz="6"/>
+              <w:right w:val="single" w:color="595959" w:sz="6"/>
+            </w:tcBorders>
+            <w:tcMar>
+              <w:top w:type="dxa" w:w="50"/>
+              <w:left w:type="dxa" w:w="90"/>
+              <w:bottom w:type="dxa" w:w="50"/>
+              <w:right w:type="dxa" w:w="90"/>
+            </w:tcMar>
+            <w:vAlign w:val="center"/>
+          </w:tcPr>
+          <w:p>
+            <w:pPr>
+              <w:spacing w:after="0" w:before="0" w:line="252"/>
+            </w:pPr>
+            <w:r>
+              <w:rPr>
+                <w:rFonts w:ascii="Times New Roman" w:cs="Times New Roman" w:eastAsia="Times New Roman" w:hAnsi="Times New Roman"/>
+                <w:sz w:val="20"/>
+                <w:szCs w:val="20"/>
+              </w:rPr>
+              <w:t xml:space="preserve">I can use the system whenever I need it.</w:t>
+            </w:r>
+          </w:p>
+        </w:tc>
+        <w:tc>
+          <w:tcPr>
+            <w:tcW w:type="dxa" w:w="500"/>
+            <w:tcBorders>
+              <w:top w:val="single" w:color="595959" w:sz="6"/>
+              <w:left w:val="single" w:color="595959" w:sz="6"/>
+              <w:bottom w:val="single" w:color="595959" w:sz="6"/>
+              <w:right w:val="single" w:color="595959" w:sz="6"/>
+            </w:tcBorders>
+            <w:tcMar>
+              <w:top w:type="dxa" w:w="50"/>
+              <w:left w:type="dxa" w:w="90"/>
+              <w:bottom w:type="dxa" w:w="50"/>
+              <w:right w:type="dxa" w:w="90"/>
+            </w:tcMar>
+            <w:vAlign w:val="center"/>
+          </w:tcPr>
+          <w:p>
+            <w:pPr>
+              <w:spacing w:after="0" w:before="0" w:line="252"/>
+            </w:pPr>
+            <w:r>
+              <w:rPr>
+                <w:rFonts w:ascii="Times New Roman" w:cs="Times New Roman" w:eastAsia="Times New Roman" w:hAnsi="Times New Roman"/>
+                <w:sz w:val="20"/>
+                <w:szCs w:val="20"/>
+              </w:rPr>
+              <w:t xml:space="preserve"/>
+            </w:r>
+          </w:p>
+        </w:tc>
+        <w:tc>
+          <w:tcPr>
+            <w:tcW w:type="dxa" w:w="500"/>
+            <w:tcBorders>
+              <w:top w:val="single" w:color="595959" w:sz="6"/>
+              <w:left w:val="single" w:color="595959" w:sz="6"/>
+              <w:bottom w:val="single" w:color="595959" w:sz="6"/>
+              <w:right w:val="single" w:color="595959" w:sz="6"/>
+            </w:tcBorders>
+            <w:tcMar>
+              <w:top w:type="dxa" w:w="50"/>
+              <w:left w:type="dxa" w:w="90"/>
+              <w:bottom w:type="dxa" w:w="50"/>
+              <w:right w:type="dxa" w:w="90"/>
+            </w:tcMar>
+            <w:vAlign w:val="center"/>
+          </w:tcPr>
+          <w:p>
+            <w:pPr>
+              <w:spacing w:after="0" w:before="0" w:line="252"/>
+            </w:pPr>
+            <w:r>
+              <w:rPr>
+                <w:rFonts w:ascii="Times New Roman" w:cs="Times New Roman" w:eastAsia="Times New Roman" w:hAnsi="Times New Roman"/>
+                <w:sz w:val="20"/>
+                <w:szCs w:val="20"/>
+              </w:rPr>
+              <w:t xml:space="preserve"/>
+            </w:r>
+          </w:p>
+        </w:tc>
+        <w:tc>
+          <w:tcPr>
+            <w:tcW w:type="dxa" w:w="500"/>
+            <w:tcBorders>
+              <w:top w:val="single" w:color="595959" w:sz="6"/>
+              <w:left w:val="single" w:color="595959" w:sz="6"/>
+              <w:bottom w:val="single" w:color="595959" w:sz="6"/>
+              <w:right w:val="single" w:color="595959" w:sz="6"/>
+            </w:tcBorders>
+            <w:tcMar>
+              <w:top w:type="dxa" w:w="50"/>
+              <w:left w:type="dxa" w:w="90"/>
+              <w:bottom w:type="dxa" w:w="50"/>
+              <w:right w:type="dxa" w:w="90"/>
+            </w:tcMar>
+            <w:vAlign w:val="center"/>
+          </w:tcPr>
+          <w:p>
+            <w:pPr>
+              <w:spacing w:after="0" w:before="0" w:line="252"/>
+            </w:pPr>
+            <w:r>
+              <w:rPr>
+                <w:rFonts w:ascii="Times New Roman" w:cs="Times New Roman" w:eastAsia="Times New Roman" w:hAnsi="Times New Roman"/>
+                <w:sz w:val="20"/>
+                <w:szCs w:val="20"/>
+              </w:rPr>
+              <w:t xml:space="preserve"/>
+            </w:r>
+          </w:p>
+        </w:tc>
+        <w:tc>
+          <w:tcPr>
+            <w:tcW w:type="dxa" w:w="500"/>
+            <w:tcBorders>
+              <w:top w:val="single" w:color="595959" w:sz="6"/>
+              <w:left w:val="single" w:color="595959" w:sz="6"/>
+              <w:bottom w:val="single" w:color="595959" w:sz="6"/>
+              <w:right w:val="single" w:color="595959" w:sz="6"/>
+            </w:tcBorders>
+            <w:tcMar>
+              <w:top w:type="dxa" w:w="50"/>
+              <w:left w:type="dxa" w:w="90"/>
+              <w:bottom w:type="dxa" w:w="50"/>
+              <w:right w:type="dxa" w:w="90"/>
+            </w:tcMar>
+            <w:vAlign w:val="center"/>
+          </w:tcPr>
+          <w:p>
+            <w:pPr>
+              <w:spacing w:after="0" w:before="0" w:line="252"/>
+            </w:pPr>
+            <w:r>
+              <w:rPr>
+                <w:rFonts w:ascii="Times New Roman" w:cs="Times New Roman" w:eastAsia="Times New Roman" w:hAnsi="Times New Roman"/>
+                <w:sz w:val="20"/>
+                <w:szCs w:val="20"/>
+              </w:rPr>
+              <w:t xml:space="preserve"/>
+            </w:r>
+          </w:p>
+        </w:tc>
+        <w:tc>
+          <w:tcPr>
+            <w:tcW w:type="dxa" w:w="500"/>
+            <w:tcBorders>
+              <w:top w:val="single" w:color="595959" w:sz="6"/>
+              <w:left w:val="single" w:color="595959" w:sz="6"/>
+              <w:bottom w:val="single" w:color="595959" w:sz="6"/>
+              <w:right w:val="single" w:color="595959" w:sz="6"/>
+            </w:tcBorders>
+            <w:tcMar>
+              <w:top w:type="dxa" w:w="50"/>
+              <w:left w:type="dxa" w:w="90"/>
+              <w:bottom w:type="dxa" w:w="50"/>
+              <w:right w:type="dxa" w:w="90"/>
+            </w:tcMar>
+            <w:vAlign w:val="center"/>
+          </w:tcPr>
+          <w:p>
+            <w:pPr>
+              <w:spacing w:after="0" w:before="0" w:line="252"/>
+            </w:pPr>
+            <w:r>
+              <w:rPr>
+                <w:rFonts w:ascii="Times New Roman" w:cs="Times New Roman" w:eastAsia="Times New Roman" w:hAnsi="Times New Roman"/>
+                <w:sz w:val="20"/>
+                <w:szCs w:val="20"/>
+              </w:rPr>
+              <w:t xml:space="preserve"/>
+            </w:r>
+          </w:p>
+        </w:tc>
+      </w:tr>
+      <w:tr>
+        <w:trPr>
+          <w:cantSplit/>
+          <w:trHeight w:val="420" w:hRule="atLeast"/>
+        </w:trPr>
+        <w:tc>
+          <w:tcPr>
+            <w:tcW w:type="dxa" w:w="600"/>
+            <w:tcBorders>
+              <w:top w:val="single" w:color="595959" w:sz="6"/>
+              <w:left w:val="single" w:color="595959" w:sz="6"/>
+              <w:bottom w:val="single" w:color="595959" w:sz="6"/>
+              <w:right w:val="single" w:color="595959" w:sz="6"/>
+            </w:tcBorders>
+            <w:tcMar>
+              <w:top w:type="dxa" w:w="50"/>
+              <w:left w:type="dxa" w:w="90"/>
+              <w:bottom w:type="dxa" w:w="50"/>
+              <w:right w:type="dxa" w:w="90"/>
+            </w:tcMar>
+            <w:vAlign w:val="center"/>
+          </w:tcPr>
+          <w:p>
+            <w:pPr>
+              <w:spacing w:after="0" w:before="0" w:line="252"/>
+              <w:jc w:val="center"/>
+            </w:pPr>
+            <w:r>
+              <w:rPr>
+                <w:rFonts w:ascii="Times New Roman" w:cs="Times New Roman" w:eastAsia="Times New Roman" w:hAnsi="Times New Roman"/>
+                <w:sz w:val="20"/>
+                <w:szCs w:val="20"/>
+              </w:rPr>
+              <w:t xml:space="preserve">19</w:t>
             </w:r>
           </w:p>
         </w:tc>

</xml_diff>

<commit_message>
Revise security questionnaire as a close adaptation of published scales
Every item now keeps the sentence and meaning of its source item and
changes only the context to L-SIAMS; the two researcher-made items are
removed. Form A (20 items) adopts the full Trust and Security scale of
Rukhiran et al. (2023) and the full CIA Triad Practices scale of
Phakaedam et al. (2026) with its original confidentiality, integrity
and availability grouping. Form B (19 items) adapts IM-ISMS items and
the Technology scale of Phakaedam et al. Each item stays aligned with
an ISO/IEC 27001:2022 Annex A control. The guide, manuscript revisions
and defense script are updated to match.

Co-Authored-By: Claude Opus 5.5 <noreply@anthropic.com>
Claude-Session: https://claude.ai/code/session_01NeqS41gKi8124JjYBQKeXi
</commit_message>
<xml_diff>
--- a/docs/manuscript/LSIAMS_Form_A_Teachers_and_School_Administrator.docx
+++ b/docs/manuscript/LSIAMS_Form_A_Teachers_and_School_Administrator.docx
@@ -99,7 +99,7 @@
           <w:sz w:val="21"/>
           <w:szCs w:val="21"/>
         </w:rPr>
-        <w:t xml:space="preserve">We are BSIT students of Isabela State University – Echague Campus. Please rate L-SIAMS, the classroom attendance system, based on your own use of it during the evaluation. The statements ask how well the system keeps attendance information private, correct and available when needed. Participation is voluntary, you do not need to write your name, and your answers will be kept confidential under Republic Act No. 10173 (Data Privacy Act of 2012). Your answers will be used only for this academic study.</w:t>
+        <w:t xml:space="preserve">We are BSIT students of Isabela State University – Echague Campus. Please rate L-SIAMS, the classroom attendance system, based on your own use of it during the evaluation. The statements ask about the fingerprint verification and about how attendance information is kept private, correct and available when you use the system. Participation is voluntary, you do not need to write your name, and your answers will be kept confidential under Republic Act No. 10173 (Data Privacy Act of 2012). Your answers will be used only for this academic study.</w:t>
       </w:r>
     </w:p>
     <w:p>
@@ -663,7 +663,7 @@
           <w:sz w:val="20"/>
           <w:szCs w:val="20"/>
         </w:rPr>
-        <w:t xml:space="preserve">The statements below are grouped into the three parts of information security: confidentiality, integrity and availability. Part A is for teachers only.</w:t>
+        <w:t xml:space="preserve">The statements below are grouped into the three parts of information security: confidentiality, integrity and availability. Part A is for teachers only. Parts B to D ask how you keep attendance information private, correct and available when you use L-SIAMS.</w:t>
       </w:r>
     </w:p>
     <w:tbl>
@@ -1053,7 +1053,7 @@
                 <w:sz w:val="20"/>
                 <w:szCs w:val="20"/>
               </w:rPr>
-              <w:t xml:space="preserve">Scanning my fingerprint on the terminal does not feel uncomfortable or intrusive.</w:t>
+              <w:t xml:space="preserve">Verifying my identity with the fingerprint scanner is not physically invasive.</w:t>
             </w:r>
           </w:p>
         </w:tc>
@@ -1277,7 +1277,7 @@
                 <w:sz w:val="20"/>
                 <w:szCs w:val="20"/>
               </w:rPr>
-              <w:t xml:space="preserve">I trust the fingerprint scanner that is used to start my class session.</w:t>
+              <w:t xml:space="preserve">I trust the fingerprint verification of L-SIAMS.</w:t>
             </w:r>
           </w:p>
         </w:tc>
@@ -1501,7 +1501,7 @@
                 <w:sz w:val="20"/>
                 <w:szCs w:val="20"/>
               </w:rPr>
-              <w:t xml:space="preserve">The fingerprint scanner is a reliable way to check who the teacher is.</w:t>
+              <w:t xml:space="preserve">Teacher identification using fingerprint verification is reliable.</w:t>
             </w:r>
           </w:p>
         </w:tc>
@@ -1725,7 +1725,7 @@
                 <w:sz w:val="20"/>
                 <w:szCs w:val="20"/>
               </w:rPr>
-              <w:t xml:space="preserve">The terminal recognizes my fingerprint correctly.</w:t>
+              <w:t xml:space="preserve">The system can identify me correctly.</w:t>
             </w:r>
           </w:p>
         </w:tc>
@@ -1949,7 +1949,7 @@
                 <w:sz w:val="20"/>
                 <w:szCs w:val="20"/>
               </w:rPr>
-              <w:t xml:space="preserve">The fingerprint scanner is accurate.</w:t>
+              <w:t xml:space="preserve">The fingerprint scanner has high recognition accuracy.</w:t>
             </w:r>
           </w:p>
         </w:tc>
@@ -2500,7 +2500,7 @@
                 <w:sz w:val="20"/>
                 <w:szCs w:val="20"/>
               </w:rPr>
-              <w:t xml:space="preserve">The system requires me to use a strong password.</w:t>
+              <w:t xml:space="preserve">I use a complex and unique password for my L-SIAMS account.</w:t>
             </w:r>
           </w:p>
         </w:tc>
@@ -2724,7 +2724,7 @@
                 <w:sz w:val="20"/>
                 <w:szCs w:val="20"/>
               </w:rPr>
-              <w:t xml:space="preserve">The system sends attendance and account information securely (encrypted).</w:t>
+              <w:t xml:space="preserve">I avoid sending attendance and student information through unsecured channels.</w:t>
             </w:r>
           </w:p>
         </w:tc>
@@ -2948,7 +2948,7 @@
                 <w:sz w:val="20"/>
                 <w:szCs w:val="20"/>
               </w:rPr>
-              <w:t xml:space="preserve">No one else, not even the administrator, can see my password.</w:t>
+              <w:t xml:space="preserve">I do not share my L-SIAMS password with others.</w:t>
             </w:r>
           </w:p>
         </w:tc>
@@ -3172,7 +3172,7 @@
                 <w:sz w:val="20"/>
                 <w:szCs w:val="20"/>
               </w:rPr>
-              <w:t xml:space="preserve">A class session can start only after my fingerprint (or my own password) is checked.</w:t>
+              <w:t xml:space="preserve">I use the additional verification step (fingerprint) when L-SIAMS requires it.</w:t>
             </w:r>
           </w:p>
         </w:tc>
@@ -3396,231 +3396,7 @@
                 <w:sz w:val="20"/>
                 <w:szCs w:val="20"/>
               </w:rPr>
-              <w:t xml:space="preserve">The system can be used only inside the school network.</w:t>
-            </w:r>
-          </w:p>
-        </w:tc>
-        <w:tc>
-          <w:tcPr>
-            <w:tcW w:type="dxa" w:w="500"/>
-            <w:tcBorders>
-              <w:top w:val="single" w:color="595959" w:sz="6"/>
-              <w:left w:val="single" w:color="595959" w:sz="6"/>
-              <w:bottom w:val="single" w:color="595959" w:sz="6"/>
-              <w:right w:val="single" w:color="595959" w:sz="6"/>
-            </w:tcBorders>
-            <w:tcMar>
-              <w:top w:type="dxa" w:w="50"/>
-              <w:left w:type="dxa" w:w="90"/>
-              <w:bottom w:type="dxa" w:w="50"/>
-              <w:right w:type="dxa" w:w="90"/>
-            </w:tcMar>
-            <w:vAlign w:val="center"/>
-          </w:tcPr>
-          <w:p>
-            <w:pPr>
-              <w:spacing w:after="0" w:before="0" w:line="252"/>
-            </w:pPr>
-            <w:r>
-              <w:rPr>
-                <w:rFonts w:ascii="Times New Roman" w:cs="Times New Roman" w:eastAsia="Times New Roman" w:hAnsi="Times New Roman"/>
-                <w:sz w:val="20"/>
-                <w:szCs w:val="20"/>
-              </w:rPr>
-              <w:t xml:space="preserve"/>
-            </w:r>
-          </w:p>
-        </w:tc>
-        <w:tc>
-          <w:tcPr>
-            <w:tcW w:type="dxa" w:w="500"/>
-            <w:tcBorders>
-              <w:top w:val="single" w:color="595959" w:sz="6"/>
-              <w:left w:val="single" w:color="595959" w:sz="6"/>
-              <w:bottom w:val="single" w:color="595959" w:sz="6"/>
-              <w:right w:val="single" w:color="595959" w:sz="6"/>
-            </w:tcBorders>
-            <w:tcMar>
-              <w:top w:type="dxa" w:w="50"/>
-              <w:left w:type="dxa" w:w="90"/>
-              <w:bottom w:type="dxa" w:w="50"/>
-              <w:right w:type="dxa" w:w="90"/>
-            </w:tcMar>
-            <w:vAlign w:val="center"/>
-          </w:tcPr>
-          <w:p>
-            <w:pPr>
-              <w:spacing w:after="0" w:before="0" w:line="252"/>
-            </w:pPr>
-            <w:r>
-              <w:rPr>
-                <w:rFonts w:ascii="Times New Roman" w:cs="Times New Roman" w:eastAsia="Times New Roman" w:hAnsi="Times New Roman"/>
-                <w:sz w:val="20"/>
-                <w:szCs w:val="20"/>
-              </w:rPr>
-              <w:t xml:space="preserve"/>
-            </w:r>
-          </w:p>
-        </w:tc>
-        <w:tc>
-          <w:tcPr>
-            <w:tcW w:type="dxa" w:w="500"/>
-            <w:tcBorders>
-              <w:top w:val="single" w:color="595959" w:sz="6"/>
-              <w:left w:val="single" w:color="595959" w:sz="6"/>
-              <w:bottom w:val="single" w:color="595959" w:sz="6"/>
-              <w:right w:val="single" w:color="595959" w:sz="6"/>
-            </w:tcBorders>
-            <w:tcMar>
-              <w:top w:type="dxa" w:w="50"/>
-              <w:left w:type="dxa" w:w="90"/>
-              <w:bottom w:type="dxa" w:w="50"/>
-              <w:right w:type="dxa" w:w="90"/>
-            </w:tcMar>
-            <w:vAlign w:val="center"/>
-          </w:tcPr>
-          <w:p>
-            <w:pPr>
-              <w:spacing w:after="0" w:before="0" w:line="252"/>
-            </w:pPr>
-            <w:r>
-              <w:rPr>
-                <w:rFonts w:ascii="Times New Roman" w:cs="Times New Roman" w:eastAsia="Times New Roman" w:hAnsi="Times New Roman"/>
-                <w:sz w:val="20"/>
-                <w:szCs w:val="20"/>
-              </w:rPr>
-              <w:t xml:space="preserve"/>
-            </w:r>
-          </w:p>
-        </w:tc>
-        <w:tc>
-          <w:tcPr>
-            <w:tcW w:type="dxa" w:w="500"/>
-            <w:tcBorders>
-              <w:top w:val="single" w:color="595959" w:sz="6"/>
-              <w:left w:val="single" w:color="595959" w:sz="6"/>
-              <w:bottom w:val="single" w:color="595959" w:sz="6"/>
-              <w:right w:val="single" w:color="595959" w:sz="6"/>
-            </w:tcBorders>
-            <w:tcMar>
-              <w:top w:type="dxa" w:w="50"/>
-              <w:left w:type="dxa" w:w="90"/>
-              <w:bottom w:type="dxa" w:w="50"/>
-              <w:right w:type="dxa" w:w="90"/>
-            </w:tcMar>
-            <w:vAlign w:val="center"/>
-          </w:tcPr>
-          <w:p>
-            <w:pPr>
-              <w:spacing w:after="0" w:before="0" w:line="252"/>
-            </w:pPr>
-            <w:r>
-              <w:rPr>
-                <w:rFonts w:ascii="Times New Roman" w:cs="Times New Roman" w:eastAsia="Times New Roman" w:hAnsi="Times New Roman"/>
-                <w:sz w:val="20"/>
-                <w:szCs w:val="20"/>
-              </w:rPr>
-              <w:t xml:space="preserve"/>
-            </w:r>
-          </w:p>
-        </w:tc>
-        <w:tc>
-          <w:tcPr>
-            <w:tcW w:type="dxa" w:w="500"/>
-            <w:tcBorders>
-              <w:top w:val="single" w:color="595959" w:sz="6"/>
-              <w:left w:val="single" w:color="595959" w:sz="6"/>
-              <w:bottom w:val="single" w:color="595959" w:sz="6"/>
-              <w:right w:val="single" w:color="595959" w:sz="6"/>
-            </w:tcBorders>
-            <w:tcMar>
-              <w:top w:type="dxa" w:w="50"/>
-              <w:left w:type="dxa" w:w="90"/>
-              <w:bottom w:type="dxa" w:w="50"/>
-              <w:right w:type="dxa" w:w="90"/>
-            </w:tcMar>
-            <w:vAlign w:val="center"/>
-          </w:tcPr>
-          <w:p>
-            <w:pPr>
-              <w:spacing w:after="0" w:before="0" w:line="252"/>
-            </w:pPr>
-            <w:r>
-              <w:rPr>
-                <w:rFonts w:ascii="Times New Roman" w:cs="Times New Roman" w:eastAsia="Times New Roman" w:hAnsi="Times New Roman"/>
-                <w:sz w:val="20"/>
-                <w:szCs w:val="20"/>
-              </w:rPr>
-              <w:t xml:space="preserve"/>
-            </w:r>
-          </w:p>
-        </w:tc>
-      </w:tr>
-      <w:tr>
-        <w:trPr>
-          <w:cantSplit/>
-          <w:trHeight w:val="420" w:hRule="atLeast"/>
-        </w:trPr>
-        <w:tc>
-          <w:tcPr>
-            <w:tcW w:type="dxa" w:w="600"/>
-            <w:tcBorders>
-              <w:top w:val="single" w:color="595959" w:sz="6"/>
-              <w:left w:val="single" w:color="595959" w:sz="6"/>
-              <w:bottom w:val="single" w:color="595959" w:sz="6"/>
-              <w:right w:val="single" w:color="595959" w:sz="6"/>
-            </w:tcBorders>
-            <w:tcMar>
-              <w:top w:type="dxa" w:w="50"/>
-              <w:left w:type="dxa" w:w="90"/>
-              <w:bottom w:type="dxa" w:w="50"/>
-              <w:right w:type="dxa" w:w="90"/>
-            </w:tcMar>
-            <w:vAlign w:val="center"/>
-          </w:tcPr>
-          <w:p>
-            <w:pPr>
-              <w:spacing w:after="0" w:before="0" w:line="252"/>
-              <w:jc w:val="center"/>
-            </w:pPr>
-            <w:r>
-              <w:rPr>
-                <w:rFonts w:ascii="Times New Roman" w:cs="Times New Roman" w:eastAsia="Times New Roman" w:hAnsi="Times New Roman"/>
-                <w:sz w:val="20"/>
-                <w:szCs w:val="20"/>
-              </w:rPr>
-              <w:t xml:space="preserve">11</w:t>
-            </w:r>
-          </w:p>
-        </w:tc>
-        <w:tc>
-          <w:tcPr>
-            <w:tcW w:type="dxa" w:w="6980"/>
-            <w:tcBorders>
-              <w:top w:val="single" w:color="595959" w:sz="6"/>
-              <w:left w:val="single" w:color="595959" w:sz="6"/>
-              <w:bottom w:val="single" w:color="595959" w:sz="6"/>
-              <w:right w:val="single" w:color="595959" w:sz="6"/>
-            </w:tcBorders>
-            <w:tcMar>
-              <w:top w:type="dxa" w:w="50"/>
-              <w:left w:type="dxa" w:w="90"/>
-              <w:bottom w:type="dxa" w:w="50"/>
-              <w:right w:type="dxa" w:w="90"/>
-            </w:tcMar>
-            <w:vAlign w:val="center"/>
-          </w:tcPr>
-          <w:p>
-            <w:pPr>
-              <w:spacing w:after="0" w:before="0" w:line="252"/>
-            </w:pPr>
-            <w:r>
-              <w:rPr>
-                <w:rFonts w:ascii="Times New Roman" w:cs="Times New Roman" w:eastAsia="Times New Roman" w:hAnsi="Times New Roman"/>
-                <w:sz w:val="20"/>
-                <w:szCs w:val="20"/>
-              </w:rPr>
-              <w:t xml:space="preserve">Personal information of students and teachers, including fingerprint data, is protected and shown only to authorized users.</w:t>
+              <w:t xml:space="preserve">I avoid using public Wi-Fi when handling attendance information.</w:t>
             </w:r>
           </w:p>
         </w:tc>
@@ -4140,7 +3916,7 @@
                 <w:sz w:val="20"/>
                 <w:szCs w:val="20"/>
               </w:rPr>
-              <w:t xml:space="preserve">12</w:t>
+              <w:t xml:space="preserve">11</w:t>
             </w:r>
           </w:p>
         </w:tc>
@@ -4171,7 +3947,7 @@
                 <w:sz w:val="20"/>
                 <w:szCs w:val="20"/>
               </w:rPr>
-              <w:t xml:space="preserve">The attendance reports from the system are correct.</w:t>
+              <w:t xml:space="preserve">I verify the accuracy of attendance reports downloaded from L-SIAMS before use.</w:t>
             </w:r>
           </w:p>
         </w:tc>
@@ -4364,7 +4140,7 @@
                 <w:sz w:val="20"/>
                 <w:szCs w:val="20"/>
               </w:rPr>
-              <w:t xml:space="preserve">13</w:t>
+              <w:t xml:space="preserve">12</w:t>
             </w:r>
           </w:p>
         </w:tc>
@@ -4395,7 +4171,7 @@
                 <w:sz w:val="20"/>
                 <w:szCs w:val="20"/>
               </w:rPr>
-              <w:t xml:space="preserve">The system accepts attendance only from registered classroom terminals.</w:t>
+              <w:t xml:space="preserve">I verify that the attendance information I use comes from L-SIAMS.</w:t>
             </w:r>
           </w:p>
         </w:tc>
@@ -4588,7 +4364,7 @@
                 <w:sz w:val="20"/>
                 <w:szCs w:val="20"/>
               </w:rPr>
-              <w:t xml:space="preserve">14</w:t>
+              <w:t xml:space="preserve">13</w:t>
             </w:r>
           </w:p>
         </w:tc>
@@ -4619,7 +4395,7 @@
                 <w:sz w:val="20"/>
                 <w:szCs w:val="20"/>
               </w:rPr>
-              <w:t xml:space="preserve">Only authorized administrators can change the system settings.</w:t>
+              <w:t xml:space="preserve">I avoid installing software from unofficial sources on the computer I use for L-SIAMS.</w:t>
             </w:r>
           </w:p>
         </w:tc>
@@ -4812,7 +4588,7 @@
                 <w:sz w:val="20"/>
                 <w:szCs w:val="20"/>
               </w:rPr>
-              <w:t xml:space="preserve">15</w:t>
+              <w:t xml:space="preserve">14</w:t>
             </w:r>
           </w:p>
         </w:tc>
@@ -4843,7 +4619,7 @@
                 <w:sz w:val="20"/>
                 <w:szCs w:val="20"/>
               </w:rPr>
-              <w:t xml:space="preserve">Attendance records cannot be changed or deleted without permission.</w:t>
+              <w:t xml:space="preserve">I refrain from unauthorized modification or deletion of attendance records.</w:t>
             </w:r>
           </w:p>
         </w:tc>
@@ -5036,7 +4812,7 @@
                 <w:sz w:val="20"/>
                 <w:szCs w:val="20"/>
               </w:rPr>
-              <w:t xml:space="preserve">16</w:t>
+              <w:t xml:space="preserve">15</w:t>
             </w:r>
           </w:p>
         </w:tc>
@@ -5067,7 +4843,7 @@
                 <w:sz w:val="20"/>
                 <w:szCs w:val="20"/>
               </w:rPr>
-              <w:t xml:space="preserve">The system keeps a record of every change made to attendance records.</w:t>
+              <w:t xml:space="preserve">I make sure that changes to attendance records are recorded for transparency.</w:t>
             </w:r>
           </w:p>
         </w:tc>
@@ -5587,7 +5363,7 @@
                 <w:sz w:val="20"/>
                 <w:szCs w:val="20"/>
               </w:rPr>
-              <w:t xml:space="preserve">17</w:t>
+              <w:t xml:space="preserve">16</w:t>
             </w:r>
           </w:p>
         </w:tc>
@@ -5618,7 +5394,7 @@
                 <w:sz w:val="20"/>
                 <w:szCs w:val="20"/>
               </w:rPr>
-              <w:t xml:space="preserve">Attendance recorded while the network is down is saved once the connection returns.</w:t>
+              <w:t xml:space="preserve">I regularly back up the attendance reports I download from L-SIAMS.</w:t>
             </w:r>
           </w:p>
         </w:tc>
@@ -5811,7 +5587,7 @@
                 <w:sz w:val="20"/>
                 <w:szCs w:val="20"/>
               </w:rPr>
-              <w:t xml:space="preserve">18</w:t>
+              <w:t xml:space="preserve">17</w:t>
             </w:r>
           </w:p>
         </w:tc>
@@ -5842,7 +5618,7 @@
                 <w:sz w:val="20"/>
                 <w:szCs w:val="20"/>
               </w:rPr>
-              <w:t xml:space="preserve">I can use the system whenever I need it.</w:t>
+              <w:t xml:space="preserve">I know how attendance data is recovered if loss occurs.</w:t>
             </w:r>
           </w:p>
         </w:tc>
@@ -6035,6 +5811,230 @@
                 <w:sz w:val="20"/>
                 <w:szCs w:val="20"/>
               </w:rPr>
+              <w:t xml:space="preserve">18</w:t>
+            </w:r>
+          </w:p>
+        </w:tc>
+        <w:tc>
+          <w:tcPr>
+            <w:tcW w:type="dxa" w:w="6980"/>
+            <w:tcBorders>
+              <w:top w:val="single" w:color="595959" w:sz="6"/>
+              <w:left w:val="single" w:color="595959" w:sz="6"/>
+              <w:bottom w:val="single" w:color="595959" w:sz="6"/>
+              <w:right w:val="single" w:color="595959" w:sz="6"/>
+            </w:tcBorders>
+            <w:tcMar>
+              <w:top w:type="dxa" w:w="50"/>
+              <w:left w:type="dxa" w:w="90"/>
+              <w:bottom w:type="dxa" w:w="50"/>
+              <w:right w:type="dxa" w:w="90"/>
+            </w:tcMar>
+            <w:vAlign w:val="center"/>
+          </w:tcPr>
+          <w:p>
+            <w:pPr>
+              <w:spacing w:after="0" w:before="0" w:line="252"/>
+            </w:pPr>
+            <w:r>
+              <w:rPr>
+                <w:rFonts w:ascii="Times New Roman" w:cs="Times New Roman" w:eastAsia="Times New Roman" w:hAnsi="Times New Roman"/>
+                <w:sz w:val="20"/>
+                <w:szCs w:val="20"/>
+              </w:rPr>
+              <w:t xml:space="preserve">I can access L-SIAMS when needed.</w:t>
+            </w:r>
+          </w:p>
+        </w:tc>
+        <w:tc>
+          <w:tcPr>
+            <w:tcW w:type="dxa" w:w="500"/>
+            <w:tcBorders>
+              <w:top w:val="single" w:color="595959" w:sz="6"/>
+              <w:left w:val="single" w:color="595959" w:sz="6"/>
+              <w:bottom w:val="single" w:color="595959" w:sz="6"/>
+              <w:right w:val="single" w:color="595959" w:sz="6"/>
+            </w:tcBorders>
+            <w:tcMar>
+              <w:top w:type="dxa" w:w="50"/>
+              <w:left w:type="dxa" w:w="90"/>
+              <w:bottom w:type="dxa" w:w="50"/>
+              <w:right w:type="dxa" w:w="90"/>
+            </w:tcMar>
+            <w:vAlign w:val="center"/>
+          </w:tcPr>
+          <w:p>
+            <w:pPr>
+              <w:spacing w:after="0" w:before="0" w:line="252"/>
+            </w:pPr>
+            <w:r>
+              <w:rPr>
+                <w:rFonts w:ascii="Times New Roman" w:cs="Times New Roman" w:eastAsia="Times New Roman" w:hAnsi="Times New Roman"/>
+                <w:sz w:val="20"/>
+                <w:szCs w:val="20"/>
+              </w:rPr>
+              <w:t xml:space="preserve"/>
+            </w:r>
+          </w:p>
+        </w:tc>
+        <w:tc>
+          <w:tcPr>
+            <w:tcW w:type="dxa" w:w="500"/>
+            <w:tcBorders>
+              <w:top w:val="single" w:color="595959" w:sz="6"/>
+              <w:left w:val="single" w:color="595959" w:sz="6"/>
+              <w:bottom w:val="single" w:color="595959" w:sz="6"/>
+              <w:right w:val="single" w:color="595959" w:sz="6"/>
+            </w:tcBorders>
+            <w:tcMar>
+              <w:top w:type="dxa" w:w="50"/>
+              <w:left w:type="dxa" w:w="90"/>
+              <w:bottom w:type="dxa" w:w="50"/>
+              <w:right w:type="dxa" w:w="90"/>
+            </w:tcMar>
+            <w:vAlign w:val="center"/>
+          </w:tcPr>
+          <w:p>
+            <w:pPr>
+              <w:spacing w:after="0" w:before="0" w:line="252"/>
+            </w:pPr>
+            <w:r>
+              <w:rPr>
+                <w:rFonts w:ascii="Times New Roman" w:cs="Times New Roman" w:eastAsia="Times New Roman" w:hAnsi="Times New Roman"/>
+                <w:sz w:val="20"/>
+                <w:szCs w:val="20"/>
+              </w:rPr>
+              <w:t xml:space="preserve"/>
+            </w:r>
+          </w:p>
+        </w:tc>
+        <w:tc>
+          <w:tcPr>
+            <w:tcW w:type="dxa" w:w="500"/>
+            <w:tcBorders>
+              <w:top w:val="single" w:color="595959" w:sz="6"/>
+              <w:left w:val="single" w:color="595959" w:sz="6"/>
+              <w:bottom w:val="single" w:color="595959" w:sz="6"/>
+              <w:right w:val="single" w:color="595959" w:sz="6"/>
+            </w:tcBorders>
+            <w:tcMar>
+              <w:top w:type="dxa" w:w="50"/>
+              <w:left w:type="dxa" w:w="90"/>
+              <w:bottom w:type="dxa" w:w="50"/>
+              <w:right w:type="dxa" w:w="90"/>
+            </w:tcMar>
+            <w:vAlign w:val="center"/>
+          </w:tcPr>
+          <w:p>
+            <w:pPr>
+              <w:spacing w:after="0" w:before="0" w:line="252"/>
+            </w:pPr>
+            <w:r>
+              <w:rPr>
+                <w:rFonts w:ascii="Times New Roman" w:cs="Times New Roman" w:eastAsia="Times New Roman" w:hAnsi="Times New Roman"/>
+                <w:sz w:val="20"/>
+                <w:szCs w:val="20"/>
+              </w:rPr>
+              <w:t xml:space="preserve"/>
+            </w:r>
+          </w:p>
+        </w:tc>
+        <w:tc>
+          <w:tcPr>
+            <w:tcW w:type="dxa" w:w="500"/>
+            <w:tcBorders>
+              <w:top w:val="single" w:color="595959" w:sz="6"/>
+              <w:left w:val="single" w:color="595959" w:sz="6"/>
+              <w:bottom w:val="single" w:color="595959" w:sz="6"/>
+              <w:right w:val="single" w:color="595959" w:sz="6"/>
+            </w:tcBorders>
+            <w:tcMar>
+              <w:top w:type="dxa" w:w="50"/>
+              <w:left w:type="dxa" w:w="90"/>
+              <w:bottom w:type="dxa" w:w="50"/>
+              <w:right w:type="dxa" w:w="90"/>
+            </w:tcMar>
+            <w:vAlign w:val="center"/>
+          </w:tcPr>
+          <w:p>
+            <w:pPr>
+              <w:spacing w:after="0" w:before="0" w:line="252"/>
+            </w:pPr>
+            <w:r>
+              <w:rPr>
+                <w:rFonts w:ascii="Times New Roman" w:cs="Times New Roman" w:eastAsia="Times New Roman" w:hAnsi="Times New Roman"/>
+                <w:sz w:val="20"/>
+                <w:szCs w:val="20"/>
+              </w:rPr>
+              <w:t xml:space="preserve"/>
+            </w:r>
+          </w:p>
+        </w:tc>
+        <w:tc>
+          <w:tcPr>
+            <w:tcW w:type="dxa" w:w="500"/>
+            <w:tcBorders>
+              <w:top w:val="single" w:color="595959" w:sz="6"/>
+              <w:left w:val="single" w:color="595959" w:sz="6"/>
+              <w:bottom w:val="single" w:color="595959" w:sz="6"/>
+              <w:right w:val="single" w:color="595959" w:sz="6"/>
+            </w:tcBorders>
+            <w:tcMar>
+              <w:top w:type="dxa" w:w="50"/>
+              <w:left w:type="dxa" w:w="90"/>
+              <w:bottom w:type="dxa" w:w="50"/>
+              <w:right w:type="dxa" w:w="90"/>
+            </w:tcMar>
+            <w:vAlign w:val="center"/>
+          </w:tcPr>
+          <w:p>
+            <w:pPr>
+              <w:spacing w:after="0" w:before="0" w:line="252"/>
+            </w:pPr>
+            <w:r>
+              <w:rPr>
+                <w:rFonts w:ascii="Times New Roman" w:cs="Times New Roman" w:eastAsia="Times New Roman" w:hAnsi="Times New Roman"/>
+                <w:sz w:val="20"/>
+                <w:szCs w:val="20"/>
+              </w:rPr>
+              <w:t xml:space="preserve"/>
+            </w:r>
+          </w:p>
+        </w:tc>
+      </w:tr>
+      <w:tr>
+        <w:trPr>
+          <w:cantSplit/>
+          <w:trHeight w:val="420" w:hRule="atLeast"/>
+        </w:trPr>
+        <w:tc>
+          <w:tcPr>
+            <w:tcW w:type="dxa" w:w="600"/>
+            <w:tcBorders>
+              <w:top w:val="single" w:color="595959" w:sz="6"/>
+              <w:left w:val="single" w:color="595959" w:sz="6"/>
+              <w:bottom w:val="single" w:color="595959" w:sz="6"/>
+              <w:right w:val="single" w:color="595959" w:sz="6"/>
+            </w:tcBorders>
+            <w:tcMar>
+              <w:top w:type="dxa" w:w="50"/>
+              <w:left w:type="dxa" w:w="90"/>
+              <w:bottom w:type="dxa" w:w="50"/>
+              <w:right w:type="dxa" w:w="90"/>
+            </w:tcMar>
+            <w:vAlign w:val="center"/>
+          </w:tcPr>
+          <w:p>
+            <w:pPr>
+              <w:spacing w:after="0" w:before="0" w:line="252"/>
+              <w:jc w:val="center"/>
+            </w:pPr>
+            <w:r>
+              <w:rPr>
+                <w:rFonts w:ascii="Times New Roman" w:cs="Times New Roman" w:eastAsia="Times New Roman" w:hAnsi="Times New Roman"/>
+                <w:sz w:val="20"/>
+                <w:szCs w:val="20"/>
+              </w:rPr>
               <w:t xml:space="preserve">19</w:t>
             </w:r>
           </w:p>
@@ -6066,7 +6066,231 @@
                 <w:sz w:val="20"/>
                 <w:szCs w:val="20"/>
               </w:rPr>
-              <w:t xml:space="preserve">The terminal can still record attendance when the network is down.</w:t>
+              <w:t xml:space="preserve">I avoid actions that may disrupt L-SIAMS (for example, unplugging the classroom terminal).</w:t>
+            </w:r>
+          </w:p>
+        </w:tc>
+        <w:tc>
+          <w:tcPr>
+            <w:tcW w:type="dxa" w:w="500"/>
+            <w:tcBorders>
+              <w:top w:val="single" w:color="595959" w:sz="6"/>
+              <w:left w:val="single" w:color="595959" w:sz="6"/>
+              <w:bottom w:val="single" w:color="595959" w:sz="6"/>
+              <w:right w:val="single" w:color="595959" w:sz="6"/>
+            </w:tcBorders>
+            <w:tcMar>
+              <w:top w:type="dxa" w:w="50"/>
+              <w:left w:type="dxa" w:w="90"/>
+              <w:bottom w:type="dxa" w:w="50"/>
+              <w:right w:type="dxa" w:w="90"/>
+            </w:tcMar>
+            <w:vAlign w:val="center"/>
+          </w:tcPr>
+          <w:p>
+            <w:pPr>
+              <w:spacing w:after="0" w:before="0" w:line="252"/>
+            </w:pPr>
+            <w:r>
+              <w:rPr>
+                <w:rFonts w:ascii="Times New Roman" w:cs="Times New Roman" w:eastAsia="Times New Roman" w:hAnsi="Times New Roman"/>
+                <w:sz w:val="20"/>
+                <w:szCs w:val="20"/>
+              </w:rPr>
+              <w:t xml:space="preserve"/>
+            </w:r>
+          </w:p>
+        </w:tc>
+        <w:tc>
+          <w:tcPr>
+            <w:tcW w:type="dxa" w:w="500"/>
+            <w:tcBorders>
+              <w:top w:val="single" w:color="595959" w:sz="6"/>
+              <w:left w:val="single" w:color="595959" w:sz="6"/>
+              <w:bottom w:val="single" w:color="595959" w:sz="6"/>
+              <w:right w:val="single" w:color="595959" w:sz="6"/>
+            </w:tcBorders>
+            <w:tcMar>
+              <w:top w:type="dxa" w:w="50"/>
+              <w:left w:type="dxa" w:w="90"/>
+              <w:bottom w:type="dxa" w:w="50"/>
+              <w:right w:type="dxa" w:w="90"/>
+            </w:tcMar>
+            <w:vAlign w:val="center"/>
+          </w:tcPr>
+          <w:p>
+            <w:pPr>
+              <w:spacing w:after="0" w:before="0" w:line="252"/>
+            </w:pPr>
+            <w:r>
+              <w:rPr>
+                <w:rFonts w:ascii="Times New Roman" w:cs="Times New Roman" w:eastAsia="Times New Roman" w:hAnsi="Times New Roman"/>
+                <w:sz w:val="20"/>
+                <w:szCs w:val="20"/>
+              </w:rPr>
+              <w:t xml:space="preserve"/>
+            </w:r>
+          </w:p>
+        </w:tc>
+        <w:tc>
+          <w:tcPr>
+            <w:tcW w:type="dxa" w:w="500"/>
+            <w:tcBorders>
+              <w:top w:val="single" w:color="595959" w:sz="6"/>
+              <w:left w:val="single" w:color="595959" w:sz="6"/>
+              <w:bottom w:val="single" w:color="595959" w:sz="6"/>
+              <w:right w:val="single" w:color="595959" w:sz="6"/>
+            </w:tcBorders>
+            <w:tcMar>
+              <w:top w:type="dxa" w:w="50"/>
+              <w:left w:type="dxa" w:w="90"/>
+              <w:bottom w:type="dxa" w:w="50"/>
+              <w:right w:type="dxa" w:w="90"/>
+            </w:tcMar>
+            <w:vAlign w:val="center"/>
+          </w:tcPr>
+          <w:p>
+            <w:pPr>
+              <w:spacing w:after="0" w:before="0" w:line="252"/>
+            </w:pPr>
+            <w:r>
+              <w:rPr>
+                <w:rFonts w:ascii="Times New Roman" w:cs="Times New Roman" w:eastAsia="Times New Roman" w:hAnsi="Times New Roman"/>
+                <w:sz w:val="20"/>
+                <w:szCs w:val="20"/>
+              </w:rPr>
+              <w:t xml:space="preserve"/>
+            </w:r>
+          </w:p>
+        </w:tc>
+        <w:tc>
+          <w:tcPr>
+            <w:tcW w:type="dxa" w:w="500"/>
+            <w:tcBorders>
+              <w:top w:val="single" w:color="595959" w:sz="6"/>
+              <w:left w:val="single" w:color="595959" w:sz="6"/>
+              <w:bottom w:val="single" w:color="595959" w:sz="6"/>
+              <w:right w:val="single" w:color="595959" w:sz="6"/>
+            </w:tcBorders>
+            <w:tcMar>
+              <w:top w:type="dxa" w:w="50"/>
+              <w:left w:type="dxa" w:w="90"/>
+              <w:bottom w:type="dxa" w:w="50"/>
+              <w:right w:type="dxa" w:w="90"/>
+            </w:tcMar>
+            <w:vAlign w:val="center"/>
+          </w:tcPr>
+          <w:p>
+            <w:pPr>
+              <w:spacing w:after="0" w:before="0" w:line="252"/>
+            </w:pPr>
+            <w:r>
+              <w:rPr>
+                <w:rFonts w:ascii="Times New Roman" w:cs="Times New Roman" w:eastAsia="Times New Roman" w:hAnsi="Times New Roman"/>
+                <w:sz w:val="20"/>
+                <w:szCs w:val="20"/>
+              </w:rPr>
+              <w:t xml:space="preserve"/>
+            </w:r>
+          </w:p>
+        </w:tc>
+        <w:tc>
+          <w:tcPr>
+            <w:tcW w:type="dxa" w:w="500"/>
+            <w:tcBorders>
+              <w:top w:val="single" w:color="595959" w:sz="6"/>
+              <w:left w:val="single" w:color="595959" w:sz="6"/>
+              <w:bottom w:val="single" w:color="595959" w:sz="6"/>
+              <w:right w:val="single" w:color="595959" w:sz="6"/>
+            </w:tcBorders>
+            <w:tcMar>
+              <w:top w:type="dxa" w:w="50"/>
+              <w:left w:type="dxa" w:w="90"/>
+              <w:bottom w:type="dxa" w:w="50"/>
+              <w:right w:type="dxa" w:w="90"/>
+            </w:tcMar>
+            <w:vAlign w:val="center"/>
+          </w:tcPr>
+          <w:p>
+            <w:pPr>
+              <w:spacing w:after="0" w:before="0" w:line="252"/>
+            </w:pPr>
+            <w:r>
+              <w:rPr>
+                <w:rFonts w:ascii="Times New Roman" w:cs="Times New Roman" w:eastAsia="Times New Roman" w:hAnsi="Times New Roman"/>
+                <w:sz w:val="20"/>
+                <w:szCs w:val="20"/>
+              </w:rPr>
+              <w:t xml:space="preserve"/>
+            </w:r>
+          </w:p>
+        </w:tc>
+      </w:tr>
+      <w:tr>
+        <w:trPr>
+          <w:cantSplit/>
+          <w:trHeight w:val="420" w:hRule="atLeast"/>
+        </w:trPr>
+        <w:tc>
+          <w:tcPr>
+            <w:tcW w:type="dxa" w:w="600"/>
+            <w:tcBorders>
+              <w:top w:val="single" w:color="595959" w:sz="6"/>
+              <w:left w:val="single" w:color="595959" w:sz="6"/>
+              <w:bottom w:val="single" w:color="595959" w:sz="6"/>
+              <w:right w:val="single" w:color="595959" w:sz="6"/>
+            </w:tcBorders>
+            <w:tcMar>
+              <w:top w:type="dxa" w:w="50"/>
+              <w:left w:type="dxa" w:w="90"/>
+              <w:bottom w:type="dxa" w:w="50"/>
+              <w:right w:type="dxa" w:w="90"/>
+            </w:tcMar>
+            <w:vAlign w:val="center"/>
+          </w:tcPr>
+          <w:p>
+            <w:pPr>
+              <w:spacing w:after="0" w:before="0" w:line="252"/>
+              <w:jc w:val="center"/>
+            </w:pPr>
+            <w:r>
+              <w:rPr>
+                <w:rFonts w:ascii="Times New Roman" w:cs="Times New Roman" w:eastAsia="Times New Roman" w:hAnsi="Times New Roman"/>
+                <w:sz w:val="20"/>
+                <w:szCs w:val="20"/>
+              </w:rPr>
+              <w:t xml:space="preserve">20</w:t>
+            </w:r>
+          </w:p>
+        </w:tc>
+        <w:tc>
+          <w:tcPr>
+            <w:tcW w:type="dxa" w:w="6980"/>
+            <w:tcBorders>
+              <w:top w:val="single" w:color="595959" w:sz="6"/>
+              <w:left w:val="single" w:color="595959" w:sz="6"/>
+              <w:bottom w:val="single" w:color="595959" w:sz="6"/>
+              <w:right w:val="single" w:color="595959" w:sz="6"/>
+            </w:tcBorders>
+            <w:tcMar>
+              <w:top w:type="dxa" w:w="50"/>
+              <w:left w:type="dxa" w:w="90"/>
+              <w:bottom w:type="dxa" w:w="50"/>
+              <w:right w:type="dxa" w:w="90"/>
+            </w:tcMar>
+            <w:vAlign w:val="center"/>
+          </w:tcPr>
+          <w:p>
+            <w:pPr>
+              <w:spacing w:after="0" w:before="0" w:line="252"/>
+            </w:pPr>
+            <w:r>
+              <w:rPr>
+                <w:rFonts w:ascii="Times New Roman" w:cs="Times New Roman" w:eastAsia="Times New Roman" w:hAnsi="Times New Roman"/>
+                <w:sz w:val="20"/>
+                <w:szCs w:val="20"/>
+              </w:rPr>
+              <w:t xml:space="preserve">I receive timely notifications when L-SIAMS or a classroom terminal is down.</w:t>
             </w:r>
           </w:p>
         </w:tc>

</xml_diff>

<commit_message>
Adopt questionnaire items word for word from published scales
Replace the adapted items with items copied exactly from the three
source instruments; no item is reworded or researcher-made. Items whose
original wording does not fit L-SIAMS (face recognition, university
systems, named third-party tools) are left out and listed with the
reason. Form A has 16 items (Rukhiran TS1, TS4, TS5 and 13 Phakaedam
CIA items in the authors' grouping); Form B has 14 IM-ISMS items. Each
item stays grouped by CIA and aligned with an ISO/IEC 27001:2022 Annex A
control. The guide, manuscript revisions and defense script match.

Co-Authored-By: Claude Opus 5.5 <noreply@anthropic.com>
Claude-Session: https://claude.ai/code/session_01NeqS41gKi8124JjYBQKeXi
</commit_message>
<xml_diff>
--- a/docs/manuscript/LSIAMS_Form_A_Teachers_and_School_Administrator.docx
+++ b/docs/manuscript/LSIAMS_Form_A_Teachers_and_School_Administrator.docx
@@ -99,7 +99,7 @@
           <w:sz w:val="21"/>
           <w:szCs w:val="21"/>
         </w:rPr>
-        <w:t xml:space="preserve">We are BSIT students of Isabela State University – Echague Campus. Please rate L-SIAMS, the classroom attendance system, based on your own use of it during the evaluation. The statements ask about the fingerprint verification and about how attendance information is kept private, correct and available when you use the system. Participation is voluntary, you do not need to write your name, and your answers will be kept confidential under Republic Act No. 10173 (Data Privacy Act of 2012). Your answers will be used only for this academic study.</w:t>
+        <w:t xml:space="preserve">We are BSIT students of Isabela State University – Echague Campus. Please rate L-SIAMS, the classroom attendance system, based on your own use of it during the evaluation. The statements ask about the fingerprint verification and about how you keep information private, correct and available when you use the system. Participation is voluntary, you do not need to write your name, and your answers will be kept confidential under Republic Act No. 10173 (Data Privacy Act of 2012). Your answers will be used only for this academic study.</w:t>
       </w:r>
     </w:p>
     <w:p>
@@ -663,7 +663,7 @@
           <w:sz w:val="20"/>
           <w:szCs w:val="20"/>
         </w:rPr>
-        <w:t xml:space="preserve">The statements below are grouped into the three parts of information security: confidentiality, integrity and availability. Part A is for teachers only. Parts B to D ask how you keep attendance information private, correct and available when you use L-SIAMS.</w:t>
+        <w:t xml:space="preserve">The statements are grouped into the three parts of information security: confidentiality, integrity and availability. Part A is for teachers only; in Part A, “the system” and “the biometric recognition” mean the fingerprint verification of L-SIAMS. Parts B to D ask about your own practices when you use L-SIAMS.</w:t>
       </w:r>
     </w:p>
     <w:tbl>
@@ -1053,7 +1053,7 @@
                 <w:sz w:val="20"/>
                 <w:szCs w:val="20"/>
               </w:rPr>
-              <w:t xml:space="preserve">Verifying my identity with the fingerprint scanner is not physically invasive.</w:t>
+              <w:t xml:space="preserve">The biometric recognition would be physically invasive.</w:t>
             </w:r>
           </w:p>
         </w:tc>
@@ -1277,7 +1277,7 @@
                 <w:sz w:val="20"/>
                 <w:szCs w:val="20"/>
               </w:rPr>
-              <w:t xml:space="preserve">I trust the fingerprint verification of L-SIAMS.</w:t>
+              <w:t xml:space="preserve">The system can identify me correctly.</w:t>
             </w:r>
           </w:p>
         </w:tc>
@@ -1501,455 +1501,7 @@
                 <w:sz w:val="20"/>
                 <w:szCs w:val="20"/>
               </w:rPr>
-              <w:t xml:space="preserve">Teacher identification using fingerprint verification is reliable.</w:t>
-            </w:r>
-          </w:p>
-        </w:tc>
-        <w:tc>
-          <w:tcPr>
-            <w:tcW w:type="dxa" w:w="500"/>
-            <w:tcBorders>
-              <w:top w:val="single" w:color="595959" w:sz="6"/>
-              <w:left w:val="single" w:color="595959" w:sz="6"/>
-              <w:bottom w:val="single" w:color="595959" w:sz="6"/>
-              <w:right w:val="single" w:color="595959" w:sz="6"/>
-            </w:tcBorders>
-            <w:tcMar>
-              <w:top w:type="dxa" w:w="50"/>
-              <w:left w:type="dxa" w:w="90"/>
-              <w:bottom w:type="dxa" w:w="50"/>
-              <w:right w:type="dxa" w:w="90"/>
-            </w:tcMar>
-            <w:vAlign w:val="center"/>
-          </w:tcPr>
-          <w:p>
-            <w:pPr>
-              <w:spacing w:after="0" w:before="0" w:line="252"/>
-            </w:pPr>
-            <w:r>
-              <w:rPr>
-                <w:rFonts w:ascii="Times New Roman" w:cs="Times New Roman" w:eastAsia="Times New Roman" w:hAnsi="Times New Roman"/>
-                <w:sz w:val="20"/>
-                <w:szCs w:val="20"/>
-              </w:rPr>
-              <w:t xml:space="preserve"/>
-            </w:r>
-          </w:p>
-        </w:tc>
-        <w:tc>
-          <w:tcPr>
-            <w:tcW w:type="dxa" w:w="500"/>
-            <w:tcBorders>
-              <w:top w:val="single" w:color="595959" w:sz="6"/>
-              <w:left w:val="single" w:color="595959" w:sz="6"/>
-              <w:bottom w:val="single" w:color="595959" w:sz="6"/>
-              <w:right w:val="single" w:color="595959" w:sz="6"/>
-            </w:tcBorders>
-            <w:tcMar>
-              <w:top w:type="dxa" w:w="50"/>
-              <w:left w:type="dxa" w:w="90"/>
-              <w:bottom w:type="dxa" w:w="50"/>
-              <w:right w:type="dxa" w:w="90"/>
-            </w:tcMar>
-            <w:vAlign w:val="center"/>
-          </w:tcPr>
-          <w:p>
-            <w:pPr>
-              <w:spacing w:after="0" w:before="0" w:line="252"/>
-            </w:pPr>
-            <w:r>
-              <w:rPr>
-                <w:rFonts w:ascii="Times New Roman" w:cs="Times New Roman" w:eastAsia="Times New Roman" w:hAnsi="Times New Roman"/>
-                <w:sz w:val="20"/>
-                <w:szCs w:val="20"/>
-              </w:rPr>
-              <w:t xml:space="preserve"/>
-            </w:r>
-          </w:p>
-        </w:tc>
-        <w:tc>
-          <w:tcPr>
-            <w:tcW w:type="dxa" w:w="500"/>
-            <w:tcBorders>
-              <w:top w:val="single" w:color="595959" w:sz="6"/>
-              <w:left w:val="single" w:color="595959" w:sz="6"/>
-              <w:bottom w:val="single" w:color="595959" w:sz="6"/>
-              <w:right w:val="single" w:color="595959" w:sz="6"/>
-            </w:tcBorders>
-            <w:tcMar>
-              <w:top w:type="dxa" w:w="50"/>
-              <w:left w:type="dxa" w:w="90"/>
-              <w:bottom w:type="dxa" w:w="50"/>
-              <w:right w:type="dxa" w:w="90"/>
-            </w:tcMar>
-            <w:vAlign w:val="center"/>
-          </w:tcPr>
-          <w:p>
-            <w:pPr>
-              <w:spacing w:after="0" w:before="0" w:line="252"/>
-            </w:pPr>
-            <w:r>
-              <w:rPr>
-                <w:rFonts w:ascii="Times New Roman" w:cs="Times New Roman" w:eastAsia="Times New Roman" w:hAnsi="Times New Roman"/>
-                <w:sz w:val="20"/>
-                <w:szCs w:val="20"/>
-              </w:rPr>
-              <w:t xml:space="preserve"/>
-            </w:r>
-          </w:p>
-        </w:tc>
-        <w:tc>
-          <w:tcPr>
-            <w:tcW w:type="dxa" w:w="500"/>
-            <w:tcBorders>
-              <w:top w:val="single" w:color="595959" w:sz="6"/>
-              <w:left w:val="single" w:color="595959" w:sz="6"/>
-              <w:bottom w:val="single" w:color="595959" w:sz="6"/>
-              <w:right w:val="single" w:color="595959" w:sz="6"/>
-            </w:tcBorders>
-            <w:tcMar>
-              <w:top w:type="dxa" w:w="50"/>
-              <w:left w:type="dxa" w:w="90"/>
-              <w:bottom w:type="dxa" w:w="50"/>
-              <w:right w:type="dxa" w:w="90"/>
-            </w:tcMar>
-            <w:vAlign w:val="center"/>
-          </w:tcPr>
-          <w:p>
-            <w:pPr>
-              <w:spacing w:after="0" w:before="0" w:line="252"/>
-            </w:pPr>
-            <w:r>
-              <w:rPr>
-                <w:rFonts w:ascii="Times New Roman" w:cs="Times New Roman" w:eastAsia="Times New Roman" w:hAnsi="Times New Roman"/>
-                <w:sz w:val="20"/>
-                <w:szCs w:val="20"/>
-              </w:rPr>
-              <w:t xml:space="preserve"/>
-            </w:r>
-          </w:p>
-        </w:tc>
-        <w:tc>
-          <w:tcPr>
-            <w:tcW w:type="dxa" w:w="500"/>
-            <w:tcBorders>
-              <w:top w:val="single" w:color="595959" w:sz="6"/>
-              <w:left w:val="single" w:color="595959" w:sz="6"/>
-              <w:bottom w:val="single" w:color="595959" w:sz="6"/>
-              <w:right w:val="single" w:color="595959" w:sz="6"/>
-            </w:tcBorders>
-            <w:tcMar>
-              <w:top w:type="dxa" w:w="50"/>
-              <w:left w:type="dxa" w:w="90"/>
-              <w:bottom w:type="dxa" w:w="50"/>
-              <w:right w:type="dxa" w:w="90"/>
-            </w:tcMar>
-            <w:vAlign w:val="center"/>
-          </w:tcPr>
-          <w:p>
-            <w:pPr>
-              <w:spacing w:after="0" w:before="0" w:line="252"/>
-            </w:pPr>
-            <w:r>
-              <w:rPr>
-                <w:rFonts w:ascii="Times New Roman" w:cs="Times New Roman" w:eastAsia="Times New Roman" w:hAnsi="Times New Roman"/>
-                <w:sz w:val="20"/>
-                <w:szCs w:val="20"/>
-              </w:rPr>
-              <w:t xml:space="preserve"/>
-            </w:r>
-          </w:p>
-        </w:tc>
-      </w:tr>
-      <w:tr>
-        <w:trPr>
-          <w:cantSplit/>
-          <w:trHeight w:val="420" w:hRule="atLeast"/>
-        </w:trPr>
-        <w:tc>
-          <w:tcPr>
-            <w:tcW w:type="dxa" w:w="600"/>
-            <w:tcBorders>
-              <w:top w:val="single" w:color="595959" w:sz="6"/>
-              <w:left w:val="single" w:color="595959" w:sz="6"/>
-              <w:bottom w:val="single" w:color="595959" w:sz="6"/>
-              <w:right w:val="single" w:color="595959" w:sz="6"/>
-            </w:tcBorders>
-            <w:tcMar>
-              <w:top w:type="dxa" w:w="50"/>
-              <w:left w:type="dxa" w:w="90"/>
-              <w:bottom w:type="dxa" w:w="50"/>
-              <w:right w:type="dxa" w:w="90"/>
-            </w:tcMar>
-            <w:vAlign w:val="center"/>
-          </w:tcPr>
-          <w:p>
-            <w:pPr>
-              <w:spacing w:after="0" w:before="0" w:line="252"/>
-              <w:jc w:val="center"/>
-            </w:pPr>
-            <w:r>
-              <w:rPr>
-                <w:rFonts w:ascii="Times New Roman" w:cs="Times New Roman" w:eastAsia="Times New Roman" w:hAnsi="Times New Roman"/>
-                <w:sz w:val="20"/>
-                <w:szCs w:val="20"/>
-              </w:rPr>
-              <w:t xml:space="preserve">4</w:t>
-            </w:r>
-          </w:p>
-        </w:tc>
-        <w:tc>
-          <w:tcPr>
-            <w:tcW w:type="dxa" w:w="6980"/>
-            <w:tcBorders>
-              <w:top w:val="single" w:color="595959" w:sz="6"/>
-              <w:left w:val="single" w:color="595959" w:sz="6"/>
-              <w:bottom w:val="single" w:color="595959" w:sz="6"/>
-              <w:right w:val="single" w:color="595959" w:sz="6"/>
-            </w:tcBorders>
-            <w:tcMar>
-              <w:top w:type="dxa" w:w="50"/>
-              <w:left w:type="dxa" w:w="90"/>
-              <w:bottom w:type="dxa" w:w="50"/>
-              <w:right w:type="dxa" w:w="90"/>
-            </w:tcMar>
-            <w:vAlign w:val="center"/>
-          </w:tcPr>
-          <w:p>
-            <w:pPr>
-              <w:spacing w:after="0" w:before="0" w:line="252"/>
-            </w:pPr>
-            <w:r>
-              <w:rPr>
-                <w:rFonts w:ascii="Times New Roman" w:cs="Times New Roman" w:eastAsia="Times New Roman" w:hAnsi="Times New Roman"/>
-                <w:sz w:val="20"/>
-                <w:szCs w:val="20"/>
-              </w:rPr>
-              <w:t xml:space="preserve">The system can identify me correctly.</w:t>
-            </w:r>
-          </w:p>
-        </w:tc>
-        <w:tc>
-          <w:tcPr>
-            <w:tcW w:type="dxa" w:w="500"/>
-            <w:tcBorders>
-              <w:top w:val="single" w:color="595959" w:sz="6"/>
-              <w:left w:val="single" w:color="595959" w:sz="6"/>
-              <w:bottom w:val="single" w:color="595959" w:sz="6"/>
-              <w:right w:val="single" w:color="595959" w:sz="6"/>
-            </w:tcBorders>
-            <w:tcMar>
-              <w:top w:type="dxa" w:w="50"/>
-              <w:left w:type="dxa" w:w="90"/>
-              <w:bottom w:type="dxa" w:w="50"/>
-              <w:right w:type="dxa" w:w="90"/>
-            </w:tcMar>
-            <w:vAlign w:val="center"/>
-          </w:tcPr>
-          <w:p>
-            <w:pPr>
-              <w:spacing w:after="0" w:before="0" w:line="252"/>
-            </w:pPr>
-            <w:r>
-              <w:rPr>
-                <w:rFonts w:ascii="Times New Roman" w:cs="Times New Roman" w:eastAsia="Times New Roman" w:hAnsi="Times New Roman"/>
-                <w:sz w:val="20"/>
-                <w:szCs w:val="20"/>
-              </w:rPr>
-              <w:t xml:space="preserve"/>
-            </w:r>
-          </w:p>
-        </w:tc>
-        <w:tc>
-          <w:tcPr>
-            <w:tcW w:type="dxa" w:w="500"/>
-            <w:tcBorders>
-              <w:top w:val="single" w:color="595959" w:sz="6"/>
-              <w:left w:val="single" w:color="595959" w:sz="6"/>
-              <w:bottom w:val="single" w:color="595959" w:sz="6"/>
-              <w:right w:val="single" w:color="595959" w:sz="6"/>
-            </w:tcBorders>
-            <w:tcMar>
-              <w:top w:type="dxa" w:w="50"/>
-              <w:left w:type="dxa" w:w="90"/>
-              <w:bottom w:type="dxa" w:w="50"/>
-              <w:right w:type="dxa" w:w="90"/>
-            </w:tcMar>
-            <w:vAlign w:val="center"/>
-          </w:tcPr>
-          <w:p>
-            <w:pPr>
-              <w:spacing w:after="0" w:before="0" w:line="252"/>
-            </w:pPr>
-            <w:r>
-              <w:rPr>
-                <w:rFonts w:ascii="Times New Roman" w:cs="Times New Roman" w:eastAsia="Times New Roman" w:hAnsi="Times New Roman"/>
-                <w:sz w:val="20"/>
-                <w:szCs w:val="20"/>
-              </w:rPr>
-              <w:t xml:space="preserve"/>
-            </w:r>
-          </w:p>
-        </w:tc>
-        <w:tc>
-          <w:tcPr>
-            <w:tcW w:type="dxa" w:w="500"/>
-            <w:tcBorders>
-              <w:top w:val="single" w:color="595959" w:sz="6"/>
-              <w:left w:val="single" w:color="595959" w:sz="6"/>
-              <w:bottom w:val="single" w:color="595959" w:sz="6"/>
-              <w:right w:val="single" w:color="595959" w:sz="6"/>
-            </w:tcBorders>
-            <w:tcMar>
-              <w:top w:type="dxa" w:w="50"/>
-              <w:left w:type="dxa" w:w="90"/>
-              <w:bottom w:type="dxa" w:w="50"/>
-              <w:right w:type="dxa" w:w="90"/>
-            </w:tcMar>
-            <w:vAlign w:val="center"/>
-          </w:tcPr>
-          <w:p>
-            <w:pPr>
-              <w:spacing w:after="0" w:before="0" w:line="252"/>
-            </w:pPr>
-            <w:r>
-              <w:rPr>
-                <w:rFonts w:ascii="Times New Roman" w:cs="Times New Roman" w:eastAsia="Times New Roman" w:hAnsi="Times New Roman"/>
-                <w:sz w:val="20"/>
-                <w:szCs w:val="20"/>
-              </w:rPr>
-              <w:t xml:space="preserve"/>
-            </w:r>
-          </w:p>
-        </w:tc>
-        <w:tc>
-          <w:tcPr>
-            <w:tcW w:type="dxa" w:w="500"/>
-            <w:tcBorders>
-              <w:top w:val="single" w:color="595959" w:sz="6"/>
-              <w:left w:val="single" w:color="595959" w:sz="6"/>
-              <w:bottom w:val="single" w:color="595959" w:sz="6"/>
-              <w:right w:val="single" w:color="595959" w:sz="6"/>
-            </w:tcBorders>
-            <w:tcMar>
-              <w:top w:type="dxa" w:w="50"/>
-              <w:left w:type="dxa" w:w="90"/>
-              <w:bottom w:type="dxa" w:w="50"/>
-              <w:right w:type="dxa" w:w="90"/>
-            </w:tcMar>
-            <w:vAlign w:val="center"/>
-          </w:tcPr>
-          <w:p>
-            <w:pPr>
-              <w:spacing w:after="0" w:before="0" w:line="252"/>
-            </w:pPr>
-            <w:r>
-              <w:rPr>
-                <w:rFonts w:ascii="Times New Roman" w:cs="Times New Roman" w:eastAsia="Times New Roman" w:hAnsi="Times New Roman"/>
-                <w:sz w:val="20"/>
-                <w:szCs w:val="20"/>
-              </w:rPr>
-              <w:t xml:space="preserve"/>
-            </w:r>
-          </w:p>
-        </w:tc>
-        <w:tc>
-          <w:tcPr>
-            <w:tcW w:type="dxa" w:w="500"/>
-            <w:tcBorders>
-              <w:top w:val="single" w:color="595959" w:sz="6"/>
-              <w:left w:val="single" w:color="595959" w:sz="6"/>
-              <w:bottom w:val="single" w:color="595959" w:sz="6"/>
-              <w:right w:val="single" w:color="595959" w:sz="6"/>
-            </w:tcBorders>
-            <w:tcMar>
-              <w:top w:type="dxa" w:w="50"/>
-              <w:left w:type="dxa" w:w="90"/>
-              <w:bottom w:type="dxa" w:w="50"/>
-              <w:right w:type="dxa" w:w="90"/>
-            </w:tcMar>
-            <w:vAlign w:val="center"/>
-          </w:tcPr>
-          <w:p>
-            <w:pPr>
-              <w:spacing w:after="0" w:before="0" w:line="252"/>
-            </w:pPr>
-            <w:r>
-              <w:rPr>
-                <w:rFonts w:ascii="Times New Roman" w:cs="Times New Roman" w:eastAsia="Times New Roman" w:hAnsi="Times New Roman"/>
-                <w:sz w:val="20"/>
-                <w:szCs w:val="20"/>
-              </w:rPr>
-              <w:t xml:space="preserve"/>
-            </w:r>
-          </w:p>
-        </w:tc>
-      </w:tr>
-      <w:tr>
-        <w:trPr>
-          <w:cantSplit/>
-          <w:trHeight w:val="420" w:hRule="atLeast"/>
-        </w:trPr>
-        <w:tc>
-          <w:tcPr>
-            <w:tcW w:type="dxa" w:w="600"/>
-            <w:tcBorders>
-              <w:top w:val="single" w:color="595959" w:sz="6"/>
-              <w:left w:val="single" w:color="595959" w:sz="6"/>
-              <w:bottom w:val="single" w:color="595959" w:sz="6"/>
-              <w:right w:val="single" w:color="595959" w:sz="6"/>
-            </w:tcBorders>
-            <w:tcMar>
-              <w:top w:type="dxa" w:w="50"/>
-              <w:left w:type="dxa" w:w="90"/>
-              <w:bottom w:type="dxa" w:w="50"/>
-              <w:right w:type="dxa" w:w="90"/>
-            </w:tcMar>
-            <w:vAlign w:val="center"/>
-          </w:tcPr>
-          <w:p>
-            <w:pPr>
-              <w:spacing w:after="0" w:before="0" w:line="252"/>
-              <w:jc w:val="center"/>
-            </w:pPr>
-            <w:r>
-              <w:rPr>
-                <w:rFonts w:ascii="Times New Roman" w:cs="Times New Roman" w:eastAsia="Times New Roman" w:hAnsi="Times New Roman"/>
-                <w:sz w:val="20"/>
-                <w:szCs w:val="20"/>
-              </w:rPr>
-              <w:t xml:space="preserve">5</w:t>
-            </w:r>
-          </w:p>
-        </w:tc>
-        <w:tc>
-          <w:tcPr>
-            <w:tcW w:type="dxa" w:w="6980"/>
-            <w:tcBorders>
-              <w:top w:val="single" w:color="595959" w:sz="6"/>
-              <w:left w:val="single" w:color="595959" w:sz="6"/>
-              <w:bottom w:val="single" w:color="595959" w:sz="6"/>
-              <w:right w:val="single" w:color="595959" w:sz="6"/>
-            </w:tcBorders>
-            <w:tcMar>
-              <w:top w:type="dxa" w:w="50"/>
-              <w:left w:type="dxa" w:w="90"/>
-              <w:bottom w:type="dxa" w:w="50"/>
-              <w:right w:type="dxa" w:w="90"/>
-            </w:tcMar>
-            <w:vAlign w:val="center"/>
-          </w:tcPr>
-          <w:p>
-            <w:pPr>
-              <w:spacing w:after="0" w:before="0" w:line="252"/>
-            </w:pPr>
-            <w:r>
-              <w:rPr>
-                <w:rFonts w:ascii="Times New Roman" w:cs="Times New Roman" w:eastAsia="Times New Roman" w:hAnsi="Times New Roman"/>
-                <w:sz w:val="20"/>
-                <w:szCs w:val="20"/>
-              </w:rPr>
-              <w:t xml:space="preserve">The fingerprint scanner has high recognition accuracy.</w:t>
+              <w:t xml:space="preserve">The system has high recognition accuracy.</w:t>
             </w:r>
           </w:p>
         </w:tc>
@@ -2469,7 +2021,7 @@
                 <w:sz w:val="20"/>
                 <w:szCs w:val="20"/>
               </w:rPr>
-              <w:t xml:space="preserve">6</w:t>
+              <w:t xml:space="preserve">4</w:t>
             </w:r>
           </w:p>
         </w:tc>
@@ -2500,7 +2052,7 @@
                 <w:sz w:val="20"/>
                 <w:szCs w:val="20"/>
               </w:rPr>
-              <w:t xml:space="preserve">I use a complex and unique password for my L-SIAMS account.</w:t>
+              <w:t xml:space="preserve">I use complex and unique passwords for important accounts.</w:t>
             </w:r>
           </w:p>
         </w:tc>
@@ -2693,7 +2245,7 @@
                 <w:sz w:val="20"/>
                 <w:szCs w:val="20"/>
               </w:rPr>
-              <w:t xml:space="preserve">7</w:t>
+              <w:t xml:space="preserve">5</w:t>
             </w:r>
           </w:p>
         </w:tc>
@@ -2724,7 +2276,7 @@
                 <w:sz w:val="20"/>
                 <w:szCs w:val="20"/>
               </w:rPr>
-              <w:t xml:space="preserve">I avoid sending attendance and student information through unsecured channels.</w:t>
+              <w:t xml:space="preserve">I avoid sending sensitive information through unsecured channels.</w:t>
             </w:r>
           </w:p>
         </w:tc>
@@ -2917,7 +2469,7 @@
                 <w:sz w:val="20"/>
                 <w:szCs w:val="20"/>
               </w:rPr>
-              <w:t xml:space="preserve">8</w:t>
+              <w:t xml:space="preserve">6</w:t>
             </w:r>
           </w:p>
         </w:tc>
@@ -2948,7 +2500,7 @@
                 <w:sz w:val="20"/>
                 <w:szCs w:val="20"/>
               </w:rPr>
-              <w:t xml:space="preserve">I do not share my L-SIAMS password with others.</w:t>
+              <w:t xml:space="preserve">I do not share my personal passwords with others.</w:t>
             </w:r>
           </w:p>
         </w:tc>
@@ -3141,7 +2693,7 @@
                 <w:sz w:val="20"/>
                 <w:szCs w:val="20"/>
               </w:rPr>
-              <w:t xml:space="preserve">9</w:t>
+              <w:t xml:space="preserve">7</w:t>
             </w:r>
           </w:p>
         </w:tc>
@@ -3172,7 +2724,7 @@
                 <w:sz w:val="20"/>
                 <w:szCs w:val="20"/>
               </w:rPr>
-              <w:t xml:space="preserve">I use the additional verification step (fingerprint) when L-SIAMS requires it.</w:t>
+              <w:t xml:space="preserve">I enable multi-factor authentication for supported accounts.</w:t>
             </w:r>
           </w:p>
         </w:tc>
@@ -3365,7 +2917,7 @@
                 <w:sz w:val="20"/>
                 <w:szCs w:val="20"/>
               </w:rPr>
-              <w:t xml:space="preserve">10</w:t>
+              <w:t xml:space="preserve">8</w:t>
             </w:r>
           </w:p>
         </w:tc>
@@ -3396,7 +2948,7 @@
                 <w:sz w:val="20"/>
                 <w:szCs w:val="20"/>
               </w:rPr>
-              <w:t xml:space="preserve">I avoid using public Wi-Fi when handling attendance information.</w:t>
+              <w:t xml:space="preserve">I avoid using public Wi-Fi when handling sensitive information.</w:t>
             </w:r>
           </w:p>
         </w:tc>
@@ -3916,7 +3468,7 @@
                 <w:sz w:val="20"/>
                 <w:szCs w:val="20"/>
               </w:rPr>
-              <w:t xml:space="preserve">11</w:t>
+              <w:t xml:space="preserve">9</w:t>
             </w:r>
           </w:p>
         </w:tc>
@@ -3947,7 +3499,7 @@
                 <w:sz w:val="20"/>
                 <w:szCs w:val="20"/>
               </w:rPr>
-              <w:t xml:space="preserve">I verify the accuracy of attendance reports downloaded from L-SIAMS before use.</w:t>
+              <w:t xml:space="preserve">I verify the accuracy of downloaded files before use.</w:t>
             </w:r>
           </w:p>
         </w:tc>
@@ -4140,7 +3692,7 @@
                 <w:sz w:val="20"/>
                 <w:szCs w:val="20"/>
               </w:rPr>
-              <w:t xml:space="preserve">12</w:t>
+              <w:t xml:space="preserve">10</w:t>
             </w:r>
           </w:p>
         </w:tc>
@@ -4171,7 +3723,7 @@
                 <w:sz w:val="20"/>
                 <w:szCs w:val="20"/>
               </w:rPr>
-              <w:t xml:space="preserve">I verify that the attendance information I use comes from L-SIAMS.</w:t>
+              <w:t xml:space="preserve">I verify the credibility of electronic information sources.</w:t>
             </w:r>
           </w:p>
         </w:tc>
@@ -4364,7 +3916,7 @@
                 <w:sz w:val="20"/>
                 <w:szCs w:val="20"/>
               </w:rPr>
-              <w:t xml:space="preserve">13</w:t>
+              <w:t xml:space="preserve">11</w:t>
             </w:r>
           </w:p>
         </w:tc>
@@ -4395,7 +3947,7 @@
                 <w:sz w:val="20"/>
                 <w:szCs w:val="20"/>
               </w:rPr>
-              <w:t xml:space="preserve">I avoid installing software from unofficial sources on the computer I use for L-SIAMS.</w:t>
+              <w:t xml:space="preserve">I avoid installing software from unofficial sources.</w:t>
             </w:r>
           </w:p>
         </w:tc>
@@ -4588,7 +4140,7 @@
                 <w:sz w:val="20"/>
                 <w:szCs w:val="20"/>
               </w:rPr>
-              <w:t xml:space="preserve">14</w:t>
+              <w:t xml:space="preserve">12</w:t>
             </w:r>
           </w:p>
         </w:tc>
@@ -4619,7 +4171,7 @@
                 <w:sz w:val="20"/>
                 <w:szCs w:val="20"/>
               </w:rPr>
-              <w:t xml:space="preserve">I refrain from unauthorized modification or deletion of attendance records.</w:t>
+              <w:t xml:space="preserve">I refrain from unauthorized modification or deletion of data.</w:t>
             </w:r>
           </w:p>
         </w:tc>
@@ -4812,7 +4364,7 @@
                 <w:sz w:val="20"/>
                 <w:szCs w:val="20"/>
               </w:rPr>
-              <w:t xml:space="preserve">15</w:t>
+              <w:t xml:space="preserve">13</w:t>
             </w:r>
           </w:p>
         </w:tc>
@@ -4843,7 +4395,7 @@
                 <w:sz w:val="20"/>
                 <w:szCs w:val="20"/>
               </w:rPr>
-              <w:t xml:space="preserve">I make sure that changes to attendance records are recorded for transparency.</w:t>
+              <w:t xml:space="preserve">I maintain records of file or data changes for transparency.</w:t>
             </w:r>
           </w:p>
         </w:tc>
@@ -5363,7 +4915,7 @@
                 <w:sz w:val="20"/>
                 <w:szCs w:val="20"/>
               </w:rPr>
-              <w:t xml:space="preserve">16</w:t>
+              <w:t xml:space="preserve">14</w:t>
             </w:r>
           </w:p>
         </w:tc>
@@ -5394,7 +4946,7 @@
                 <w:sz w:val="20"/>
                 <w:szCs w:val="20"/>
               </w:rPr>
-              <w:t xml:space="preserve">I regularly back up the attendance reports I download from L-SIAMS.</w:t>
+              <w:t xml:space="preserve">I regularly back up important data.</w:t>
             </w:r>
           </w:p>
         </w:tc>
@@ -5587,7 +5139,7 @@
                 <w:sz w:val="20"/>
                 <w:szCs w:val="20"/>
               </w:rPr>
-              <w:t xml:space="preserve">17</w:t>
+              <w:t xml:space="preserve">15</w:t>
             </w:r>
           </w:p>
         </w:tc>
@@ -5618,7 +5170,7 @@
                 <w:sz w:val="20"/>
                 <w:szCs w:val="20"/>
               </w:rPr>
-              <w:t xml:space="preserve">I know how attendance data is recovered if loss occurs.</w:t>
+              <w:t xml:space="preserve">I know how to recover data if loss occurs.</w:t>
             </w:r>
           </w:p>
         </w:tc>
@@ -5811,7 +5363,7 @@
                 <w:sz w:val="20"/>
                 <w:szCs w:val="20"/>
               </w:rPr>
-              <w:t xml:space="preserve">18</w:t>
+              <w:t xml:space="preserve">16</w:t>
             </w:r>
           </w:p>
         </w:tc>
@@ -5842,455 +5394,7 @@
                 <w:sz w:val="20"/>
                 <w:szCs w:val="20"/>
               </w:rPr>
-              <w:t xml:space="preserve">I can access L-SIAMS when needed.</w:t>
-            </w:r>
-          </w:p>
-        </w:tc>
-        <w:tc>
-          <w:tcPr>
-            <w:tcW w:type="dxa" w:w="500"/>
-            <w:tcBorders>
-              <w:top w:val="single" w:color="595959" w:sz="6"/>
-              <w:left w:val="single" w:color="595959" w:sz="6"/>
-              <w:bottom w:val="single" w:color="595959" w:sz="6"/>
-              <w:right w:val="single" w:color="595959" w:sz="6"/>
-            </w:tcBorders>
-            <w:tcMar>
-              <w:top w:type="dxa" w:w="50"/>
-              <w:left w:type="dxa" w:w="90"/>
-              <w:bottom w:type="dxa" w:w="50"/>
-              <w:right w:type="dxa" w:w="90"/>
-            </w:tcMar>
-            <w:vAlign w:val="center"/>
-          </w:tcPr>
-          <w:p>
-            <w:pPr>
-              <w:spacing w:after="0" w:before="0" w:line="252"/>
-            </w:pPr>
-            <w:r>
-              <w:rPr>
-                <w:rFonts w:ascii="Times New Roman" w:cs="Times New Roman" w:eastAsia="Times New Roman" w:hAnsi="Times New Roman"/>
-                <w:sz w:val="20"/>
-                <w:szCs w:val="20"/>
-              </w:rPr>
-              <w:t xml:space="preserve"/>
-            </w:r>
-          </w:p>
-        </w:tc>
-        <w:tc>
-          <w:tcPr>
-            <w:tcW w:type="dxa" w:w="500"/>
-            <w:tcBorders>
-              <w:top w:val="single" w:color="595959" w:sz="6"/>
-              <w:left w:val="single" w:color="595959" w:sz="6"/>
-              <w:bottom w:val="single" w:color="595959" w:sz="6"/>
-              <w:right w:val="single" w:color="595959" w:sz="6"/>
-            </w:tcBorders>
-            <w:tcMar>
-              <w:top w:type="dxa" w:w="50"/>
-              <w:left w:type="dxa" w:w="90"/>
-              <w:bottom w:type="dxa" w:w="50"/>
-              <w:right w:type="dxa" w:w="90"/>
-            </w:tcMar>
-            <w:vAlign w:val="center"/>
-          </w:tcPr>
-          <w:p>
-            <w:pPr>
-              <w:spacing w:after="0" w:before="0" w:line="252"/>
-            </w:pPr>
-            <w:r>
-              <w:rPr>
-                <w:rFonts w:ascii="Times New Roman" w:cs="Times New Roman" w:eastAsia="Times New Roman" w:hAnsi="Times New Roman"/>
-                <w:sz w:val="20"/>
-                <w:szCs w:val="20"/>
-              </w:rPr>
-              <w:t xml:space="preserve"/>
-            </w:r>
-          </w:p>
-        </w:tc>
-        <w:tc>
-          <w:tcPr>
-            <w:tcW w:type="dxa" w:w="500"/>
-            <w:tcBorders>
-              <w:top w:val="single" w:color="595959" w:sz="6"/>
-              <w:left w:val="single" w:color="595959" w:sz="6"/>
-              <w:bottom w:val="single" w:color="595959" w:sz="6"/>
-              <w:right w:val="single" w:color="595959" w:sz="6"/>
-            </w:tcBorders>
-            <w:tcMar>
-              <w:top w:type="dxa" w:w="50"/>
-              <w:left w:type="dxa" w:w="90"/>
-              <w:bottom w:type="dxa" w:w="50"/>
-              <w:right w:type="dxa" w:w="90"/>
-            </w:tcMar>
-            <w:vAlign w:val="center"/>
-          </w:tcPr>
-          <w:p>
-            <w:pPr>
-              <w:spacing w:after="0" w:before="0" w:line="252"/>
-            </w:pPr>
-            <w:r>
-              <w:rPr>
-                <w:rFonts w:ascii="Times New Roman" w:cs="Times New Roman" w:eastAsia="Times New Roman" w:hAnsi="Times New Roman"/>
-                <w:sz w:val="20"/>
-                <w:szCs w:val="20"/>
-              </w:rPr>
-              <w:t xml:space="preserve"/>
-            </w:r>
-          </w:p>
-        </w:tc>
-        <w:tc>
-          <w:tcPr>
-            <w:tcW w:type="dxa" w:w="500"/>
-            <w:tcBorders>
-              <w:top w:val="single" w:color="595959" w:sz="6"/>
-              <w:left w:val="single" w:color="595959" w:sz="6"/>
-              <w:bottom w:val="single" w:color="595959" w:sz="6"/>
-              <w:right w:val="single" w:color="595959" w:sz="6"/>
-            </w:tcBorders>
-            <w:tcMar>
-              <w:top w:type="dxa" w:w="50"/>
-              <w:left w:type="dxa" w:w="90"/>
-              <w:bottom w:type="dxa" w:w="50"/>
-              <w:right w:type="dxa" w:w="90"/>
-            </w:tcMar>
-            <w:vAlign w:val="center"/>
-          </w:tcPr>
-          <w:p>
-            <w:pPr>
-              <w:spacing w:after="0" w:before="0" w:line="252"/>
-            </w:pPr>
-            <w:r>
-              <w:rPr>
-                <w:rFonts w:ascii="Times New Roman" w:cs="Times New Roman" w:eastAsia="Times New Roman" w:hAnsi="Times New Roman"/>
-                <w:sz w:val="20"/>
-                <w:szCs w:val="20"/>
-              </w:rPr>
-              <w:t xml:space="preserve"/>
-            </w:r>
-          </w:p>
-        </w:tc>
-        <w:tc>
-          <w:tcPr>
-            <w:tcW w:type="dxa" w:w="500"/>
-            <w:tcBorders>
-              <w:top w:val="single" w:color="595959" w:sz="6"/>
-              <w:left w:val="single" w:color="595959" w:sz="6"/>
-              <w:bottom w:val="single" w:color="595959" w:sz="6"/>
-              <w:right w:val="single" w:color="595959" w:sz="6"/>
-            </w:tcBorders>
-            <w:tcMar>
-              <w:top w:type="dxa" w:w="50"/>
-              <w:left w:type="dxa" w:w="90"/>
-              <w:bottom w:type="dxa" w:w="50"/>
-              <w:right w:type="dxa" w:w="90"/>
-            </w:tcMar>
-            <w:vAlign w:val="center"/>
-          </w:tcPr>
-          <w:p>
-            <w:pPr>
-              <w:spacing w:after="0" w:before="0" w:line="252"/>
-            </w:pPr>
-            <w:r>
-              <w:rPr>
-                <w:rFonts w:ascii="Times New Roman" w:cs="Times New Roman" w:eastAsia="Times New Roman" w:hAnsi="Times New Roman"/>
-                <w:sz w:val="20"/>
-                <w:szCs w:val="20"/>
-              </w:rPr>
-              <w:t xml:space="preserve"/>
-            </w:r>
-          </w:p>
-        </w:tc>
-      </w:tr>
-      <w:tr>
-        <w:trPr>
-          <w:cantSplit/>
-          <w:trHeight w:val="420" w:hRule="atLeast"/>
-        </w:trPr>
-        <w:tc>
-          <w:tcPr>
-            <w:tcW w:type="dxa" w:w="600"/>
-            <w:tcBorders>
-              <w:top w:val="single" w:color="595959" w:sz="6"/>
-              <w:left w:val="single" w:color="595959" w:sz="6"/>
-              <w:bottom w:val="single" w:color="595959" w:sz="6"/>
-              <w:right w:val="single" w:color="595959" w:sz="6"/>
-            </w:tcBorders>
-            <w:tcMar>
-              <w:top w:type="dxa" w:w="50"/>
-              <w:left w:type="dxa" w:w="90"/>
-              <w:bottom w:type="dxa" w:w="50"/>
-              <w:right w:type="dxa" w:w="90"/>
-            </w:tcMar>
-            <w:vAlign w:val="center"/>
-          </w:tcPr>
-          <w:p>
-            <w:pPr>
-              <w:spacing w:after="0" w:before="0" w:line="252"/>
-              <w:jc w:val="center"/>
-            </w:pPr>
-            <w:r>
-              <w:rPr>
-                <w:rFonts w:ascii="Times New Roman" w:cs="Times New Roman" w:eastAsia="Times New Roman" w:hAnsi="Times New Roman"/>
-                <w:sz w:val="20"/>
-                <w:szCs w:val="20"/>
-              </w:rPr>
-              <w:t xml:space="preserve">19</w:t>
-            </w:r>
-          </w:p>
-        </w:tc>
-        <w:tc>
-          <w:tcPr>
-            <w:tcW w:type="dxa" w:w="6980"/>
-            <w:tcBorders>
-              <w:top w:val="single" w:color="595959" w:sz="6"/>
-              <w:left w:val="single" w:color="595959" w:sz="6"/>
-              <w:bottom w:val="single" w:color="595959" w:sz="6"/>
-              <w:right w:val="single" w:color="595959" w:sz="6"/>
-            </w:tcBorders>
-            <w:tcMar>
-              <w:top w:type="dxa" w:w="50"/>
-              <w:left w:type="dxa" w:w="90"/>
-              <w:bottom w:type="dxa" w:w="50"/>
-              <w:right w:type="dxa" w:w="90"/>
-            </w:tcMar>
-            <w:vAlign w:val="center"/>
-          </w:tcPr>
-          <w:p>
-            <w:pPr>
-              <w:spacing w:after="0" w:before="0" w:line="252"/>
-            </w:pPr>
-            <w:r>
-              <w:rPr>
-                <w:rFonts w:ascii="Times New Roman" w:cs="Times New Roman" w:eastAsia="Times New Roman" w:hAnsi="Times New Roman"/>
-                <w:sz w:val="20"/>
-                <w:szCs w:val="20"/>
-              </w:rPr>
-              <w:t xml:space="preserve">I avoid actions that may disrupt L-SIAMS (for example, unplugging the classroom terminal).</w:t>
-            </w:r>
-          </w:p>
-        </w:tc>
-        <w:tc>
-          <w:tcPr>
-            <w:tcW w:type="dxa" w:w="500"/>
-            <w:tcBorders>
-              <w:top w:val="single" w:color="595959" w:sz="6"/>
-              <w:left w:val="single" w:color="595959" w:sz="6"/>
-              <w:bottom w:val="single" w:color="595959" w:sz="6"/>
-              <w:right w:val="single" w:color="595959" w:sz="6"/>
-            </w:tcBorders>
-            <w:tcMar>
-              <w:top w:type="dxa" w:w="50"/>
-              <w:left w:type="dxa" w:w="90"/>
-              <w:bottom w:type="dxa" w:w="50"/>
-              <w:right w:type="dxa" w:w="90"/>
-            </w:tcMar>
-            <w:vAlign w:val="center"/>
-          </w:tcPr>
-          <w:p>
-            <w:pPr>
-              <w:spacing w:after="0" w:before="0" w:line="252"/>
-            </w:pPr>
-            <w:r>
-              <w:rPr>
-                <w:rFonts w:ascii="Times New Roman" w:cs="Times New Roman" w:eastAsia="Times New Roman" w:hAnsi="Times New Roman"/>
-                <w:sz w:val="20"/>
-                <w:szCs w:val="20"/>
-              </w:rPr>
-              <w:t xml:space="preserve"/>
-            </w:r>
-          </w:p>
-        </w:tc>
-        <w:tc>
-          <w:tcPr>
-            <w:tcW w:type="dxa" w:w="500"/>
-            <w:tcBorders>
-              <w:top w:val="single" w:color="595959" w:sz="6"/>
-              <w:left w:val="single" w:color="595959" w:sz="6"/>
-              <w:bottom w:val="single" w:color="595959" w:sz="6"/>
-              <w:right w:val="single" w:color="595959" w:sz="6"/>
-            </w:tcBorders>
-            <w:tcMar>
-              <w:top w:type="dxa" w:w="50"/>
-              <w:left w:type="dxa" w:w="90"/>
-              <w:bottom w:type="dxa" w:w="50"/>
-              <w:right w:type="dxa" w:w="90"/>
-            </w:tcMar>
-            <w:vAlign w:val="center"/>
-          </w:tcPr>
-          <w:p>
-            <w:pPr>
-              <w:spacing w:after="0" w:before="0" w:line="252"/>
-            </w:pPr>
-            <w:r>
-              <w:rPr>
-                <w:rFonts w:ascii="Times New Roman" w:cs="Times New Roman" w:eastAsia="Times New Roman" w:hAnsi="Times New Roman"/>
-                <w:sz w:val="20"/>
-                <w:szCs w:val="20"/>
-              </w:rPr>
-              <w:t xml:space="preserve"/>
-            </w:r>
-          </w:p>
-        </w:tc>
-        <w:tc>
-          <w:tcPr>
-            <w:tcW w:type="dxa" w:w="500"/>
-            <w:tcBorders>
-              <w:top w:val="single" w:color="595959" w:sz="6"/>
-              <w:left w:val="single" w:color="595959" w:sz="6"/>
-              <w:bottom w:val="single" w:color="595959" w:sz="6"/>
-              <w:right w:val="single" w:color="595959" w:sz="6"/>
-            </w:tcBorders>
-            <w:tcMar>
-              <w:top w:type="dxa" w:w="50"/>
-              <w:left w:type="dxa" w:w="90"/>
-              <w:bottom w:type="dxa" w:w="50"/>
-              <w:right w:type="dxa" w:w="90"/>
-            </w:tcMar>
-            <w:vAlign w:val="center"/>
-          </w:tcPr>
-          <w:p>
-            <w:pPr>
-              <w:spacing w:after="0" w:before="0" w:line="252"/>
-            </w:pPr>
-            <w:r>
-              <w:rPr>
-                <w:rFonts w:ascii="Times New Roman" w:cs="Times New Roman" w:eastAsia="Times New Roman" w:hAnsi="Times New Roman"/>
-                <w:sz w:val="20"/>
-                <w:szCs w:val="20"/>
-              </w:rPr>
-              <w:t xml:space="preserve"/>
-            </w:r>
-          </w:p>
-        </w:tc>
-        <w:tc>
-          <w:tcPr>
-            <w:tcW w:type="dxa" w:w="500"/>
-            <w:tcBorders>
-              <w:top w:val="single" w:color="595959" w:sz="6"/>
-              <w:left w:val="single" w:color="595959" w:sz="6"/>
-              <w:bottom w:val="single" w:color="595959" w:sz="6"/>
-              <w:right w:val="single" w:color="595959" w:sz="6"/>
-            </w:tcBorders>
-            <w:tcMar>
-              <w:top w:type="dxa" w:w="50"/>
-              <w:left w:type="dxa" w:w="90"/>
-              <w:bottom w:type="dxa" w:w="50"/>
-              <w:right w:type="dxa" w:w="90"/>
-            </w:tcMar>
-            <w:vAlign w:val="center"/>
-          </w:tcPr>
-          <w:p>
-            <w:pPr>
-              <w:spacing w:after="0" w:before="0" w:line="252"/>
-            </w:pPr>
-            <w:r>
-              <w:rPr>
-                <w:rFonts w:ascii="Times New Roman" w:cs="Times New Roman" w:eastAsia="Times New Roman" w:hAnsi="Times New Roman"/>
-                <w:sz w:val="20"/>
-                <w:szCs w:val="20"/>
-              </w:rPr>
-              <w:t xml:space="preserve"/>
-            </w:r>
-          </w:p>
-        </w:tc>
-        <w:tc>
-          <w:tcPr>
-            <w:tcW w:type="dxa" w:w="500"/>
-            <w:tcBorders>
-              <w:top w:val="single" w:color="595959" w:sz="6"/>
-              <w:left w:val="single" w:color="595959" w:sz="6"/>
-              <w:bottom w:val="single" w:color="595959" w:sz="6"/>
-              <w:right w:val="single" w:color="595959" w:sz="6"/>
-            </w:tcBorders>
-            <w:tcMar>
-              <w:top w:type="dxa" w:w="50"/>
-              <w:left w:type="dxa" w:w="90"/>
-              <w:bottom w:type="dxa" w:w="50"/>
-              <w:right w:type="dxa" w:w="90"/>
-            </w:tcMar>
-            <w:vAlign w:val="center"/>
-          </w:tcPr>
-          <w:p>
-            <w:pPr>
-              <w:spacing w:after="0" w:before="0" w:line="252"/>
-            </w:pPr>
-            <w:r>
-              <w:rPr>
-                <w:rFonts w:ascii="Times New Roman" w:cs="Times New Roman" w:eastAsia="Times New Roman" w:hAnsi="Times New Roman"/>
-                <w:sz w:val="20"/>
-                <w:szCs w:val="20"/>
-              </w:rPr>
-              <w:t xml:space="preserve"/>
-            </w:r>
-          </w:p>
-        </w:tc>
-      </w:tr>
-      <w:tr>
-        <w:trPr>
-          <w:cantSplit/>
-          <w:trHeight w:val="420" w:hRule="atLeast"/>
-        </w:trPr>
-        <w:tc>
-          <w:tcPr>
-            <w:tcW w:type="dxa" w:w="600"/>
-            <w:tcBorders>
-              <w:top w:val="single" w:color="595959" w:sz="6"/>
-              <w:left w:val="single" w:color="595959" w:sz="6"/>
-              <w:bottom w:val="single" w:color="595959" w:sz="6"/>
-              <w:right w:val="single" w:color="595959" w:sz="6"/>
-            </w:tcBorders>
-            <w:tcMar>
-              <w:top w:type="dxa" w:w="50"/>
-              <w:left w:type="dxa" w:w="90"/>
-              <w:bottom w:type="dxa" w:w="50"/>
-              <w:right w:type="dxa" w:w="90"/>
-            </w:tcMar>
-            <w:vAlign w:val="center"/>
-          </w:tcPr>
-          <w:p>
-            <w:pPr>
-              <w:spacing w:after="0" w:before="0" w:line="252"/>
-              <w:jc w:val="center"/>
-            </w:pPr>
-            <w:r>
-              <w:rPr>
-                <w:rFonts w:ascii="Times New Roman" w:cs="Times New Roman" w:eastAsia="Times New Roman" w:hAnsi="Times New Roman"/>
-                <w:sz w:val="20"/>
-                <w:szCs w:val="20"/>
-              </w:rPr>
-              <w:t xml:space="preserve">20</w:t>
-            </w:r>
-          </w:p>
-        </w:tc>
-        <w:tc>
-          <w:tcPr>
-            <w:tcW w:type="dxa" w:w="6980"/>
-            <w:tcBorders>
-              <w:top w:val="single" w:color="595959" w:sz="6"/>
-              <w:left w:val="single" w:color="595959" w:sz="6"/>
-              <w:bottom w:val="single" w:color="595959" w:sz="6"/>
-              <w:right w:val="single" w:color="595959" w:sz="6"/>
-            </w:tcBorders>
-            <w:tcMar>
-              <w:top w:type="dxa" w:w="50"/>
-              <w:left w:type="dxa" w:w="90"/>
-              <w:bottom w:type="dxa" w:w="50"/>
-              <w:right w:type="dxa" w:w="90"/>
-            </w:tcMar>
-            <w:vAlign w:val="center"/>
-          </w:tcPr>
-          <w:p>
-            <w:pPr>
-              <w:spacing w:after="0" w:before="0" w:line="252"/>
-            </w:pPr>
-            <w:r>
-              <w:rPr>
-                <w:rFonts w:ascii="Times New Roman" w:cs="Times New Roman" w:eastAsia="Times New Roman" w:hAnsi="Times New Roman"/>
-                <w:sz w:val="20"/>
-                <w:szCs w:val="20"/>
-              </w:rPr>
-              <w:t xml:space="preserve">I receive timely notifications when L-SIAMS or a classroom terminal is down.</w:t>
+              <w:t xml:space="preserve">I avoid actions that may disrupt system accessibility.</w:t>
             </w:r>
           </w:p>
         </w:tc>

</xml_diff>